<commit_message>
Understanding Advanced concepts in Keras and Tensorflow
</commit_message>
<xml_diff>
--- a/10_Deep_Learning_with_Keras_and_Tensorflow/2_Notes/1_Deep_Learning_with_Keras_and_Tensorflow_Notes.docx
+++ b/10_Deep_Learning_with_Keras_and_Tensorflow/2_Notes/1_Deep_Learning_with_Keras_and_Tensorflow_Notes.docx
@@ -2530,6 +2530,1704 @@
     </w:p>
     <w:p>
       <w:pPr>
+        <w:pStyle w:val="Heading1"/>
+        <w:rPr>
+          <w:rFonts w:ascii="Times New Roman" w:hAnsi="Times New Roman"/>
+        </w:rPr>
+      </w:pPr>
+      <w:r>
+        <w:t>Keras Functional API and Subclassing API</w:t>
+      </w:r>
+    </w:p>
+    <w:p>
+      <w:pPr>
+        <w:pStyle w:val="Heading2"/>
+      </w:pPr>
+      <w:r>
+        <w:t>Learning Objectives</w:t>
+      </w:r>
+    </w:p>
+    <w:p>
+      <w:pPr>
+        <w:pStyle w:val="NormalWeb"/>
+      </w:pPr>
+      <w:r>
+        <w:t>After studying this topic, we will be able to:</w:t>
+      </w:r>
+    </w:p>
+    <w:p>
+      <w:pPr>
+        <w:pStyle w:val="NormalWeb"/>
+        <w:numPr>
+          <w:ilvl w:val="0"/>
+          <w:numId w:val="30"/>
+        </w:numPr>
+      </w:pPr>
+      <w:r>
+        <w:t xml:space="preserve">Describe the capabilities of the </w:t>
+      </w:r>
+      <w:r>
+        <w:rPr>
+          <w:rStyle w:val="Strong"/>
+        </w:rPr>
+        <w:t>Keras Functional API</w:t>
+      </w:r>
+      <w:r>
+        <w:t>.</w:t>
+      </w:r>
+    </w:p>
+    <w:p>
+      <w:pPr>
+        <w:pStyle w:val="NormalWeb"/>
+        <w:numPr>
+          <w:ilvl w:val="0"/>
+          <w:numId w:val="30"/>
+        </w:numPr>
+      </w:pPr>
+      <w:r>
+        <w:t xml:space="preserve">Demonstrate how to build complex neural network models using the </w:t>
+      </w:r>
+      <w:r>
+        <w:rPr>
+          <w:rStyle w:val="Strong"/>
+        </w:rPr>
+        <w:t>Functional API</w:t>
+      </w:r>
+      <w:r>
+        <w:t>.</w:t>
+      </w:r>
+    </w:p>
+    <w:p>
+      <w:pPr>
+        <w:pStyle w:val="NormalWeb"/>
+        <w:numPr>
+          <w:ilvl w:val="0"/>
+          <w:numId w:val="30"/>
+        </w:numPr>
+      </w:pPr>
+      <w:r>
+        <w:t xml:space="preserve">Compare the </w:t>
+      </w:r>
+      <w:r>
+        <w:rPr>
+          <w:rStyle w:val="Strong"/>
+        </w:rPr>
+        <w:t>Functional API</w:t>
+      </w:r>
+      <w:r>
+        <w:t xml:space="preserve"> with the </w:t>
+      </w:r>
+      <w:r>
+        <w:rPr>
+          <w:rStyle w:val="Strong"/>
+        </w:rPr>
+        <w:t>Sequential API</w:t>
+      </w:r>
+      <w:r>
+        <w:t>.</w:t>
+      </w:r>
+    </w:p>
+    <w:p>
+      <w:pPr>
+        <w:pStyle w:val="NormalWeb"/>
+        <w:numPr>
+          <w:ilvl w:val="0"/>
+          <w:numId w:val="30"/>
+        </w:numPr>
+      </w:pPr>
+      <w:r>
+        <w:t xml:space="preserve">Explain the </w:t>
+      </w:r>
+      <w:r>
+        <w:rPr>
+          <w:rStyle w:val="Strong"/>
+        </w:rPr>
+        <w:t>Subclassing API</w:t>
+      </w:r>
+      <w:r>
+        <w:t xml:space="preserve"> in Keras.</w:t>
+      </w:r>
+    </w:p>
+    <w:p>
+      <w:pPr>
+        <w:pStyle w:val="Heading2"/>
+      </w:pPr>
+      <w:r>
+        <w:t>Keras Functional API</w:t>
+      </w:r>
+    </w:p>
+    <w:p>
+      <w:pPr>
+        <w:pStyle w:val="NormalWeb"/>
+      </w:pPr>
+      <w:r>
+        <w:t xml:space="preserve">The </w:t>
+      </w:r>
+      <w:r>
+        <w:rPr>
+          <w:rStyle w:val="Strong"/>
+        </w:rPr>
+        <w:t>Keras Functional API</w:t>
+      </w:r>
+      <w:r>
+        <w:t xml:space="preserve"> allows us to build complex neural network models more flexibly than the </w:t>
+      </w:r>
+      <w:r>
+        <w:rPr>
+          <w:rStyle w:val="Strong"/>
+        </w:rPr>
+        <w:t>Sequential API</w:t>
+      </w:r>
+      <w:r>
+        <w:t>.</w:t>
+      </w:r>
+    </w:p>
+    <w:p>
+      <w:pPr>
+        <w:pStyle w:val="NormalWeb"/>
+      </w:pPr>
+      <w:r>
+        <w:t>The Functional API is beneficial when we need to construct models beyond the simple stack of layers that the Sequential API offers.</w:t>
+      </w:r>
+    </w:p>
+    <w:p>
+      <w:pPr>
+        <w:pStyle w:val="NormalWeb"/>
+      </w:pPr>
+      <w:r>
+        <w:t>For instance, it allows us to create models with:</w:t>
+      </w:r>
+    </w:p>
+    <w:p>
+      <w:pPr>
+        <w:pStyle w:val="NormalWeb"/>
+        <w:numPr>
+          <w:ilvl w:val="0"/>
+          <w:numId w:val="31"/>
+        </w:numPr>
+      </w:pPr>
+      <w:r>
+        <w:t>Multiple inputs</w:t>
+      </w:r>
+    </w:p>
+    <w:p>
+      <w:pPr>
+        <w:pStyle w:val="NormalWeb"/>
+        <w:numPr>
+          <w:ilvl w:val="0"/>
+          <w:numId w:val="31"/>
+        </w:numPr>
+      </w:pPr>
+      <w:r>
+        <w:t>Multiple outputs</w:t>
+      </w:r>
+    </w:p>
+    <w:p>
+      <w:pPr>
+        <w:pStyle w:val="NormalWeb"/>
+        <w:numPr>
+          <w:ilvl w:val="0"/>
+          <w:numId w:val="31"/>
+        </w:numPr>
+      </w:pPr>
+      <w:r>
+        <w:t>Shared layers</w:t>
+      </w:r>
+    </w:p>
+    <w:p>
+      <w:pPr>
+        <w:pStyle w:val="NormalWeb"/>
+        <w:numPr>
+          <w:ilvl w:val="0"/>
+          <w:numId w:val="31"/>
+        </w:numPr>
+      </w:pPr>
+      <w:r>
+        <w:t>Nonlinear data flows</w:t>
+      </w:r>
+    </w:p>
+    <w:p>
+      <w:pPr>
+        <w:pStyle w:val="NormalWeb"/>
+      </w:pPr>
+      <w:r>
+        <w:t>This increased flexibility is crucial for research and for tackling complex problems that require custom solutions.</w:t>
+      </w:r>
+    </w:p>
+    <w:p>
+      <w:pPr>
+        <w:pStyle w:val="Heading2"/>
+      </w:pPr>
+      <w:r>
+        <w:t>Basic Concepts and Syntax</w:t>
+      </w:r>
+    </w:p>
+    <w:p>
+      <w:pPr>
+        <w:pStyle w:val="NormalWeb"/>
+      </w:pPr>
+      <w:r>
+        <w:t>The Functional API allows us to define more intricate models.</w:t>
+      </w:r>
+    </w:p>
+    <w:p>
+      <w:pPr>
+        <w:pStyle w:val="NormalWeb"/>
+      </w:pPr>
+      <w:r>
+        <w:t xml:space="preserve">Instead of stacking layers sequentially, we define layers and connect them in a </w:t>
+      </w:r>
+      <w:r>
+        <w:rPr>
+          <w:rStyle w:val="Strong"/>
+        </w:rPr>
+        <w:t>graph of layers</w:t>
+      </w:r>
+      <w:r>
+        <w:t xml:space="preserve"> (a network where layers can branch, merge, and connect in multiple ways instead of following a single straight sequence).</w:t>
+      </w:r>
+    </w:p>
+    <w:p>
+      <w:pPr>
+        <w:pStyle w:val="NormalWeb"/>
+      </w:pPr>
+      <w:r>
+        <w:lastRenderedPageBreak/>
+        <w:t>The basic process includes:</w:t>
+      </w:r>
+    </w:p>
+    <w:p>
+      <w:pPr>
+        <w:pStyle w:val="NormalWeb"/>
+        <w:numPr>
+          <w:ilvl w:val="0"/>
+          <w:numId w:val="32"/>
+        </w:numPr>
+      </w:pPr>
+      <w:r>
+        <w:t xml:space="preserve">Begin with the </w:t>
+      </w:r>
+      <w:r>
+        <w:rPr>
+          <w:rStyle w:val="Strong"/>
+        </w:rPr>
+        <w:t>Input layer</w:t>
+      </w:r>
+      <w:r>
+        <w:t>.</w:t>
+      </w:r>
+    </w:p>
+    <w:p>
+      <w:pPr>
+        <w:pStyle w:val="NormalWeb"/>
+        <w:numPr>
+          <w:ilvl w:val="0"/>
+          <w:numId w:val="32"/>
+        </w:numPr>
+      </w:pPr>
+      <w:r>
+        <w:t>Specify the shape of the input.</w:t>
+      </w:r>
+    </w:p>
+    <w:p>
+      <w:pPr>
+        <w:pStyle w:val="NormalWeb"/>
+        <w:numPr>
+          <w:ilvl w:val="0"/>
+          <w:numId w:val="32"/>
+        </w:numPr>
+      </w:pPr>
+      <w:r>
+        <w:t xml:space="preserve">Add one or more </w:t>
+      </w:r>
+      <w:r>
+        <w:rPr>
+          <w:rStyle w:val="Strong"/>
+        </w:rPr>
+        <w:t>Dense layers</w:t>
+      </w:r>
+      <w:r>
+        <w:t xml:space="preserve"> with the required number of units and activation functions.</w:t>
+      </w:r>
+    </w:p>
+    <w:p>
+      <w:pPr>
+        <w:pStyle w:val="NormalWeb"/>
+        <w:numPr>
+          <w:ilvl w:val="0"/>
+          <w:numId w:val="32"/>
+        </w:numPr>
+      </w:pPr>
+      <w:r>
+        <w:t xml:space="preserve">Add the </w:t>
+      </w:r>
+      <w:r>
+        <w:rPr>
+          <w:rStyle w:val="Strong"/>
+        </w:rPr>
+        <w:t>Output layer</w:t>
+      </w:r>
+      <w:r>
+        <w:t>.</w:t>
+      </w:r>
+    </w:p>
+    <w:p>
+      <w:pPr>
+        <w:pStyle w:val="NormalWeb"/>
+      </w:pPr>
+      <w:r>
+        <w:t>The process of creating the model is demonstrated through code.</w:t>
+      </w:r>
+    </w:p>
+    <w:p>
+      <w:pPr>
+        <w:pStyle w:val="Heading3"/>
+      </w:pPr>
+      <w:r>
+        <w:t>Input Layer</w:t>
+      </w:r>
+    </w:p>
+    <w:p>
+      <w:pPr>
+        <w:pStyle w:val="NormalWeb"/>
+      </w:pPr>
+      <w:r>
+        <w:t xml:space="preserve">The </w:t>
+      </w:r>
+      <w:r>
+        <w:rPr>
+          <w:rStyle w:val="HTMLCode"/>
+          <w:rFonts w:eastAsiaTheme="majorEastAsia"/>
+        </w:rPr>
+        <w:t>Input()</w:t>
+      </w:r>
+      <w:r>
+        <w:t xml:space="preserve"> function is used to define the shape of the input data.</w:t>
+      </w:r>
+    </w:p>
+    <w:p>
+      <w:pPr>
+        <w:pStyle w:val="Heading3"/>
+      </w:pPr>
+      <w:r>
+        <w:t>Dense Layers</w:t>
+      </w:r>
+    </w:p>
+    <w:p>
+      <w:pPr>
+        <w:pStyle w:val="NormalWeb"/>
+      </w:pPr>
+      <w:r>
+        <w:t>The Dense layers are added sequentially:</w:t>
+      </w:r>
+    </w:p>
+    <w:p>
+      <w:pPr>
+        <w:pStyle w:val="NormalWeb"/>
+        <w:numPr>
+          <w:ilvl w:val="0"/>
+          <w:numId w:val="33"/>
+        </w:numPr>
+      </w:pPr>
+      <w:r>
+        <w:t xml:space="preserve">The first Dense layer uses the </w:t>
+      </w:r>
+      <w:r>
+        <w:rPr>
+          <w:rStyle w:val="Strong"/>
+        </w:rPr>
+        <w:t>ReLU (Rectified Linear Unit)</w:t>
+      </w:r>
+      <w:r>
+        <w:t xml:space="preserve"> activation function.</w:t>
+      </w:r>
+    </w:p>
+    <w:p>
+      <w:pPr>
+        <w:pStyle w:val="NormalWeb"/>
+        <w:numPr>
+          <w:ilvl w:val="0"/>
+          <w:numId w:val="33"/>
+        </w:numPr>
+      </w:pPr>
+      <w:r>
+        <w:t xml:space="preserve">The final Dense layer uses the </w:t>
+      </w:r>
+      <w:r>
+        <w:rPr>
+          <w:rStyle w:val="Strong"/>
+        </w:rPr>
+        <w:t>Softmax</w:t>
+      </w:r>
+      <w:r>
+        <w:t xml:space="preserve"> activation function, which is suitable for </w:t>
+      </w:r>
+      <w:r>
+        <w:rPr>
+          <w:rStyle w:val="Strong"/>
+        </w:rPr>
+        <w:t>multiclass classification</w:t>
+      </w:r>
+      <w:r>
+        <w:t>.</w:t>
+      </w:r>
+    </w:p>
+    <w:p>
+      <w:pPr>
+        <w:pStyle w:val="NormalWeb"/>
+      </w:pPr>
+      <w:r>
+        <w:rPr>
+          <w:rStyle w:val="Strong"/>
+        </w:rPr>
+        <w:t>Important:</w:t>
+      </w:r>
+    </w:p>
+    <w:p>
+      <w:pPr>
+        <w:pStyle w:val="NormalWeb"/>
+      </w:pPr>
+      <w:r>
+        <w:t xml:space="preserve">The </w:t>
+      </w:r>
+      <w:r>
+        <w:rPr>
+          <w:rStyle w:val="Strong"/>
+        </w:rPr>
+        <w:t>units</w:t>
+      </w:r>
+      <w:r>
+        <w:t xml:space="preserve"> parameter refers to the </w:t>
+      </w:r>
+      <w:r>
+        <w:rPr>
+          <w:rStyle w:val="Strong"/>
+        </w:rPr>
+        <w:t>dimensionality of the output space</w:t>
+      </w:r>
+      <w:r>
+        <w:t xml:space="preserve"> of the layer (the number of output neurons produced by that layer).</w:t>
+      </w:r>
+    </w:p>
+    <w:p>
+      <w:pPr>
+        <w:pStyle w:val="Heading2"/>
+      </w:pPr>
+      <w:r>
+        <w:t>Models with Multiple Inputs and Outputs</w:t>
+      </w:r>
+    </w:p>
+    <w:p>
+      <w:pPr>
+        <w:pStyle w:val="NormalWeb"/>
+      </w:pPr>
+      <w:r>
+        <w:t>One of the major advantages of the Functional API is its ability to handle models with multiple inputs and multiple outputs.</w:t>
+      </w:r>
+    </w:p>
+    <w:p>
+      <w:pPr>
+        <w:pStyle w:val="NormalWeb"/>
+      </w:pPr>
+      <w:r>
+        <w:t xml:space="preserve">This capability is especially useful in complex applications such as </w:t>
+      </w:r>
+      <w:r>
+        <w:rPr>
+          <w:rStyle w:val="Strong"/>
+        </w:rPr>
+        <w:t>multitask learning</w:t>
+      </w:r>
+      <w:r>
+        <w:t>.</w:t>
+      </w:r>
+    </w:p>
+    <w:p>
+      <w:pPr>
+        <w:pStyle w:val="NormalWeb"/>
+      </w:pPr>
+      <w:r>
+        <w:t>The process includes:</w:t>
+      </w:r>
+    </w:p>
+    <w:p>
+      <w:pPr>
+        <w:pStyle w:val="NormalWeb"/>
+        <w:numPr>
+          <w:ilvl w:val="0"/>
+          <w:numId w:val="34"/>
+        </w:numPr>
+      </w:pPr>
+      <w:r>
+        <w:t>Create each input layer separately.</w:t>
+      </w:r>
+    </w:p>
+    <w:p>
+      <w:pPr>
+        <w:pStyle w:val="NormalWeb"/>
+        <w:numPr>
+          <w:ilvl w:val="0"/>
+          <w:numId w:val="34"/>
+        </w:numPr>
+      </w:pPr>
+      <w:r>
+        <w:t>Process each input through different branches.</w:t>
+      </w:r>
+    </w:p>
+    <w:p>
+      <w:pPr>
+        <w:pStyle w:val="NormalWeb"/>
+        <w:numPr>
+          <w:ilvl w:val="0"/>
+          <w:numId w:val="34"/>
+        </w:numPr>
+      </w:pPr>
+      <w:r>
+        <w:t>Merge the branches.</w:t>
+      </w:r>
+    </w:p>
+    <w:p>
+      <w:pPr>
+        <w:pStyle w:val="NormalWeb"/>
+        <w:numPr>
+          <w:ilvl w:val="0"/>
+          <w:numId w:val="34"/>
+        </w:numPr>
+      </w:pPr>
+      <w:r>
+        <w:t>Pass the merged representation through the output layers.</w:t>
+      </w:r>
+    </w:p>
+    <w:p>
+      <w:pPr>
+        <w:pStyle w:val="NormalWeb"/>
+      </w:pPr>
+      <w:r>
+        <w:t>For example:</w:t>
+      </w:r>
+    </w:p>
+    <w:p>
+      <w:pPr>
+        <w:pStyle w:val="NormalWeb"/>
+        <w:numPr>
+          <w:ilvl w:val="0"/>
+          <w:numId w:val="35"/>
+        </w:numPr>
+      </w:pPr>
+      <w:r>
+        <w:t>Define two separate input layers with different input shapes.</w:t>
+      </w:r>
+    </w:p>
+    <w:p>
+      <w:pPr>
+        <w:pStyle w:val="NormalWeb"/>
+        <w:numPr>
+          <w:ilvl w:val="0"/>
+          <w:numId w:val="35"/>
+        </w:numPr>
+      </w:pPr>
+      <w:r>
+        <w:t>Create separate branches, where each branch processes one input independently.</w:t>
+      </w:r>
+    </w:p>
+    <w:p>
+      <w:pPr>
+        <w:pStyle w:val="Heading2"/>
+      </w:pPr>
+      <w:r>
+        <w:t>Shared Layers</w:t>
+      </w:r>
+    </w:p>
+    <w:p>
+      <w:pPr>
+        <w:pStyle w:val="NormalWeb"/>
+      </w:pPr>
+      <w:r>
+        <w:t xml:space="preserve">Another powerful feature of the Functional API is </w:t>
+      </w:r>
+      <w:r>
+        <w:rPr>
+          <w:rStyle w:val="Strong"/>
+        </w:rPr>
+        <w:t>Shared Layers</w:t>
+      </w:r>
+      <w:r>
+        <w:t>.</w:t>
+      </w:r>
+    </w:p>
+    <w:p>
+      <w:pPr>
+        <w:pStyle w:val="NormalWeb"/>
+      </w:pPr>
+      <w:r>
+        <w:lastRenderedPageBreak/>
+        <w:t>Shared layers are useful when the same transformation needs to be applied to multiple inputs.</w:t>
+      </w:r>
+    </w:p>
+    <w:p>
+      <w:pPr>
+        <w:pStyle w:val="NormalWeb"/>
+      </w:pPr>
+      <w:r>
+        <w:t xml:space="preserve">A common example is a </w:t>
+      </w:r>
+      <w:r>
+        <w:rPr>
+          <w:rStyle w:val="Strong"/>
+        </w:rPr>
+        <w:t>Siamese Network</w:t>
+      </w:r>
+      <w:r>
+        <w:t>, where two different inputs pass through the same layers before their outputs are compared.</w:t>
+      </w:r>
+    </w:p>
+    <w:p>
+      <w:pPr>
+        <w:pStyle w:val="NormalWeb"/>
+      </w:pPr>
+      <w:r>
+        <w:t>The implementation involves:</w:t>
+      </w:r>
+    </w:p>
+    <w:p>
+      <w:pPr>
+        <w:pStyle w:val="NormalWeb"/>
+        <w:numPr>
+          <w:ilvl w:val="0"/>
+          <w:numId w:val="36"/>
+        </w:numPr>
+      </w:pPr>
+      <w:r>
+        <w:t>Define a shared Dense layer.</w:t>
+      </w:r>
+    </w:p>
+    <w:p>
+      <w:pPr>
+        <w:pStyle w:val="NormalWeb"/>
+        <w:numPr>
+          <w:ilvl w:val="0"/>
+          <w:numId w:val="36"/>
+        </w:numPr>
+      </w:pPr>
+      <w:r>
+        <w:t>Apply the same shared layer to both inputs.</w:t>
+      </w:r>
+    </w:p>
+    <w:p>
+      <w:pPr>
+        <w:pStyle w:val="NormalWeb"/>
+        <w:numPr>
+          <w:ilvl w:val="0"/>
+          <w:numId w:val="36"/>
+        </w:numPr>
+      </w:pPr>
+      <w:r>
+        <w:t>Create a model where the shared layer produces two outputs.</w:t>
+      </w:r>
+    </w:p>
+    <w:p>
+      <w:pPr>
+        <w:pStyle w:val="Heading2"/>
+      </w:pPr>
+      <w:r>
+        <w:t>Practical Example: Complex Functional Model</w:t>
+      </w:r>
+    </w:p>
+    <w:p>
+      <w:pPr>
+        <w:pStyle w:val="NormalWeb"/>
+      </w:pPr>
+      <w:r>
+        <w:t>A practical Functional API model combines multiple inputs, shared layers, and outputs.</w:t>
+      </w:r>
+    </w:p>
+    <w:p>
+      <w:pPr>
+        <w:pStyle w:val="NormalWeb"/>
+      </w:pPr>
+      <w:r>
+        <w:t>The overall process is:</w:t>
+      </w:r>
+    </w:p>
+    <w:p>
+      <w:pPr>
+        <w:pStyle w:val="NormalWeb"/>
+        <w:numPr>
+          <w:ilvl w:val="0"/>
+          <w:numId w:val="37"/>
+        </w:numPr>
+      </w:pPr>
+      <w:r>
+        <w:t>Define the input layers.</w:t>
+      </w:r>
+    </w:p>
+    <w:p>
+      <w:pPr>
+        <w:pStyle w:val="NormalWeb"/>
+        <w:numPr>
+          <w:ilvl w:val="0"/>
+          <w:numId w:val="37"/>
+        </w:numPr>
+      </w:pPr>
+      <w:r>
+        <w:t>Add layers to process each input.</w:t>
+      </w:r>
+    </w:p>
+    <w:p>
+      <w:pPr>
+        <w:pStyle w:val="NormalWeb"/>
+        <w:numPr>
+          <w:ilvl w:val="0"/>
+          <w:numId w:val="37"/>
+        </w:numPr>
+      </w:pPr>
+      <w:r>
+        <w:t>Merge the processed branches.</w:t>
+      </w:r>
+    </w:p>
+    <w:p>
+      <w:pPr>
+        <w:pStyle w:val="NormalWeb"/>
+        <w:numPr>
+          <w:ilvl w:val="0"/>
+          <w:numId w:val="37"/>
+        </w:numPr>
+      </w:pPr>
+      <w:r>
+        <w:t>Define the output layers.</w:t>
+      </w:r>
+    </w:p>
+    <w:p>
+      <w:pPr>
+        <w:pStyle w:val="NormalWeb"/>
+      </w:pPr>
+      <w:r>
+        <w:t>The complete model contains:</w:t>
+      </w:r>
+    </w:p>
+    <w:p>
+      <w:pPr>
+        <w:pStyle w:val="NormalWeb"/>
+        <w:numPr>
+          <w:ilvl w:val="0"/>
+          <w:numId w:val="38"/>
+        </w:numPr>
+      </w:pPr>
+      <w:r>
+        <w:t>Two separate branches.</w:t>
+      </w:r>
+    </w:p>
+    <w:p>
+      <w:pPr>
+        <w:pStyle w:val="NormalWeb"/>
+        <w:numPr>
+          <w:ilvl w:val="0"/>
+          <w:numId w:val="38"/>
+        </w:numPr>
+      </w:pPr>
+      <w:r>
+        <w:t>Convolutional layers in each branch.</w:t>
+      </w:r>
+    </w:p>
+    <w:p>
+      <w:pPr>
+        <w:pStyle w:val="NormalWeb"/>
+        <w:numPr>
+          <w:ilvl w:val="0"/>
+          <w:numId w:val="38"/>
+        </w:numPr>
+      </w:pPr>
+      <w:r>
+        <w:t>Pooling layers.</w:t>
+      </w:r>
+    </w:p>
+    <w:p>
+      <w:pPr>
+        <w:pStyle w:val="NormalWeb"/>
+        <w:numPr>
+          <w:ilvl w:val="0"/>
+          <w:numId w:val="38"/>
+        </w:numPr>
+      </w:pPr>
+      <w:r>
+        <w:t>Flatten layers.</w:t>
+      </w:r>
+    </w:p>
+    <w:p>
+      <w:pPr>
+        <w:pStyle w:val="NormalWeb"/>
+        <w:numPr>
+          <w:ilvl w:val="0"/>
+          <w:numId w:val="38"/>
+        </w:numPr>
+      </w:pPr>
+      <w:r>
+        <w:t>Concatenation of both branches.</w:t>
+      </w:r>
+    </w:p>
+    <w:p>
+      <w:pPr>
+        <w:pStyle w:val="NormalWeb"/>
+        <w:numPr>
+          <w:ilvl w:val="0"/>
+          <w:numId w:val="38"/>
+        </w:numPr>
+      </w:pPr>
+      <w:r>
+        <w:t>Additional Dense layers.</w:t>
+      </w:r>
+    </w:p>
+    <w:p>
+      <w:pPr>
+        <w:pStyle w:val="NormalWeb"/>
+        <w:numPr>
+          <w:ilvl w:val="0"/>
+          <w:numId w:val="38"/>
+        </w:numPr>
+      </w:pPr>
+      <w:r>
+        <w:t>A final output layer consisting of a single output unit.</w:t>
+      </w:r>
+    </w:p>
+    <w:p>
+      <w:pPr>
+        <w:pStyle w:val="Heading2"/>
+      </w:pPr>
+      <w:r>
+        <w:t>Keras Subclassing API</w:t>
+      </w:r>
+    </w:p>
+    <w:p>
+      <w:pPr>
+        <w:pStyle w:val="NormalWeb"/>
+      </w:pPr>
+      <w:r>
+        <w:t xml:space="preserve">Another powerful feature of Keras is the </w:t>
+      </w:r>
+      <w:r>
+        <w:rPr>
+          <w:rStyle w:val="Strong"/>
+        </w:rPr>
+        <w:t>Subclassing API</w:t>
+      </w:r>
+      <w:r>
+        <w:t>.</w:t>
+      </w:r>
+    </w:p>
+    <w:p>
+      <w:pPr>
+        <w:pStyle w:val="NormalWeb"/>
+      </w:pPr>
+      <w:r>
+        <w:t>Unlike the Sequential API and Functional API, the Subclassing API provides the highest level of flexibility.</w:t>
+      </w:r>
+    </w:p>
+    <w:p>
+      <w:pPr>
+        <w:pStyle w:val="NormalWeb"/>
+      </w:pPr>
+      <w:r>
+        <w:t xml:space="preserve">It allows us to define custom and dynamic models by subclassing the </w:t>
+      </w:r>
+      <w:r>
+        <w:rPr>
+          <w:rStyle w:val="HTMLCode"/>
+          <w:rFonts w:eastAsiaTheme="majorEastAsia"/>
+        </w:rPr>
+        <w:t>Model</w:t>
+      </w:r>
+      <w:r>
+        <w:t xml:space="preserve"> class and implementing our own </w:t>
+      </w:r>
+      <w:r>
+        <w:rPr>
+          <w:rStyle w:val="HTMLCode"/>
+          <w:rFonts w:eastAsiaTheme="majorEastAsia"/>
+        </w:rPr>
+        <w:t>call()</w:t>
+      </w:r>
+      <w:r>
+        <w:t xml:space="preserve"> method.</w:t>
+      </w:r>
+    </w:p>
+    <w:p>
+      <w:pPr>
+        <w:pStyle w:val="NormalWeb"/>
+      </w:pPr>
+      <w:r>
+        <w:t>The Subclassing API is particularly useful when the forward pass cannot be defined statically (fixed before execution).</w:t>
+      </w:r>
+    </w:p>
+    <w:p>
+      <w:pPr>
+        <w:pStyle w:val="NormalWeb"/>
+      </w:pPr>
+      <w:r>
+        <w:t>It is widely used in:</w:t>
+      </w:r>
+    </w:p>
+    <w:p>
+      <w:pPr>
+        <w:pStyle w:val="NormalWeb"/>
+        <w:numPr>
+          <w:ilvl w:val="0"/>
+          <w:numId w:val="39"/>
+        </w:numPr>
+      </w:pPr>
+      <w:r>
+        <w:t>Research</w:t>
+      </w:r>
+    </w:p>
+    <w:p>
+      <w:pPr>
+        <w:pStyle w:val="NormalWeb"/>
+        <w:numPr>
+          <w:ilvl w:val="0"/>
+          <w:numId w:val="39"/>
+        </w:numPr>
+      </w:pPr>
+      <w:r>
+        <w:t>Development</w:t>
+      </w:r>
+    </w:p>
+    <w:p>
+      <w:pPr>
+        <w:pStyle w:val="NormalWeb"/>
+        <w:numPr>
+          <w:ilvl w:val="0"/>
+          <w:numId w:val="39"/>
+        </w:numPr>
+      </w:pPr>
+      <w:r>
+        <w:lastRenderedPageBreak/>
+        <w:t>Custom training loops</w:t>
+      </w:r>
+    </w:p>
+    <w:p>
+      <w:pPr>
+        <w:pStyle w:val="NormalWeb"/>
+        <w:numPr>
+          <w:ilvl w:val="0"/>
+          <w:numId w:val="39"/>
+        </w:numPr>
+      </w:pPr>
+      <w:r>
+        <w:t>Non-standard neural network architectures</w:t>
+      </w:r>
+    </w:p>
+    <w:p>
+      <w:pPr>
+        <w:pStyle w:val="Heading2"/>
+      </w:pPr>
+      <w:r>
+        <w:t>Creating a Model Using the Subclassing API</w:t>
+      </w:r>
+    </w:p>
+    <w:p>
+      <w:pPr>
+        <w:pStyle w:val="NormalWeb"/>
+      </w:pPr>
+      <w:r>
+        <w:t>To use the Subclassing API:</w:t>
+      </w:r>
+    </w:p>
+    <w:p>
+      <w:pPr>
+        <w:pStyle w:val="NormalWeb"/>
+        <w:numPr>
+          <w:ilvl w:val="0"/>
+          <w:numId w:val="40"/>
+        </w:numPr>
+      </w:pPr>
+      <w:r>
+        <w:t xml:space="preserve">Subclass the </w:t>
+      </w:r>
+      <w:r>
+        <w:rPr>
+          <w:rStyle w:val="HTMLCode"/>
+          <w:rFonts w:eastAsiaTheme="majorEastAsia"/>
+        </w:rPr>
+        <w:t>Model</w:t>
+      </w:r>
+      <w:r>
+        <w:t xml:space="preserve"> class.</w:t>
+      </w:r>
+    </w:p>
+    <w:p>
+      <w:pPr>
+        <w:pStyle w:val="NormalWeb"/>
+        <w:numPr>
+          <w:ilvl w:val="0"/>
+          <w:numId w:val="40"/>
+        </w:numPr>
+      </w:pPr>
+      <w:r>
+        <w:t xml:space="preserve">Define the layers inside the </w:t>
+      </w:r>
+      <w:r>
+        <w:rPr>
+          <w:rStyle w:val="HTMLCode"/>
+          <w:rFonts w:eastAsiaTheme="majorEastAsia"/>
+        </w:rPr>
+        <w:t>__init__()</w:t>
+      </w:r>
+      <w:r>
+        <w:t xml:space="preserve"> method.</w:t>
+      </w:r>
+    </w:p>
+    <w:p>
+      <w:pPr>
+        <w:pStyle w:val="NormalWeb"/>
+        <w:numPr>
+          <w:ilvl w:val="0"/>
+          <w:numId w:val="40"/>
+        </w:numPr>
+      </w:pPr>
+      <w:r>
+        <w:t xml:space="preserve">Implement the forward pass inside the </w:t>
+      </w:r>
+      <w:r>
+        <w:rPr>
+          <w:rStyle w:val="HTMLCode"/>
+          <w:rFonts w:eastAsiaTheme="majorEastAsia"/>
+        </w:rPr>
+        <w:t>call()</w:t>
+      </w:r>
+      <w:r>
+        <w:t xml:space="preserve"> method.</w:t>
+      </w:r>
+    </w:p>
+    <w:p>
+      <w:pPr>
+        <w:pStyle w:val="NormalWeb"/>
+        <w:numPr>
+          <w:ilvl w:val="0"/>
+          <w:numId w:val="40"/>
+        </w:numPr>
+      </w:pPr>
+      <w:r>
+        <w:t>Explicitly define how the layers are connected.</w:t>
+      </w:r>
+    </w:p>
+    <w:p>
+      <w:pPr>
+        <w:pStyle w:val="NormalWeb"/>
+        <w:numPr>
+          <w:ilvl w:val="0"/>
+          <w:numId w:val="40"/>
+        </w:numPr>
+      </w:pPr>
+      <w:r>
+        <w:t>Define how data flows through the model.</w:t>
+      </w:r>
+    </w:p>
+    <w:p>
+      <w:pPr>
+        <w:pStyle w:val="Heading3"/>
+      </w:pPr>
+      <w:r>
+        <w:t>Example Model</w:t>
+      </w:r>
+    </w:p>
+    <w:p>
+      <w:pPr>
+        <w:pStyle w:val="NormalWeb"/>
+      </w:pPr>
+      <w:r>
+        <w:t>In the example:</w:t>
+      </w:r>
+    </w:p>
+    <w:p>
+      <w:pPr>
+        <w:pStyle w:val="NormalWeb"/>
+        <w:numPr>
+          <w:ilvl w:val="0"/>
+          <w:numId w:val="41"/>
+        </w:numPr>
+      </w:pPr>
+      <w:r>
+        <w:t xml:space="preserve">A custom model named </w:t>
+      </w:r>
+      <w:r>
+        <w:rPr>
+          <w:rStyle w:val="Strong"/>
+        </w:rPr>
+        <w:t>MyModel</w:t>
+      </w:r>
+      <w:r>
+        <w:t xml:space="preserve"> is created by subclassing </w:t>
+      </w:r>
+      <w:r>
+        <w:rPr>
+          <w:rStyle w:val="HTMLCode"/>
+          <w:rFonts w:eastAsiaTheme="majorEastAsia"/>
+        </w:rPr>
+        <w:t>tf.keras.Model</w:t>
+      </w:r>
+      <w:r>
+        <w:t>.</w:t>
+      </w:r>
+    </w:p>
+    <w:p>
+      <w:pPr>
+        <w:pStyle w:val="NormalWeb"/>
+        <w:numPr>
+          <w:ilvl w:val="0"/>
+          <w:numId w:val="41"/>
+        </w:numPr>
+      </w:pPr>
+      <w:r>
+        <w:t>The model contains two Dense layers:</w:t>
+      </w:r>
+    </w:p>
+    <w:p>
+      <w:pPr>
+        <w:pStyle w:val="NormalWeb"/>
+        <w:numPr>
+          <w:ilvl w:val="1"/>
+          <w:numId w:val="41"/>
+        </w:numPr>
+      </w:pPr>
+      <w:r>
+        <w:t xml:space="preserve">The first Dense layer has </w:t>
+      </w:r>
+      <w:r>
+        <w:rPr>
+          <w:rStyle w:val="Strong"/>
+        </w:rPr>
+        <w:t>64 neurons</w:t>
+      </w:r>
+      <w:r>
+        <w:t xml:space="preserve"> with </w:t>
+      </w:r>
+      <w:r>
+        <w:rPr>
+          <w:rStyle w:val="Strong"/>
+        </w:rPr>
+        <w:t>ReLU</w:t>
+      </w:r>
+      <w:r>
+        <w:t xml:space="preserve"> activation.</w:t>
+      </w:r>
+    </w:p>
+    <w:p>
+      <w:pPr>
+        <w:pStyle w:val="NormalWeb"/>
+        <w:numPr>
+          <w:ilvl w:val="1"/>
+          <w:numId w:val="41"/>
+        </w:numPr>
+      </w:pPr>
+      <w:r>
+        <w:t xml:space="preserve">The second Dense layer has </w:t>
+      </w:r>
+      <w:r>
+        <w:rPr>
+          <w:rStyle w:val="Strong"/>
+        </w:rPr>
+        <w:t>10 neurons</w:t>
+      </w:r>
+      <w:r>
+        <w:t xml:space="preserve"> with </w:t>
+      </w:r>
+      <w:r>
+        <w:rPr>
+          <w:rStyle w:val="Strong"/>
+        </w:rPr>
+        <w:t>Softmax</w:t>
+      </w:r>
+      <w:r>
+        <w:t xml:space="preserve"> activation.</w:t>
+      </w:r>
+    </w:p>
+    <w:p>
+      <w:pPr>
+        <w:pStyle w:val="Heading2"/>
+      </w:pPr>
+      <w:r>
+        <w:t>When to Use the Subclassing API</w:t>
+      </w:r>
+    </w:p>
+    <w:p>
+      <w:pPr>
+        <w:pStyle w:val="NormalWeb"/>
+      </w:pPr>
+      <w:r>
+        <w:t>The Subclassing API is especially useful in the following situations:</w:t>
+      </w:r>
+    </w:p>
+    <w:p>
+      <w:pPr>
+        <w:pStyle w:val="NormalWeb"/>
+        <w:numPr>
+          <w:ilvl w:val="0"/>
+          <w:numId w:val="42"/>
+        </w:numPr>
+      </w:pPr>
+      <w:r>
+        <w:t>Models with dynamic architectures.</w:t>
+      </w:r>
+    </w:p>
+    <w:p>
+      <w:pPr>
+        <w:pStyle w:val="NormalWeb"/>
+        <w:numPr>
+          <w:ilvl w:val="0"/>
+          <w:numId w:val="42"/>
+        </w:numPr>
+      </w:pPr>
+      <w:r>
+        <w:t xml:space="preserve">When model architectures need to change dynamically, such as certain </w:t>
+      </w:r>
+      <w:r>
+        <w:rPr>
+          <w:rStyle w:val="Strong"/>
+        </w:rPr>
+        <w:t>Reinforcement Learning</w:t>
+      </w:r>
+      <w:r>
+        <w:t xml:space="preserve"> models.</w:t>
+      </w:r>
+    </w:p>
+    <w:p>
+      <w:pPr>
+        <w:pStyle w:val="NormalWeb"/>
+        <w:numPr>
+          <w:ilvl w:val="0"/>
+          <w:numId w:val="42"/>
+        </w:numPr>
+      </w:pPr>
+      <w:r>
+        <w:t>Custom training loops.</w:t>
+      </w:r>
+    </w:p>
+    <w:p>
+      <w:pPr>
+        <w:pStyle w:val="NormalWeb"/>
+        <w:numPr>
+          <w:ilvl w:val="0"/>
+          <w:numId w:val="42"/>
+        </w:numPr>
+      </w:pPr>
+      <w:r>
+        <w:t>When greater control over the training process is required.</w:t>
+      </w:r>
+    </w:p>
+    <w:p>
+      <w:pPr>
+        <w:pStyle w:val="NormalWeb"/>
+        <w:numPr>
+          <w:ilvl w:val="0"/>
+          <w:numId w:val="42"/>
+        </w:numPr>
+      </w:pPr>
+      <w:r>
+        <w:t>Research and prototyping.</w:t>
+      </w:r>
+    </w:p>
+    <w:p>
+      <w:pPr>
+        <w:pStyle w:val="NormalWeb"/>
+        <w:numPr>
+          <w:ilvl w:val="0"/>
+          <w:numId w:val="42"/>
+        </w:numPr>
+      </w:pPr>
+      <w:r>
+        <w:t>Experimenting with new layers or architectures that are not available in the standard Keras API.</w:t>
+      </w:r>
+    </w:p>
+    <w:p>
+      <w:pPr>
+        <w:pStyle w:val="Heading2"/>
+      </w:pPr>
+      <w:r>
+        <w:t>Custom Training Loops</w:t>
+      </w:r>
+    </w:p>
+    <w:p>
+      <w:pPr>
+        <w:pStyle w:val="NormalWeb"/>
+      </w:pPr>
+      <w:r>
+        <w:t xml:space="preserve">A custom training loop can be implemented using the </w:t>
+      </w:r>
+      <w:r>
+        <w:rPr>
+          <w:rStyle w:val="HTMLCode"/>
+          <w:rFonts w:eastAsiaTheme="majorEastAsia"/>
+        </w:rPr>
+        <w:t>tf.GradientTape</w:t>
+      </w:r>
+      <w:r>
+        <w:t xml:space="preserve"> method.</w:t>
+      </w:r>
+    </w:p>
+    <w:p>
+      <w:pPr>
+        <w:pStyle w:val="NormalWeb"/>
+      </w:pPr>
+      <w:r>
+        <w:t>This provides:</w:t>
+      </w:r>
+    </w:p>
+    <w:p>
+      <w:pPr>
+        <w:pStyle w:val="NormalWeb"/>
+        <w:numPr>
+          <w:ilvl w:val="0"/>
+          <w:numId w:val="43"/>
+        </w:numPr>
+      </w:pPr>
+      <w:r>
+        <w:t>Greater flexibility.</w:t>
+      </w:r>
+    </w:p>
+    <w:p>
+      <w:pPr>
+        <w:pStyle w:val="NormalWeb"/>
+        <w:numPr>
+          <w:ilvl w:val="0"/>
+          <w:numId w:val="43"/>
+        </w:numPr>
+      </w:pPr>
+      <w:r>
+        <w:t>More control over the training process.</w:t>
+      </w:r>
+    </w:p>
+    <w:p>
+      <w:pPr>
+        <w:pStyle w:val="NormalWeb"/>
+      </w:pPr>
+      <w:r>
+        <w:t>Compared with:</w:t>
+      </w:r>
+    </w:p>
+    <w:p>
+      <w:pPr>
+        <w:pStyle w:val="NormalWeb"/>
+        <w:numPr>
+          <w:ilvl w:val="0"/>
+          <w:numId w:val="44"/>
+        </w:numPr>
+      </w:pPr>
+      <w:r>
+        <w:t xml:space="preserve">The built-in </w:t>
+      </w:r>
+      <w:r>
+        <w:rPr>
+          <w:rStyle w:val="HTMLCode"/>
+          <w:rFonts w:eastAsiaTheme="majorEastAsia"/>
+        </w:rPr>
+        <w:t>keras.fit()</w:t>
+      </w:r>
+      <w:r>
+        <w:t xml:space="preserve"> method.</w:t>
+      </w:r>
+    </w:p>
+    <w:p>
+      <w:pPr>
+        <w:pStyle w:val="Heading2"/>
+      </w:pPr>
+      <w:r>
+        <w:lastRenderedPageBreak/>
+        <w:t>Dynamic Graphs</w:t>
+      </w:r>
+    </w:p>
+    <w:p>
+      <w:pPr>
+        <w:pStyle w:val="NormalWeb"/>
+      </w:pPr>
+      <w:r>
+        <w:t xml:space="preserve">The Subclassing API also supports </w:t>
+      </w:r>
+      <w:r>
+        <w:rPr>
+          <w:rStyle w:val="Strong"/>
+        </w:rPr>
+        <w:t>Dynamic Graphs</w:t>
+      </w:r>
+      <w:r>
+        <w:t>.</w:t>
+      </w:r>
+    </w:p>
+    <w:p>
+      <w:pPr>
+        <w:pStyle w:val="NormalWeb"/>
+      </w:pPr>
+      <w:r>
+        <w:t>This means we can change the model architecture dynamically during training based on:</w:t>
+      </w:r>
+    </w:p>
+    <w:p>
+      <w:pPr>
+        <w:pStyle w:val="NormalWeb"/>
+        <w:numPr>
+          <w:ilvl w:val="0"/>
+          <w:numId w:val="45"/>
+        </w:numPr>
+      </w:pPr>
+      <w:r>
+        <w:t>Input data.</w:t>
+      </w:r>
+    </w:p>
+    <w:p>
+      <w:pPr>
+        <w:pStyle w:val="NormalWeb"/>
+        <w:numPr>
+          <w:ilvl w:val="0"/>
+          <w:numId w:val="45"/>
+        </w:numPr>
+      </w:pPr>
+      <w:r>
+        <w:t>Specific conditions.</w:t>
+      </w:r>
+    </w:p>
+    <w:p>
+      <w:pPr>
+        <w:pStyle w:val="NormalWeb"/>
+      </w:pPr>
+      <w:r>
+        <w:t xml:space="preserve">Dynamic graphs provide greater flexibility compared to the </w:t>
+      </w:r>
+      <w:r>
+        <w:rPr>
+          <w:rStyle w:val="Strong"/>
+        </w:rPr>
+        <w:t>static graphs</w:t>
+      </w:r>
+      <w:r>
+        <w:t xml:space="preserve"> used by the Sequential API and Functional API.</w:t>
+      </w:r>
+    </w:p>
+    <w:p>
+      <w:pPr>
+        <w:pStyle w:val="NormalWeb"/>
+      </w:pPr>
+      <w:r>
+        <w:t>In the example:</w:t>
+      </w:r>
+    </w:p>
+    <w:p>
+      <w:pPr>
+        <w:pStyle w:val="NormalWeb"/>
+        <w:numPr>
+          <w:ilvl w:val="0"/>
+          <w:numId w:val="46"/>
+        </w:numPr>
+      </w:pPr>
+      <w:r>
+        <w:t>Edges are first added for dynamic flow.</w:t>
+      </w:r>
+    </w:p>
+    <w:p>
+      <w:pPr>
+        <w:pStyle w:val="NormalWeb"/>
+        <w:numPr>
+          <w:ilvl w:val="0"/>
+          <w:numId w:val="46"/>
+        </w:numPr>
+      </w:pPr>
+      <w:r>
+        <w:t>The graph is then drawn with the specified title shown in the output.</w:t>
+      </w:r>
+    </w:p>
+    <w:p>
+      <w:pPr>
+        <w:pStyle w:val="Heading2"/>
+      </w:pPr>
+      <w:r>
+        <w:t>Summary</w:t>
+      </w:r>
+    </w:p>
+    <w:p>
+      <w:pPr>
+        <w:pStyle w:val="NormalWeb"/>
+      </w:pPr>
+      <w:r>
+        <w:t xml:space="preserve">The </w:t>
+      </w:r>
+      <w:r>
+        <w:rPr>
+          <w:rStyle w:val="Strong"/>
+        </w:rPr>
+        <w:t>Keras Functional API</w:t>
+      </w:r>
+      <w:r>
+        <w:t xml:space="preserve"> allows us to define layers and connect them in a graph of layers.</w:t>
+      </w:r>
+    </w:p>
+    <w:p>
+      <w:pPr>
+        <w:pStyle w:val="NormalWeb"/>
+      </w:pPr>
+      <w:r>
+        <w:t>Its major capabilities include:</w:t>
+      </w:r>
+    </w:p>
+    <w:p>
+      <w:pPr>
+        <w:pStyle w:val="NormalWeb"/>
+        <w:numPr>
+          <w:ilvl w:val="0"/>
+          <w:numId w:val="47"/>
+        </w:numPr>
+      </w:pPr>
+      <w:r>
+        <w:t>Building complex neural network architectures.</w:t>
+      </w:r>
+    </w:p>
+    <w:p>
+      <w:pPr>
+        <w:pStyle w:val="NormalWeb"/>
+        <w:numPr>
+          <w:ilvl w:val="0"/>
+          <w:numId w:val="47"/>
+        </w:numPr>
+      </w:pPr>
+      <w:r>
+        <w:t>Supporting multiple inputs and outputs.</w:t>
+      </w:r>
+    </w:p>
+    <w:p>
+      <w:pPr>
+        <w:pStyle w:val="NormalWeb"/>
+        <w:numPr>
+          <w:ilvl w:val="0"/>
+          <w:numId w:val="47"/>
+        </w:numPr>
+      </w:pPr>
+      <w:r>
+        <w:t>Supporting shared layers.</w:t>
+      </w:r>
+    </w:p>
+    <w:p>
+      <w:pPr>
+        <w:pStyle w:val="NormalWeb"/>
+        <w:numPr>
+          <w:ilvl w:val="0"/>
+          <w:numId w:val="47"/>
+        </w:numPr>
+      </w:pPr>
+      <w:r>
+        <w:t>Allowing nonlinear data flows.</w:t>
+      </w:r>
+    </w:p>
+    <w:p>
+      <w:pPr>
+        <w:pStyle w:val="NormalWeb"/>
+      </w:pPr>
+      <w:r>
+        <w:t xml:space="preserve">The </w:t>
+      </w:r>
+      <w:r>
+        <w:rPr>
+          <w:rStyle w:val="Strong"/>
+        </w:rPr>
+        <w:t>Subclassing API</w:t>
+      </w:r>
+      <w:r>
+        <w:t xml:space="preserve"> allows us to:</w:t>
+      </w:r>
+    </w:p>
+    <w:p>
+      <w:pPr>
+        <w:pStyle w:val="NormalWeb"/>
+        <w:numPr>
+          <w:ilvl w:val="0"/>
+          <w:numId w:val="48"/>
+        </w:numPr>
+      </w:pPr>
+      <w:r>
+        <w:t>Define custom models.</w:t>
+      </w:r>
+    </w:p>
+    <w:p>
+      <w:pPr>
+        <w:pStyle w:val="NormalWeb"/>
+        <w:numPr>
+          <w:ilvl w:val="0"/>
+          <w:numId w:val="48"/>
+        </w:numPr>
+      </w:pPr>
+      <w:r>
+        <w:t>Build dynamic neural network architectures.</w:t>
+      </w:r>
+    </w:p>
+    <w:p>
+      <w:pPr>
+        <w:pStyle w:val="NormalWeb"/>
+        <w:numPr>
+          <w:ilvl w:val="0"/>
+          <w:numId w:val="48"/>
+        </w:numPr>
+      </w:pPr>
+      <w:r>
+        <w:t xml:space="preserve">Subclass the </w:t>
+      </w:r>
+      <w:r>
+        <w:rPr>
+          <w:rStyle w:val="HTMLCode"/>
+          <w:rFonts w:eastAsiaTheme="majorEastAsia"/>
+        </w:rPr>
+        <w:t>Model</w:t>
+      </w:r>
+      <w:r>
+        <w:t xml:space="preserve"> class.</w:t>
+      </w:r>
+    </w:p>
+    <w:p>
+      <w:pPr>
+        <w:pStyle w:val="NormalWeb"/>
+        <w:numPr>
+          <w:ilvl w:val="0"/>
+          <w:numId w:val="48"/>
+        </w:numPr>
+      </w:pPr>
+      <w:r>
+        <w:t xml:space="preserve">Implement the </w:t>
+      </w:r>
+      <w:r>
+        <w:rPr>
+          <w:rStyle w:val="HTMLCode"/>
+          <w:rFonts w:eastAsiaTheme="majorEastAsia"/>
+        </w:rPr>
+        <w:t>call()</w:t>
+      </w:r>
+      <w:r>
+        <w:t xml:space="preserve"> method to define custom forward passes.</w:t>
+      </w:r>
+    </w:p>
+    <w:p>
+      <w:pPr>
+        <w:pStyle w:val="NormalWeb"/>
+      </w:pPr>
+      <w:r>
+        <w:t xml:space="preserve">The </w:t>
+      </w:r>
+      <w:r>
+        <w:rPr>
+          <w:rStyle w:val="HTMLCode"/>
+          <w:rFonts w:eastAsiaTheme="majorEastAsia"/>
+        </w:rPr>
+        <w:t>tf.GradientTape</w:t>
+      </w:r>
+      <w:r>
+        <w:t xml:space="preserve"> method provides greater flexibility and control over the training process compared to the built-in </w:t>
+      </w:r>
+      <w:r>
+        <w:rPr>
+          <w:rStyle w:val="HTMLCode"/>
+          <w:rFonts w:eastAsiaTheme="majorEastAsia"/>
+        </w:rPr>
+        <w:t>keras.fit()</w:t>
+      </w:r>
+      <w:r>
+        <w:t xml:space="preserve"> method.</w:t>
+      </w:r>
+    </w:p>
+    <w:p>
+      <w:pPr>
         <w:rPr>
           <w:lang w:val="en" w:eastAsia="en"/>
         </w:rPr>
@@ -2548,6 +4246,453 @@
 <file path=word/numbering.xml><?xml version="1.0" encoding="utf-8"?>
 <w:numbering xmlns:wpc="http://schemas.microsoft.com/office/word/2010/wordprocessingCanvas" xmlns:cx="http://schemas.microsoft.com/office/drawing/2014/chartex" xmlns:cx1="http://schemas.microsoft.com/office/drawing/2015/9/8/chartex" xmlns:cx2="http://schemas.microsoft.com/office/drawing/2015/10/21/chartex" xmlns:cx3="http://schemas.microsoft.com/office/drawing/2016/5/9/chartex" xmlns:cx4="http://schemas.microsoft.com/office/drawing/2016/5/10/chartex" xmlns:cx5="http://schemas.microsoft.com/office/drawing/2016/5/11/chartex" xmlns:cx6="http://schemas.microsoft.com/office/drawing/2016/5/12/chartex" xmlns:cx7="http://schemas.microsoft.com/office/drawing/2016/5/13/chartex" xmlns:cx8="http://schemas.microsoft.com/office/drawing/2016/5/14/chartex" xmlns:mc="http://schemas.openxmlformats.org/markup-compatibility/2006" xmlns:aink="http://schemas.microsoft.com/office/drawing/2016/ink" xmlns:am3d="http://schemas.microsoft.com/office/drawing/2017/model3d" xmlns:o="urn:schemas-microsoft-com:office:office" xmlns:oel="http://schemas.microsoft.com/office/2019/extlst" xmlns:r="http://schemas.openxmlformats.org/officeDocument/2006/relationships" xmlns:m="http://schemas.openxmlformats.org/officeDocument/2006/math" xmlns:v="urn:schemas-microsoft-com:vml" xmlns:wp14="http://schemas.microsoft.com/office/word/2010/wordprocessingDrawing" xmlns:wp="http://schemas.openxmlformats.org/drawingml/2006/wordprocessingDrawing" xmlns:w10="urn:schemas-microsoft-com:office:word" xmlns:w="http://schemas.openxmlformats.org/wordprocessingml/2006/main" xmlns:w14="http://schemas.microsoft.com/office/word/2010/wordml" xmlns:w15="http://schemas.microsoft.com/office/word/2012/wordml" xmlns:w16cex="http://schemas.microsoft.com/office/word/2018/wordml/cex" xmlns:w16cid="http://schemas.microsoft.com/office/word/2016/wordml/cid" xmlns:w16="http://schemas.microsoft.com/office/word/2018/wordml" xmlns:w16du="http://schemas.microsoft.com/office/word/2023/wordml/word16du" xmlns:w16sdtdh="http://schemas.microsoft.com/office/word/2020/wordml/sdtdatahash" xmlns:w16sdtfl="http://schemas.microsoft.com/office/word/2024/wordml/sdtformatlock" xmlns:w16se="http://schemas.microsoft.com/office/word/2015/wordml/symex" xmlns:wpg="http://schemas.microsoft.com/office/word/2010/wordprocessingGroup" xmlns:wpi="http://schemas.microsoft.com/office/word/2010/wordprocessingInk" xmlns:wne="http://schemas.microsoft.com/office/word/2006/wordml" xmlns:wps="http://schemas.microsoft.com/office/word/2010/wordprocessingShape" mc:Ignorable="w14 w15 w16se w16cid w16 w16cex w16sdtdh w16sdtfl w16du wp14">
   <w:abstractNum w:abstractNumId="0" w15:restartNumberingAfterBreak="0">
+    <w:nsid w:val="04513B2F"/>
+    <w:multiLevelType w:val="multilevel"/>
+    <w:tmpl w:val="6D722650"/>
+    <w:lvl w:ilvl="0">
+      <w:start w:val="1"/>
+      <w:numFmt w:val="bullet"/>
+      <w:lvlText w:val=""/>
+      <w:lvlJc w:val="left"/>
+      <w:pPr>
+        <w:tabs>
+          <w:tab w:val="num" w:pos="720"/>
+        </w:tabs>
+        <w:ind w:left="720" w:hanging="360"/>
+      </w:pPr>
+      <w:rPr>
+        <w:rFonts w:ascii="Symbol" w:hAnsi="Symbol" w:hint="default"/>
+        <w:sz w:val="20"/>
+      </w:rPr>
+    </w:lvl>
+    <w:lvl w:ilvl="1" w:tentative="1">
+      <w:start w:val="1"/>
+      <w:numFmt w:val="bullet"/>
+      <w:lvlText w:val="o"/>
+      <w:lvlJc w:val="left"/>
+      <w:pPr>
+        <w:tabs>
+          <w:tab w:val="num" w:pos="1440"/>
+        </w:tabs>
+        <w:ind w:left="1440" w:hanging="360"/>
+      </w:pPr>
+      <w:rPr>
+        <w:rFonts w:ascii="Courier New" w:hAnsi="Courier New" w:hint="default"/>
+        <w:sz w:val="20"/>
+      </w:rPr>
+    </w:lvl>
+    <w:lvl w:ilvl="2" w:tentative="1">
+      <w:start w:val="1"/>
+      <w:numFmt w:val="bullet"/>
+      <w:lvlText w:val=""/>
+      <w:lvlJc w:val="left"/>
+      <w:pPr>
+        <w:tabs>
+          <w:tab w:val="num" w:pos="2160"/>
+        </w:tabs>
+        <w:ind w:left="2160" w:hanging="360"/>
+      </w:pPr>
+      <w:rPr>
+        <w:rFonts w:ascii="Wingdings" w:hAnsi="Wingdings" w:hint="default"/>
+        <w:sz w:val="20"/>
+      </w:rPr>
+    </w:lvl>
+    <w:lvl w:ilvl="3" w:tentative="1">
+      <w:start w:val="1"/>
+      <w:numFmt w:val="bullet"/>
+      <w:lvlText w:val=""/>
+      <w:lvlJc w:val="left"/>
+      <w:pPr>
+        <w:tabs>
+          <w:tab w:val="num" w:pos="2880"/>
+        </w:tabs>
+        <w:ind w:left="2880" w:hanging="360"/>
+      </w:pPr>
+      <w:rPr>
+        <w:rFonts w:ascii="Wingdings" w:hAnsi="Wingdings" w:hint="default"/>
+        <w:sz w:val="20"/>
+      </w:rPr>
+    </w:lvl>
+    <w:lvl w:ilvl="4" w:tentative="1">
+      <w:start w:val="1"/>
+      <w:numFmt w:val="bullet"/>
+      <w:lvlText w:val=""/>
+      <w:lvlJc w:val="left"/>
+      <w:pPr>
+        <w:tabs>
+          <w:tab w:val="num" w:pos="3600"/>
+        </w:tabs>
+        <w:ind w:left="3600" w:hanging="360"/>
+      </w:pPr>
+      <w:rPr>
+        <w:rFonts w:ascii="Wingdings" w:hAnsi="Wingdings" w:hint="default"/>
+        <w:sz w:val="20"/>
+      </w:rPr>
+    </w:lvl>
+    <w:lvl w:ilvl="5" w:tentative="1">
+      <w:start w:val="1"/>
+      <w:numFmt w:val="bullet"/>
+      <w:lvlText w:val=""/>
+      <w:lvlJc w:val="left"/>
+      <w:pPr>
+        <w:tabs>
+          <w:tab w:val="num" w:pos="4320"/>
+        </w:tabs>
+        <w:ind w:left="4320" w:hanging="360"/>
+      </w:pPr>
+      <w:rPr>
+        <w:rFonts w:ascii="Wingdings" w:hAnsi="Wingdings" w:hint="default"/>
+        <w:sz w:val="20"/>
+      </w:rPr>
+    </w:lvl>
+    <w:lvl w:ilvl="6" w:tentative="1">
+      <w:start w:val="1"/>
+      <w:numFmt w:val="bullet"/>
+      <w:lvlText w:val=""/>
+      <w:lvlJc w:val="left"/>
+      <w:pPr>
+        <w:tabs>
+          <w:tab w:val="num" w:pos="5040"/>
+        </w:tabs>
+        <w:ind w:left="5040" w:hanging="360"/>
+      </w:pPr>
+      <w:rPr>
+        <w:rFonts w:ascii="Wingdings" w:hAnsi="Wingdings" w:hint="default"/>
+        <w:sz w:val="20"/>
+      </w:rPr>
+    </w:lvl>
+    <w:lvl w:ilvl="7" w:tentative="1">
+      <w:start w:val="1"/>
+      <w:numFmt w:val="bullet"/>
+      <w:lvlText w:val=""/>
+      <w:lvlJc w:val="left"/>
+      <w:pPr>
+        <w:tabs>
+          <w:tab w:val="num" w:pos="5760"/>
+        </w:tabs>
+        <w:ind w:left="5760" w:hanging="360"/>
+      </w:pPr>
+      <w:rPr>
+        <w:rFonts w:ascii="Wingdings" w:hAnsi="Wingdings" w:hint="default"/>
+        <w:sz w:val="20"/>
+      </w:rPr>
+    </w:lvl>
+    <w:lvl w:ilvl="8" w:tentative="1">
+      <w:start w:val="1"/>
+      <w:numFmt w:val="bullet"/>
+      <w:lvlText w:val=""/>
+      <w:lvlJc w:val="left"/>
+      <w:pPr>
+        <w:tabs>
+          <w:tab w:val="num" w:pos="6480"/>
+        </w:tabs>
+        <w:ind w:left="6480" w:hanging="360"/>
+      </w:pPr>
+      <w:rPr>
+        <w:rFonts w:ascii="Wingdings" w:hAnsi="Wingdings" w:hint="default"/>
+        <w:sz w:val="20"/>
+      </w:rPr>
+    </w:lvl>
+  </w:abstractNum>
+  <w:abstractNum w:abstractNumId="1" w15:restartNumberingAfterBreak="0">
+    <w:nsid w:val="06CA2A69"/>
+    <w:multiLevelType w:val="multilevel"/>
+    <w:tmpl w:val="4F4A1D78"/>
+    <w:lvl w:ilvl="0">
+      <w:start w:val="1"/>
+      <w:numFmt w:val="bullet"/>
+      <w:lvlText w:val=""/>
+      <w:lvlJc w:val="left"/>
+      <w:pPr>
+        <w:tabs>
+          <w:tab w:val="num" w:pos="720"/>
+        </w:tabs>
+        <w:ind w:left="720" w:hanging="360"/>
+      </w:pPr>
+      <w:rPr>
+        <w:rFonts w:ascii="Symbol" w:hAnsi="Symbol" w:hint="default"/>
+        <w:sz w:val="20"/>
+      </w:rPr>
+    </w:lvl>
+    <w:lvl w:ilvl="1" w:tentative="1">
+      <w:start w:val="1"/>
+      <w:numFmt w:val="bullet"/>
+      <w:lvlText w:val="o"/>
+      <w:lvlJc w:val="left"/>
+      <w:pPr>
+        <w:tabs>
+          <w:tab w:val="num" w:pos="1440"/>
+        </w:tabs>
+        <w:ind w:left="1440" w:hanging="360"/>
+      </w:pPr>
+      <w:rPr>
+        <w:rFonts w:ascii="Courier New" w:hAnsi="Courier New" w:hint="default"/>
+        <w:sz w:val="20"/>
+      </w:rPr>
+    </w:lvl>
+    <w:lvl w:ilvl="2" w:tentative="1">
+      <w:start w:val="1"/>
+      <w:numFmt w:val="bullet"/>
+      <w:lvlText w:val=""/>
+      <w:lvlJc w:val="left"/>
+      <w:pPr>
+        <w:tabs>
+          <w:tab w:val="num" w:pos="2160"/>
+        </w:tabs>
+        <w:ind w:left="2160" w:hanging="360"/>
+      </w:pPr>
+      <w:rPr>
+        <w:rFonts w:ascii="Wingdings" w:hAnsi="Wingdings" w:hint="default"/>
+        <w:sz w:val="20"/>
+      </w:rPr>
+    </w:lvl>
+    <w:lvl w:ilvl="3" w:tentative="1">
+      <w:start w:val="1"/>
+      <w:numFmt w:val="bullet"/>
+      <w:lvlText w:val=""/>
+      <w:lvlJc w:val="left"/>
+      <w:pPr>
+        <w:tabs>
+          <w:tab w:val="num" w:pos="2880"/>
+        </w:tabs>
+        <w:ind w:left="2880" w:hanging="360"/>
+      </w:pPr>
+      <w:rPr>
+        <w:rFonts w:ascii="Wingdings" w:hAnsi="Wingdings" w:hint="default"/>
+        <w:sz w:val="20"/>
+      </w:rPr>
+    </w:lvl>
+    <w:lvl w:ilvl="4" w:tentative="1">
+      <w:start w:val="1"/>
+      <w:numFmt w:val="bullet"/>
+      <w:lvlText w:val=""/>
+      <w:lvlJc w:val="left"/>
+      <w:pPr>
+        <w:tabs>
+          <w:tab w:val="num" w:pos="3600"/>
+        </w:tabs>
+        <w:ind w:left="3600" w:hanging="360"/>
+      </w:pPr>
+      <w:rPr>
+        <w:rFonts w:ascii="Wingdings" w:hAnsi="Wingdings" w:hint="default"/>
+        <w:sz w:val="20"/>
+      </w:rPr>
+    </w:lvl>
+    <w:lvl w:ilvl="5" w:tentative="1">
+      <w:start w:val="1"/>
+      <w:numFmt w:val="bullet"/>
+      <w:lvlText w:val=""/>
+      <w:lvlJc w:val="left"/>
+      <w:pPr>
+        <w:tabs>
+          <w:tab w:val="num" w:pos="4320"/>
+        </w:tabs>
+        <w:ind w:left="4320" w:hanging="360"/>
+      </w:pPr>
+      <w:rPr>
+        <w:rFonts w:ascii="Wingdings" w:hAnsi="Wingdings" w:hint="default"/>
+        <w:sz w:val="20"/>
+      </w:rPr>
+    </w:lvl>
+    <w:lvl w:ilvl="6" w:tentative="1">
+      <w:start w:val="1"/>
+      <w:numFmt w:val="bullet"/>
+      <w:lvlText w:val=""/>
+      <w:lvlJc w:val="left"/>
+      <w:pPr>
+        <w:tabs>
+          <w:tab w:val="num" w:pos="5040"/>
+        </w:tabs>
+        <w:ind w:left="5040" w:hanging="360"/>
+      </w:pPr>
+      <w:rPr>
+        <w:rFonts w:ascii="Wingdings" w:hAnsi="Wingdings" w:hint="default"/>
+        <w:sz w:val="20"/>
+      </w:rPr>
+    </w:lvl>
+    <w:lvl w:ilvl="7" w:tentative="1">
+      <w:start w:val="1"/>
+      <w:numFmt w:val="bullet"/>
+      <w:lvlText w:val=""/>
+      <w:lvlJc w:val="left"/>
+      <w:pPr>
+        <w:tabs>
+          <w:tab w:val="num" w:pos="5760"/>
+        </w:tabs>
+        <w:ind w:left="5760" w:hanging="360"/>
+      </w:pPr>
+      <w:rPr>
+        <w:rFonts w:ascii="Wingdings" w:hAnsi="Wingdings" w:hint="default"/>
+        <w:sz w:val="20"/>
+      </w:rPr>
+    </w:lvl>
+    <w:lvl w:ilvl="8" w:tentative="1">
+      <w:start w:val="1"/>
+      <w:numFmt w:val="bullet"/>
+      <w:lvlText w:val=""/>
+      <w:lvlJc w:val="left"/>
+      <w:pPr>
+        <w:tabs>
+          <w:tab w:val="num" w:pos="6480"/>
+        </w:tabs>
+        <w:ind w:left="6480" w:hanging="360"/>
+      </w:pPr>
+      <w:rPr>
+        <w:rFonts w:ascii="Wingdings" w:hAnsi="Wingdings" w:hint="default"/>
+        <w:sz w:val="20"/>
+      </w:rPr>
+    </w:lvl>
+  </w:abstractNum>
+  <w:abstractNum w:abstractNumId="2" w15:restartNumberingAfterBreak="0">
+    <w:nsid w:val="0A87177F"/>
+    <w:multiLevelType w:val="multilevel"/>
+    <w:tmpl w:val="36246260"/>
+    <w:lvl w:ilvl="0">
+      <w:start w:val="1"/>
+      <w:numFmt w:val="bullet"/>
+      <w:lvlText w:val=""/>
+      <w:lvlJc w:val="left"/>
+      <w:pPr>
+        <w:tabs>
+          <w:tab w:val="num" w:pos="720"/>
+        </w:tabs>
+        <w:ind w:left="720" w:hanging="360"/>
+      </w:pPr>
+      <w:rPr>
+        <w:rFonts w:ascii="Symbol" w:hAnsi="Symbol" w:hint="default"/>
+        <w:sz w:val="20"/>
+      </w:rPr>
+    </w:lvl>
+    <w:lvl w:ilvl="1" w:tentative="1">
+      <w:start w:val="1"/>
+      <w:numFmt w:val="bullet"/>
+      <w:lvlText w:val="o"/>
+      <w:lvlJc w:val="left"/>
+      <w:pPr>
+        <w:tabs>
+          <w:tab w:val="num" w:pos="1440"/>
+        </w:tabs>
+        <w:ind w:left="1440" w:hanging="360"/>
+      </w:pPr>
+      <w:rPr>
+        <w:rFonts w:ascii="Courier New" w:hAnsi="Courier New" w:hint="default"/>
+        <w:sz w:val="20"/>
+      </w:rPr>
+    </w:lvl>
+    <w:lvl w:ilvl="2" w:tentative="1">
+      <w:start w:val="1"/>
+      <w:numFmt w:val="bullet"/>
+      <w:lvlText w:val=""/>
+      <w:lvlJc w:val="left"/>
+      <w:pPr>
+        <w:tabs>
+          <w:tab w:val="num" w:pos="2160"/>
+        </w:tabs>
+        <w:ind w:left="2160" w:hanging="360"/>
+      </w:pPr>
+      <w:rPr>
+        <w:rFonts w:ascii="Wingdings" w:hAnsi="Wingdings" w:hint="default"/>
+        <w:sz w:val="20"/>
+      </w:rPr>
+    </w:lvl>
+    <w:lvl w:ilvl="3" w:tentative="1">
+      <w:start w:val="1"/>
+      <w:numFmt w:val="bullet"/>
+      <w:lvlText w:val=""/>
+      <w:lvlJc w:val="left"/>
+      <w:pPr>
+        <w:tabs>
+          <w:tab w:val="num" w:pos="2880"/>
+        </w:tabs>
+        <w:ind w:left="2880" w:hanging="360"/>
+      </w:pPr>
+      <w:rPr>
+        <w:rFonts w:ascii="Wingdings" w:hAnsi="Wingdings" w:hint="default"/>
+        <w:sz w:val="20"/>
+      </w:rPr>
+    </w:lvl>
+    <w:lvl w:ilvl="4" w:tentative="1">
+      <w:start w:val="1"/>
+      <w:numFmt w:val="bullet"/>
+      <w:lvlText w:val=""/>
+      <w:lvlJc w:val="left"/>
+      <w:pPr>
+        <w:tabs>
+          <w:tab w:val="num" w:pos="3600"/>
+        </w:tabs>
+        <w:ind w:left="3600" w:hanging="360"/>
+      </w:pPr>
+      <w:rPr>
+        <w:rFonts w:ascii="Wingdings" w:hAnsi="Wingdings" w:hint="default"/>
+        <w:sz w:val="20"/>
+      </w:rPr>
+    </w:lvl>
+    <w:lvl w:ilvl="5" w:tentative="1">
+      <w:start w:val="1"/>
+      <w:numFmt w:val="bullet"/>
+      <w:lvlText w:val=""/>
+      <w:lvlJc w:val="left"/>
+      <w:pPr>
+        <w:tabs>
+          <w:tab w:val="num" w:pos="4320"/>
+        </w:tabs>
+        <w:ind w:left="4320" w:hanging="360"/>
+      </w:pPr>
+      <w:rPr>
+        <w:rFonts w:ascii="Wingdings" w:hAnsi="Wingdings" w:hint="default"/>
+        <w:sz w:val="20"/>
+      </w:rPr>
+    </w:lvl>
+    <w:lvl w:ilvl="6" w:tentative="1">
+      <w:start w:val="1"/>
+      <w:numFmt w:val="bullet"/>
+      <w:lvlText w:val=""/>
+      <w:lvlJc w:val="left"/>
+      <w:pPr>
+        <w:tabs>
+          <w:tab w:val="num" w:pos="5040"/>
+        </w:tabs>
+        <w:ind w:left="5040" w:hanging="360"/>
+      </w:pPr>
+      <w:rPr>
+        <w:rFonts w:ascii="Wingdings" w:hAnsi="Wingdings" w:hint="default"/>
+        <w:sz w:val="20"/>
+      </w:rPr>
+    </w:lvl>
+    <w:lvl w:ilvl="7" w:tentative="1">
+      <w:start w:val="1"/>
+      <w:numFmt w:val="bullet"/>
+      <w:lvlText w:val=""/>
+      <w:lvlJc w:val="left"/>
+      <w:pPr>
+        <w:tabs>
+          <w:tab w:val="num" w:pos="5760"/>
+        </w:tabs>
+        <w:ind w:left="5760" w:hanging="360"/>
+      </w:pPr>
+      <w:rPr>
+        <w:rFonts w:ascii="Wingdings" w:hAnsi="Wingdings" w:hint="default"/>
+        <w:sz w:val="20"/>
+      </w:rPr>
+    </w:lvl>
+    <w:lvl w:ilvl="8" w:tentative="1">
+      <w:start w:val="1"/>
+      <w:numFmt w:val="bullet"/>
+      <w:lvlText w:val=""/>
+      <w:lvlJc w:val="left"/>
+      <w:pPr>
+        <w:tabs>
+          <w:tab w:val="num" w:pos="6480"/>
+        </w:tabs>
+        <w:ind w:left="6480" w:hanging="360"/>
+      </w:pPr>
+      <w:rPr>
+        <w:rFonts w:ascii="Wingdings" w:hAnsi="Wingdings" w:hint="default"/>
+        <w:sz w:val="20"/>
+      </w:rPr>
+    </w:lvl>
+  </w:abstractNum>
+  <w:abstractNum w:abstractNumId="3" w15:restartNumberingAfterBreak="0">
     <w:nsid w:val="0BB72924"/>
     <w:multiLevelType w:val="multilevel"/>
     <w:tmpl w:val="FFC6FF08"/>
@@ -2696,7 +4841,7 @@
       </w:rPr>
     </w:lvl>
   </w:abstractNum>
-  <w:abstractNum w:abstractNumId="1" w15:restartNumberingAfterBreak="0">
+  <w:abstractNum w:abstractNumId="4" w15:restartNumberingAfterBreak="0">
     <w:nsid w:val="0C2F1A59"/>
     <w:multiLevelType w:val="multilevel"/>
     <w:tmpl w:val="E2A47430"/>
@@ -2845,7 +4990,7 @@
       </w:rPr>
     </w:lvl>
   </w:abstractNum>
-  <w:abstractNum w:abstractNumId="2" w15:restartNumberingAfterBreak="0">
+  <w:abstractNum w:abstractNumId="5" w15:restartNumberingAfterBreak="0">
     <w:nsid w:val="0E992A94"/>
     <w:multiLevelType w:val="multilevel"/>
     <w:tmpl w:val="55F63388"/>
@@ -2994,7 +5139,454 @@
       </w:rPr>
     </w:lvl>
   </w:abstractNum>
-  <w:abstractNum w:abstractNumId="3" w15:restartNumberingAfterBreak="0">
+  <w:abstractNum w:abstractNumId="6" w15:restartNumberingAfterBreak="0">
+    <w:nsid w:val="15C60C32"/>
+    <w:multiLevelType w:val="multilevel"/>
+    <w:tmpl w:val="3AE26770"/>
+    <w:lvl w:ilvl="0">
+      <w:start w:val="1"/>
+      <w:numFmt w:val="bullet"/>
+      <w:lvlText w:val=""/>
+      <w:lvlJc w:val="left"/>
+      <w:pPr>
+        <w:tabs>
+          <w:tab w:val="num" w:pos="720"/>
+        </w:tabs>
+        <w:ind w:left="720" w:hanging="360"/>
+      </w:pPr>
+      <w:rPr>
+        <w:rFonts w:ascii="Symbol" w:hAnsi="Symbol" w:hint="default"/>
+        <w:sz w:val="20"/>
+      </w:rPr>
+    </w:lvl>
+    <w:lvl w:ilvl="1" w:tentative="1">
+      <w:start w:val="1"/>
+      <w:numFmt w:val="bullet"/>
+      <w:lvlText w:val="o"/>
+      <w:lvlJc w:val="left"/>
+      <w:pPr>
+        <w:tabs>
+          <w:tab w:val="num" w:pos="1440"/>
+        </w:tabs>
+        <w:ind w:left="1440" w:hanging="360"/>
+      </w:pPr>
+      <w:rPr>
+        <w:rFonts w:ascii="Courier New" w:hAnsi="Courier New" w:hint="default"/>
+        <w:sz w:val="20"/>
+      </w:rPr>
+    </w:lvl>
+    <w:lvl w:ilvl="2" w:tentative="1">
+      <w:start w:val="1"/>
+      <w:numFmt w:val="bullet"/>
+      <w:lvlText w:val=""/>
+      <w:lvlJc w:val="left"/>
+      <w:pPr>
+        <w:tabs>
+          <w:tab w:val="num" w:pos="2160"/>
+        </w:tabs>
+        <w:ind w:left="2160" w:hanging="360"/>
+      </w:pPr>
+      <w:rPr>
+        <w:rFonts w:ascii="Wingdings" w:hAnsi="Wingdings" w:hint="default"/>
+        <w:sz w:val="20"/>
+      </w:rPr>
+    </w:lvl>
+    <w:lvl w:ilvl="3" w:tentative="1">
+      <w:start w:val="1"/>
+      <w:numFmt w:val="bullet"/>
+      <w:lvlText w:val=""/>
+      <w:lvlJc w:val="left"/>
+      <w:pPr>
+        <w:tabs>
+          <w:tab w:val="num" w:pos="2880"/>
+        </w:tabs>
+        <w:ind w:left="2880" w:hanging="360"/>
+      </w:pPr>
+      <w:rPr>
+        <w:rFonts w:ascii="Wingdings" w:hAnsi="Wingdings" w:hint="default"/>
+        <w:sz w:val="20"/>
+      </w:rPr>
+    </w:lvl>
+    <w:lvl w:ilvl="4" w:tentative="1">
+      <w:start w:val="1"/>
+      <w:numFmt w:val="bullet"/>
+      <w:lvlText w:val=""/>
+      <w:lvlJc w:val="left"/>
+      <w:pPr>
+        <w:tabs>
+          <w:tab w:val="num" w:pos="3600"/>
+        </w:tabs>
+        <w:ind w:left="3600" w:hanging="360"/>
+      </w:pPr>
+      <w:rPr>
+        <w:rFonts w:ascii="Wingdings" w:hAnsi="Wingdings" w:hint="default"/>
+        <w:sz w:val="20"/>
+      </w:rPr>
+    </w:lvl>
+    <w:lvl w:ilvl="5" w:tentative="1">
+      <w:start w:val="1"/>
+      <w:numFmt w:val="bullet"/>
+      <w:lvlText w:val=""/>
+      <w:lvlJc w:val="left"/>
+      <w:pPr>
+        <w:tabs>
+          <w:tab w:val="num" w:pos="4320"/>
+        </w:tabs>
+        <w:ind w:left="4320" w:hanging="360"/>
+      </w:pPr>
+      <w:rPr>
+        <w:rFonts w:ascii="Wingdings" w:hAnsi="Wingdings" w:hint="default"/>
+        <w:sz w:val="20"/>
+      </w:rPr>
+    </w:lvl>
+    <w:lvl w:ilvl="6" w:tentative="1">
+      <w:start w:val="1"/>
+      <w:numFmt w:val="bullet"/>
+      <w:lvlText w:val=""/>
+      <w:lvlJc w:val="left"/>
+      <w:pPr>
+        <w:tabs>
+          <w:tab w:val="num" w:pos="5040"/>
+        </w:tabs>
+        <w:ind w:left="5040" w:hanging="360"/>
+      </w:pPr>
+      <w:rPr>
+        <w:rFonts w:ascii="Wingdings" w:hAnsi="Wingdings" w:hint="default"/>
+        <w:sz w:val="20"/>
+      </w:rPr>
+    </w:lvl>
+    <w:lvl w:ilvl="7" w:tentative="1">
+      <w:start w:val="1"/>
+      <w:numFmt w:val="bullet"/>
+      <w:lvlText w:val=""/>
+      <w:lvlJc w:val="left"/>
+      <w:pPr>
+        <w:tabs>
+          <w:tab w:val="num" w:pos="5760"/>
+        </w:tabs>
+        <w:ind w:left="5760" w:hanging="360"/>
+      </w:pPr>
+      <w:rPr>
+        <w:rFonts w:ascii="Wingdings" w:hAnsi="Wingdings" w:hint="default"/>
+        <w:sz w:val="20"/>
+      </w:rPr>
+    </w:lvl>
+    <w:lvl w:ilvl="8" w:tentative="1">
+      <w:start w:val="1"/>
+      <w:numFmt w:val="bullet"/>
+      <w:lvlText w:val=""/>
+      <w:lvlJc w:val="left"/>
+      <w:pPr>
+        <w:tabs>
+          <w:tab w:val="num" w:pos="6480"/>
+        </w:tabs>
+        <w:ind w:left="6480" w:hanging="360"/>
+      </w:pPr>
+      <w:rPr>
+        <w:rFonts w:ascii="Wingdings" w:hAnsi="Wingdings" w:hint="default"/>
+        <w:sz w:val="20"/>
+      </w:rPr>
+    </w:lvl>
+  </w:abstractNum>
+  <w:abstractNum w:abstractNumId="7" w15:restartNumberingAfterBreak="0">
+    <w:nsid w:val="1818190E"/>
+    <w:multiLevelType w:val="multilevel"/>
+    <w:tmpl w:val="EDC64EB6"/>
+    <w:lvl w:ilvl="0">
+      <w:start w:val="1"/>
+      <w:numFmt w:val="bullet"/>
+      <w:lvlText w:val=""/>
+      <w:lvlJc w:val="left"/>
+      <w:pPr>
+        <w:tabs>
+          <w:tab w:val="num" w:pos="720"/>
+        </w:tabs>
+        <w:ind w:left="720" w:hanging="360"/>
+      </w:pPr>
+      <w:rPr>
+        <w:rFonts w:ascii="Symbol" w:hAnsi="Symbol" w:hint="default"/>
+        <w:sz w:val="20"/>
+      </w:rPr>
+    </w:lvl>
+    <w:lvl w:ilvl="1" w:tentative="1">
+      <w:start w:val="1"/>
+      <w:numFmt w:val="bullet"/>
+      <w:lvlText w:val="o"/>
+      <w:lvlJc w:val="left"/>
+      <w:pPr>
+        <w:tabs>
+          <w:tab w:val="num" w:pos="1440"/>
+        </w:tabs>
+        <w:ind w:left="1440" w:hanging="360"/>
+      </w:pPr>
+      <w:rPr>
+        <w:rFonts w:ascii="Courier New" w:hAnsi="Courier New" w:hint="default"/>
+        <w:sz w:val="20"/>
+      </w:rPr>
+    </w:lvl>
+    <w:lvl w:ilvl="2" w:tentative="1">
+      <w:start w:val="1"/>
+      <w:numFmt w:val="bullet"/>
+      <w:lvlText w:val=""/>
+      <w:lvlJc w:val="left"/>
+      <w:pPr>
+        <w:tabs>
+          <w:tab w:val="num" w:pos="2160"/>
+        </w:tabs>
+        <w:ind w:left="2160" w:hanging="360"/>
+      </w:pPr>
+      <w:rPr>
+        <w:rFonts w:ascii="Wingdings" w:hAnsi="Wingdings" w:hint="default"/>
+        <w:sz w:val="20"/>
+      </w:rPr>
+    </w:lvl>
+    <w:lvl w:ilvl="3" w:tentative="1">
+      <w:start w:val="1"/>
+      <w:numFmt w:val="bullet"/>
+      <w:lvlText w:val=""/>
+      <w:lvlJc w:val="left"/>
+      <w:pPr>
+        <w:tabs>
+          <w:tab w:val="num" w:pos="2880"/>
+        </w:tabs>
+        <w:ind w:left="2880" w:hanging="360"/>
+      </w:pPr>
+      <w:rPr>
+        <w:rFonts w:ascii="Wingdings" w:hAnsi="Wingdings" w:hint="default"/>
+        <w:sz w:val="20"/>
+      </w:rPr>
+    </w:lvl>
+    <w:lvl w:ilvl="4" w:tentative="1">
+      <w:start w:val="1"/>
+      <w:numFmt w:val="bullet"/>
+      <w:lvlText w:val=""/>
+      <w:lvlJc w:val="left"/>
+      <w:pPr>
+        <w:tabs>
+          <w:tab w:val="num" w:pos="3600"/>
+        </w:tabs>
+        <w:ind w:left="3600" w:hanging="360"/>
+      </w:pPr>
+      <w:rPr>
+        <w:rFonts w:ascii="Wingdings" w:hAnsi="Wingdings" w:hint="default"/>
+        <w:sz w:val="20"/>
+      </w:rPr>
+    </w:lvl>
+    <w:lvl w:ilvl="5" w:tentative="1">
+      <w:start w:val="1"/>
+      <w:numFmt w:val="bullet"/>
+      <w:lvlText w:val=""/>
+      <w:lvlJc w:val="left"/>
+      <w:pPr>
+        <w:tabs>
+          <w:tab w:val="num" w:pos="4320"/>
+        </w:tabs>
+        <w:ind w:left="4320" w:hanging="360"/>
+      </w:pPr>
+      <w:rPr>
+        <w:rFonts w:ascii="Wingdings" w:hAnsi="Wingdings" w:hint="default"/>
+        <w:sz w:val="20"/>
+      </w:rPr>
+    </w:lvl>
+    <w:lvl w:ilvl="6" w:tentative="1">
+      <w:start w:val="1"/>
+      <w:numFmt w:val="bullet"/>
+      <w:lvlText w:val=""/>
+      <w:lvlJc w:val="left"/>
+      <w:pPr>
+        <w:tabs>
+          <w:tab w:val="num" w:pos="5040"/>
+        </w:tabs>
+        <w:ind w:left="5040" w:hanging="360"/>
+      </w:pPr>
+      <w:rPr>
+        <w:rFonts w:ascii="Wingdings" w:hAnsi="Wingdings" w:hint="default"/>
+        <w:sz w:val="20"/>
+      </w:rPr>
+    </w:lvl>
+    <w:lvl w:ilvl="7" w:tentative="1">
+      <w:start w:val="1"/>
+      <w:numFmt w:val="bullet"/>
+      <w:lvlText w:val=""/>
+      <w:lvlJc w:val="left"/>
+      <w:pPr>
+        <w:tabs>
+          <w:tab w:val="num" w:pos="5760"/>
+        </w:tabs>
+        <w:ind w:left="5760" w:hanging="360"/>
+      </w:pPr>
+      <w:rPr>
+        <w:rFonts w:ascii="Wingdings" w:hAnsi="Wingdings" w:hint="default"/>
+        <w:sz w:val="20"/>
+      </w:rPr>
+    </w:lvl>
+    <w:lvl w:ilvl="8" w:tentative="1">
+      <w:start w:val="1"/>
+      <w:numFmt w:val="bullet"/>
+      <w:lvlText w:val=""/>
+      <w:lvlJc w:val="left"/>
+      <w:pPr>
+        <w:tabs>
+          <w:tab w:val="num" w:pos="6480"/>
+        </w:tabs>
+        <w:ind w:left="6480" w:hanging="360"/>
+      </w:pPr>
+      <w:rPr>
+        <w:rFonts w:ascii="Wingdings" w:hAnsi="Wingdings" w:hint="default"/>
+        <w:sz w:val="20"/>
+      </w:rPr>
+    </w:lvl>
+  </w:abstractNum>
+  <w:abstractNum w:abstractNumId="8" w15:restartNumberingAfterBreak="0">
+    <w:nsid w:val="18BC20E0"/>
+    <w:multiLevelType w:val="multilevel"/>
+    <w:tmpl w:val="DE80707E"/>
+    <w:lvl w:ilvl="0">
+      <w:start w:val="1"/>
+      <w:numFmt w:val="bullet"/>
+      <w:lvlText w:val=""/>
+      <w:lvlJc w:val="left"/>
+      <w:pPr>
+        <w:tabs>
+          <w:tab w:val="num" w:pos="720"/>
+        </w:tabs>
+        <w:ind w:left="720" w:hanging="360"/>
+      </w:pPr>
+      <w:rPr>
+        <w:rFonts w:ascii="Symbol" w:hAnsi="Symbol" w:hint="default"/>
+        <w:sz w:val="20"/>
+      </w:rPr>
+    </w:lvl>
+    <w:lvl w:ilvl="1" w:tentative="1">
+      <w:start w:val="1"/>
+      <w:numFmt w:val="bullet"/>
+      <w:lvlText w:val="o"/>
+      <w:lvlJc w:val="left"/>
+      <w:pPr>
+        <w:tabs>
+          <w:tab w:val="num" w:pos="1440"/>
+        </w:tabs>
+        <w:ind w:left="1440" w:hanging="360"/>
+      </w:pPr>
+      <w:rPr>
+        <w:rFonts w:ascii="Courier New" w:hAnsi="Courier New" w:hint="default"/>
+        <w:sz w:val="20"/>
+      </w:rPr>
+    </w:lvl>
+    <w:lvl w:ilvl="2" w:tentative="1">
+      <w:start w:val="1"/>
+      <w:numFmt w:val="bullet"/>
+      <w:lvlText w:val=""/>
+      <w:lvlJc w:val="left"/>
+      <w:pPr>
+        <w:tabs>
+          <w:tab w:val="num" w:pos="2160"/>
+        </w:tabs>
+        <w:ind w:left="2160" w:hanging="360"/>
+      </w:pPr>
+      <w:rPr>
+        <w:rFonts w:ascii="Wingdings" w:hAnsi="Wingdings" w:hint="default"/>
+        <w:sz w:val="20"/>
+      </w:rPr>
+    </w:lvl>
+    <w:lvl w:ilvl="3" w:tentative="1">
+      <w:start w:val="1"/>
+      <w:numFmt w:val="bullet"/>
+      <w:lvlText w:val=""/>
+      <w:lvlJc w:val="left"/>
+      <w:pPr>
+        <w:tabs>
+          <w:tab w:val="num" w:pos="2880"/>
+        </w:tabs>
+        <w:ind w:left="2880" w:hanging="360"/>
+      </w:pPr>
+      <w:rPr>
+        <w:rFonts w:ascii="Wingdings" w:hAnsi="Wingdings" w:hint="default"/>
+        <w:sz w:val="20"/>
+      </w:rPr>
+    </w:lvl>
+    <w:lvl w:ilvl="4" w:tentative="1">
+      <w:start w:val="1"/>
+      <w:numFmt w:val="bullet"/>
+      <w:lvlText w:val=""/>
+      <w:lvlJc w:val="left"/>
+      <w:pPr>
+        <w:tabs>
+          <w:tab w:val="num" w:pos="3600"/>
+        </w:tabs>
+        <w:ind w:left="3600" w:hanging="360"/>
+      </w:pPr>
+      <w:rPr>
+        <w:rFonts w:ascii="Wingdings" w:hAnsi="Wingdings" w:hint="default"/>
+        <w:sz w:val="20"/>
+      </w:rPr>
+    </w:lvl>
+    <w:lvl w:ilvl="5" w:tentative="1">
+      <w:start w:val="1"/>
+      <w:numFmt w:val="bullet"/>
+      <w:lvlText w:val=""/>
+      <w:lvlJc w:val="left"/>
+      <w:pPr>
+        <w:tabs>
+          <w:tab w:val="num" w:pos="4320"/>
+        </w:tabs>
+        <w:ind w:left="4320" w:hanging="360"/>
+      </w:pPr>
+      <w:rPr>
+        <w:rFonts w:ascii="Wingdings" w:hAnsi="Wingdings" w:hint="default"/>
+        <w:sz w:val="20"/>
+      </w:rPr>
+    </w:lvl>
+    <w:lvl w:ilvl="6" w:tentative="1">
+      <w:start w:val="1"/>
+      <w:numFmt w:val="bullet"/>
+      <w:lvlText w:val=""/>
+      <w:lvlJc w:val="left"/>
+      <w:pPr>
+        <w:tabs>
+          <w:tab w:val="num" w:pos="5040"/>
+        </w:tabs>
+        <w:ind w:left="5040" w:hanging="360"/>
+      </w:pPr>
+      <w:rPr>
+        <w:rFonts w:ascii="Wingdings" w:hAnsi="Wingdings" w:hint="default"/>
+        <w:sz w:val="20"/>
+      </w:rPr>
+    </w:lvl>
+    <w:lvl w:ilvl="7" w:tentative="1">
+      <w:start w:val="1"/>
+      <w:numFmt w:val="bullet"/>
+      <w:lvlText w:val=""/>
+      <w:lvlJc w:val="left"/>
+      <w:pPr>
+        <w:tabs>
+          <w:tab w:val="num" w:pos="5760"/>
+        </w:tabs>
+        <w:ind w:left="5760" w:hanging="360"/>
+      </w:pPr>
+      <w:rPr>
+        <w:rFonts w:ascii="Wingdings" w:hAnsi="Wingdings" w:hint="default"/>
+        <w:sz w:val="20"/>
+      </w:rPr>
+    </w:lvl>
+    <w:lvl w:ilvl="8" w:tentative="1">
+      <w:start w:val="1"/>
+      <w:numFmt w:val="bullet"/>
+      <w:lvlText w:val=""/>
+      <w:lvlJc w:val="left"/>
+      <w:pPr>
+        <w:tabs>
+          <w:tab w:val="num" w:pos="6480"/>
+        </w:tabs>
+        <w:ind w:left="6480" w:hanging="360"/>
+      </w:pPr>
+      <w:rPr>
+        <w:rFonts w:ascii="Wingdings" w:hAnsi="Wingdings" w:hint="default"/>
+        <w:sz w:val="20"/>
+      </w:rPr>
+    </w:lvl>
+  </w:abstractNum>
+  <w:abstractNum w:abstractNumId="9" w15:restartNumberingAfterBreak="0">
     <w:nsid w:val="207E4B4C"/>
     <w:multiLevelType w:val="multilevel"/>
     <w:tmpl w:val="CC8C993C"/>
@@ -3143,7 +5735,305 @@
       </w:rPr>
     </w:lvl>
   </w:abstractNum>
-  <w:abstractNum w:abstractNumId="4" w15:restartNumberingAfterBreak="0">
+  <w:abstractNum w:abstractNumId="10" w15:restartNumberingAfterBreak="0">
+    <w:nsid w:val="20ED4D27"/>
+    <w:multiLevelType w:val="multilevel"/>
+    <w:tmpl w:val="4978DD32"/>
+    <w:lvl w:ilvl="0">
+      <w:start w:val="1"/>
+      <w:numFmt w:val="bullet"/>
+      <w:lvlText w:val=""/>
+      <w:lvlJc w:val="left"/>
+      <w:pPr>
+        <w:tabs>
+          <w:tab w:val="num" w:pos="720"/>
+        </w:tabs>
+        <w:ind w:left="720" w:hanging="360"/>
+      </w:pPr>
+      <w:rPr>
+        <w:rFonts w:ascii="Symbol" w:hAnsi="Symbol" w:hint="default"/>
+        <w:sz w:val="20"/>
+      </w:rPr>
+    </w:lvl>
+    <w:lvl w:ilvl="1" w:tentative="1">
+      <w:start w:val="1"/>
+      <w:numFmt w:val="bullet"/>
+      <w:lvlText w:val="o"/>
+      <w:lvlJc w:val="left"/>
+      <w:pPr>
+        <w:tabs>
+          <w:tab w:val="num" w:pos="1440"/>
+        </w:tabs>
+        <w:ind w:left="1440" w:hanging="360"/>
+      </w:pPr>
+      <w:rPr>
+        <w:rFonts w:ascii="Courier New" w:hAnsi="Courier New" w:hint="default"/>
+        <w:sz w:val="20"/>
+      </w:rPr>
+    </w:lvl>
+    <w:lvl w:ilvl="2" w:tentative="1">
+      <w:start w:val="1"/>
+      <w:numFmt w:val="bullet"/>
+      <w:lvlText w:val=""/>
+      <w:lvlJc w:val="left"/>
+      <w:pPr>
+        <w:tabs>
+          <w:tab w:val="num" w:pos="2160"/>
+        </w:tabs>
+        <w:ind w:left="2160" w:hanging="360"/>
+      </w:pPr>
+      <w:rPr>
+        <w:rFonts w:ascii="Wingdings" w:hAnsi="Wingdings" w:hint="default"/>
+        <w:sz w:val="20"/>
+      </w:rPr>
+    </w:lvl>
+    <w:lvl w:ilvl="3" w:tentative="1">
+      <w:start w:val="1"/>
+      <w:numFmt w:val="bullet"/>
+      <w:lvlText w:val=""/>
+      <w:lvlJc w:val="left"/>
+      <w:pPr>
+        <w:tabs>
+          <w:tab w:val="num" w:pos="2880"/>
+        </w:tabs>
+        <w:ind w:left="2880" w:hanging="360"/>
+      </w:pPr>
+      <w:rPr>
+        <w:rFonts w:ascii="Wingdings" w:hAnsi="Wingdings" w:hint="default"/>
+        <w:sz w:val="20"/>
+      </w:rPr>
+    </w:lvl>
+    <w:lvl w:ilvl="4" w:tentative="1">
+      <w:start w:val="1"/>
+      <w:numFmt w:val="bullet"/>
+      <w:lvlText w:val=""/>
+      <w:lvlJc w:val="left"/>
+      <w:pPr>
+        <w:tabs>
+          <w:tab w:val="num" w:pos="3600"/>
+        </w:tabs>
+        <w:ind w:left="3600" w:hanging="360"/>
+      </w:pPr>
+      <w:rPr>
+        <w:rFonts w:ascii="Wingdings" w:hAnsi="Wingdings" w:hint="default"/>
+        <w:sz w:val="20"/>
+      </w:rPr>
+    </w:lvl>
+    <w:lvl w:ilvl="5" w:tentative="1">
+      <w:start w:val="1"/>
+      <w:numFmt w:val="bullet"/>
+      <w:lvlText w:val=""/>
+      <w:lvlJc w:val="left"/>
+      <w:pPr>
+        <w:tabs>
+          <w:tab w:val="num" w:pos="4320"/>
+        </w:tabs>
+        <w:ind w:left="4320" w:hanging="360"/>
+      </w:pPr>
+      <w:rPr>
+        <w:rFonts w:ascii="Wingdings" w:hAnsi="Wingdings" w:hint="default"/>
+        <w:sz w:val="20"/>
+      </w:rPr>
+    </w:lvl>
+    <w:lvl w:ilvl="6" w:tentative="1">
+      <w:start w:val="1"/>
+      <w:numFmt w:val="bullet"/>
+      <w:lvlText w:val=""/>
+      <w:lvlJc w:val="left"/>
+      <w:pPr>
+        <w:tabs>
+          <w:tab w:val="num" w:pos="5040"/>
+        </w:tabs>
+        <w:ind w:left="5040" w:hanging="360"/>
+      </w:pPr>
+      <w:rPr>
+        <w:rFonts w:ascii="Wingdings" w:hAnsi="Wingdings" w:hint="default"/>
+        <w:sz w:val="20"/>
+      </w:rPr>
+    </w:lvl>
+    <w:lvl w:ilvl="7" w:tentative="1">
+      <w:start w:val="1"/>
+      <w:numFmt w:val="bullet"/>
+      <w:lvlText w:val=""/>
+      <w:lvlJc w:val="left"/>
+      <w:pPr>
+        <w:tabs>
+          <w:tab w:val="num" w:pos="5760"/>
+        </w:tabs>
+        <w:ind w:left="5760" w:hanging="360"/>
+      </w:pPr>
+      <w:rPr>
+        <w:rFonts w:ascii="Wingdings" w:hAnsi="Wingdings" w:hint="default"/>
+        <w:sz w:val="20"/>
+      </w:rPr>
+    </w:lvl>
+    <w:lvl w:ilvl="8" w:tentative="1">
+      <w:start w:val="1"/>
+      <w:numFmt w:val="bullet"/>
+      <w:lvlText w:val=""/>
+      <w:lvlJc w:val="left"/>
+      <w:pPr>
+        <w:tabs>
+          <w:tab w:val="num" w:pos="6480"/>
+        </w:tabs>
+        <w:ind w:left="6480" w:hanging="360"/>
+      </w:pPr>
+      <w:rPr>
+        <w:rFonts w:ascii="Wingdings" w:hAnsi="Wingdings" w:hint="default"/>
+        <w:sz w:val="20"/>
+      </w:rPr>
+    </w:lvl>
+  </w:abstractNum>
+  <w:abstractNum w:abstractNumId="11" w15:restartNumberingAfterBreak="0">
+    <w:nsid w:val="212824BE"/>
+    <w:multiLevelType w:val="multilevel"/>
+    <w:tmpl w:val="AA90CD4E"/>
+    <w:lvl w:ilvl="0">
+      <w:start w:val="1"/>
+      <w:numFmt w:val="bullet"/>
+      <w:lvlText w:val=""/>
+      <w:lvlJc w:val="left"/>
+      <w:pPr>
+        <w:tabs>
+          <w:tab w:val="num" w:pos="720"/>
+        </w:tabs>
+        <w:ind w:left="720" w:hanging="360"/>
+      </w:pPr>
+      <w:rPr>
+        <w:rFonts w:ascii="Symbol" w:hAnsi="Symbol" w:hint="default"/>
+        <w:sz w:val="20"/>
+      </w:rPr>
+    </w:lvl>
+    <w:lvl w:ilvl="1" w:tentative="1">
+      <w:start w:val="1"/>
+      <w:numFmt w:val="bullet"/>
+      <w:lvlText w:val="o"/>
+      <w:lvlJc w:val="left"/>
+      <w:pPr>
+        <w:tabs>
+          <w:tab w:val="num" w:pos="1440"/>
+        </w:tabs>
+        <w:ind w:left="1440" w:hanging="360"/>
+      </w:pPr>
+      <w:rPr>
+        <w:rFonts w:ascii="Courier New" w:hAnsi="Courier New" w:hint="default"/>
+        <w:sz w:val="20"/>
+      </w:rPr>
+    </w:lvl>
+    <w:lvl w:ilvl="2" w:tentative="1">
+      <w:start w:val="1"/>
+      <w:numFmt w:val="bullet"/>
+      <w:lvlText w:val=""/>
+      <w:lvlJc w:val="left"/>
+      <w:pPr>
+        <w:tabs>
+          <w:tab w:val="num" w:pos="2160"/>
+        </w:tabs>
+        <w:ind w:left="2160" w:hanging="360"/>
+      </w:pPr>
+      <w:rPr>
+        <w:rFonts w:ascii="Wingdings" w:hAnsi="Wingdings" w:hint="default"/>
+        <w:sz w:val="20"/>
+      </w:rPr>
+    </w:lvl>
+    <w:lvl w:ilvl="3" w:tentative="1">
+      <w:start w:val="1"/>
+      <w:numFmt w:val="bullet"/>
+      <w:lvlText w:val=""/>
+      <w:lvlJc w:val="left"/>
+      <w:pPr>
+        <w:tabs>
+          <w:tab w:val="num" w:pos="2880"/>
+        </w:tabs>
+        <w:ind w:left="2880" w:hanging="360"/>
+      </w:pPr>
+      <w:rPr>
+        <w:rFonts w:ascii="Wingdings" w:hAnsi="Wingdings" w:hint="default"/>
+        <w:sz w:val="20"/>
+      </w:rPr>
+    </w:lvl>
+    <w:lvl w:ilvl="4" w:tentative="1">
+      <w:start w:val="1"/>
+      <w:numFmt w:val="bullet"/>
+      <w:lvlText w:val=""/>
+      <w:lvlJc w:val="left"/>
+      <w:pPr>
+        <w:tabs>
+          <w:tab w:val="num" w:pos="3600"/>
+        </w:tabs>
+        <w:ind w:left="3600" w:hanging="360"/>
+      </w:pPr>
+      <w:rPr>
+        <w:rFonts w:ascii="Wingdings" w:hAnsi="Wingdings" w:hint="default"/>
+        <w:sz w:val="20"/>
+      </w:rPr>
+    </w:lvl>
+    <w:lvl w:ilvl="5" w:tentative="1">
+      <w:start w:val="1"/>
+      <w:numFmt w:val="bullet"/>
+      <w:lvlText w:val=""/>
+      <w:lvlJc w:val="left"/>
+      <w:pPr>
+        <w:tabs>
+          <w:tab w:val="num" w:pos="4320"/>
+        </w:tabs>
+        <w:ind w:left="4320" w:hanging="360"/>
+      </w:pPr>
+      <w:rPr>
+        <w:rFonts w:ascii="Wingdings" w:hAnsi="Wingdings" w:hint="default"/>
+        <w:sz w:val="20"/>
+      </w:rPr>
+    </w:lvl>
+    <w:lvl w:ilvl="6" w:tentative="1">
+      <w:start w:val="1"/>
+      <w:numFmt w:val="bullet"/>
+      <w:lvlText w:val=""/>
+      <w:lvlJc w:val="left"/>
+      <w:pPr>
+        <w:tabs>
+          <w:tab w:val="num" w:pos="5040"/>
+        </w:tabs>
+        <w:ind w:left="5040" w:hanging="360"/>
+      </w:pPr>
+      <w:rPr>
+        <w:rFonts w:ascii="Wingdings" w:hAnsi="Wingdings" w:hint="default"/>
+        <w:sz w:val="20"/>
+      </w:rPr>
+    </w:lvl>
+    <w:lvl w:ilvl="7" w:tentative="1">
+      <w:start w:val="1"/>
+      <w:numFmt w:val="bullet"/>
+      <w:lvlText w:val=""/>
+      <w:lvlJc w:val="left"/>
+      <w:pPr>
+        <w:tabs>
+          <w:tab w:val="num" w:pos="5760"/>
+        </w:tabs>
+        <w:ind w:left="5760" w:hanging="360"/>
+      </w:pPr>
+      <w:rPr>
+        <w:rFonts w:ascii="Wingdings" w:hAnsi="Wingdings" w:hint="default"/>
+        <w:sz w:val="20"/>
+      </w:rPr>
+    </w:lvl>
+    <w:lvl w:ilvl="8" w:tentative="1">
+      <w:start w:val="1"/>
+      <w:numFmt w:val="bullet"/>
+      <w:lvlText w:val=""/>
+      <w:lvlJc w:val="left"/>
+      <w:pPr>
+        <w:tabs>
+          <w:tab w:val="num" w:pos="6480"/>
+        </w:tabs>
+        <w:ind w:left="6480" w:hanging="360"/>
+      </w:pPr>
+      <w:rPr>
+        <w:rFonts w:ascii="Wingdings" w:hAnsi="Wingdings" w:hint="default"/>
+        <w:sz w:val="20"/>
+      </w:rPr>
+    </w:lvl>
+  </w:abstractNum>
+  <w:abstractNum w:abstractNumId="12" w15:restartNumberingAfterBreak="0">
     <w:nsid w:val="251009E2"/>
     <w:multiLevelType w:val="multilevel"/>
     <w:tmpl w:val="C6901BEC"/>
@@ -3292,7 +6182,156 @@
       </w:rPr>
     </w:lvl>
   </w:abstractNum>
-  <w:abstractNum w:abstractNumId="5" w15:restartNumberingAfterBreak="0">
+  <w:abstractNum w:abstractNumId="13" w15:restartNumberingAfterBreak="0">
+    <w:nsid w:val="25850B3F"/>
+    <w:multiLevelType w:val="multilevel"/>
+    <w:tmpl w:val="452E40C0"/>
+    <w:lvl w:ilvl="0">
+      <w:start w:val="1"/>
+      <w:numFmt w:val="bullet"/>
+      <w:lvlText w:val=""/>
+      <w:lvlJc w:val="left"/>
+      <w:pPr>
+        <w:tabs>
+          <w:tab w:val="num" w:pos="720"/>
+        </w:tabs>
+        <w:ind w:left="720" w:hanging="360"/>
+      </w:pPr>
+      <w:rPr>
+        <w:rFonts w:ascii="Symbol" w:hAnsi="Symbol" w:hint="default"/>
+        <w:sz w:val="20"/>
+      </w:rPr>
+    </w:lvl>
+    <w:lvl w:ilvl="1" w:tentative="1">
+      <w:start w:val="1"/>
+      <w:numFmt w:val="bullet"/>
+      <w:lvlText w:val="o"/>
+      <w:lvlJc w:val="left"/>
+      <w:pPr>
+        <w:tabs>
+          <w:tab w:val="num" w:pos="1440"/>
+        </w:tabs>
+        <w:ind w:left="1440" w:hanging="360"/>
+      </w:pPr>
+      <w:rPr>
+        <w:rFonts w:ascii="Courier New" w:hAnsi="Courier New" w:hint="default"/>
+        <w:sz w:val="20"/>
+      </w:rPr>
+    </w:lvl>
+    <w:lvl w:ilvl="2" w:tentative="1">
+      <w:start w:val="1"/>
+      <w:numFmt w:val="bullet"/>
+      <w:lvlText w:val=""/>
+      <w:lvlJc w:val="left"/>
+      <w:pPr>
+        <w:tabs>
+          <w:tab w:val="num" w:pos="2160"/>
+        </w:tabs>
+        <w:ind w:left="2160" w:hanging="360"/>
+      </w:pPr>
+      <w:rPr>
+        <w:rFonts w:ascii="Wingdings" w:hAnsi="Wingdings" w:hint="default"/>
+        <w:sz w:val="20"/>
+      </w:rPr>
+    </w:lvl>
+    <w:lvl w:ilvl="3" w:tentative="1">
+      <w:start w:val="1"/>
+      <w:numFmt w:val="bullet"/>
+      <w:lvlText w:val=""/>
+      <w:lvlJc w:val="left"/>
+      <w:pPr>
+        <w:tabs>
+          <w:tab w:val="num" w:pos="2880"/>
+        </w:tabs>
+        <w:ind w:left="2880" w:hanging="360"/>
+      </w:pPr>
+      <w:rPr>
+        <w:rFonts w:ascii="Wingdings" w:hAnsi="Wingdings" w:hint="default"/>
+        <w:sz w:val="20"/>
+      </w:rPr>
+    </w:lvl>
+    <w:lvl w:ilvl="4" w:tentative="1">
+      <w:start w:val="1"/>
+      <w:numFmt w:val="bullet"/>
+      <w:lvlText w:val=""/>
+      <w:lvlJc w:val="left"/>
+      <w:pPr>
+        <w:tabs>
+          <w:tab w:val="num" w:pos="3600"/>
+        </w:tabs>
+        <w:ind w:left="3600" w:hanging="360"/>
+      </w:pPr>
+      <w:rPr>
+        <w:rFonts w:ascii="Wingdings" w:hAnsi="Wingdings" w:hint="default"/>
+        <w:sz w:val="20"/>
+      </w:rPr>
+    </w:lvl>
+    <w:lvl w:ilvl="5" w:tentative="1">
+      <w:start w:val="1"/>
+      <w:numFmt w:val="bullet"/>
+      <w:lvlText w:val=""/>
+      <w:lvlJc w:val="left"/>
+      <w:pPr>
+        <w:tabs>
+          <w:tab w:val="num" w:pos="4320"/>
+        </w:tabs>
+        <w:ind w:left="4320" w:hanging="360"/>
+      </w:pPr>
+      <w:rPr>
+        <w:rFonts w:ascii="Wingdings" w:hAnsi="Wingdings" w:hint="default"/>
+        <w:sz w:val="20"/>
+      </w:rPr>
+    </w:lvl>
+    <w:lvl w:ilvl="6" w:tentative="1">
+      <w:start w:val="1"/>
+      <w:numFmt w:val="bullet"/>
+      <w:lvlText w:val=""/>
+      <w:lvlJc w:val="left"/>
+      <w:pPr>
+        <w:tabs>
+          <w:tab w:val="num" w:pos="5040"/>
+        </w:tabs>
+        <w:ind w:left="5040" w:hanging="360"/>
+      </w:pPr>
+      <w:rPr>
+        <w:rFonts w:ascii="Wingdings" w:hAnsi="Wingdings" w:hint="default"/>
+        <w:sz w:val="20"/>
+      </w:rPr>
+    </w:lvl>
+    <w:lvl w:ilvl="7" w:tentative="1">
+      <w:start w:val="1"/>
+      <w:numFmt w:val="bullet"/>
+      <w:lvlText w:val=""/>
+      <w:lvlJc w:val="left"/>
+      <w:pPr>
+        <w:tabs>
+          <w:tab w:val="num" w:pos="5760"/>
+        </w:tabs>
+        <w:ind w:left="5760" w:hanging="360"/>
+      </w:pPr>
+      <w:rPr>
+        <w:rFonts w:ascii="Wingdings" w:hAnsi="Wingdings" w:hint="default"/>
+        <w:sz w:val="20"/>
+      </w:rPr>
+    </w:lvl>
+    <w:lvl w:ilvl="8" w:tentative="1">
+      <w:start w:val="1"/>
+      <w:numFmt w:val="bullet"/>
+      <w:lvlText w:val=""/>
+      <w:lvlJc w:val="left"/>
+      <w:pPr>
+        <w:tabs>
+          <w:tab w:val="num" w:pos="6480"/>
+        </w:tabs>
+        <w:ind w:left="6480" w:hanging="360"/>
+      </w:pPr>
+      <w:rPr>
+        <w:rFonts w:ascii="Wingdings" w:hAnsi="Wingdings" w:hint="default"/>
+        <w:sz w:val="20"/>
+      </w:rPr>
+    </w:lvl>
+  </w:abstractNum>
+  <w:abstractNum w:abstractNumId="14" w15:restartNumberingAfterBreak="0">
     <w:nsid w:val="26106C50"/>
     <w:multiLevelType w:val="multilevel"/>
     <w:tmpl w:val="D9869F06"/>
@@ -3405,7 +6444,7 @@
       </w:pPr>
     </w:lvl>
   </w:abstractNum>
-  <w:abstractNum w:abstractNumId="6" w15:restartNumberingAfterBreak="0">
+  <w:abstractNum w:abstractNumId="15" w15:restartNumberingAfterBreak="0">
     <w:nsid w:val="26802383"/>
     <w:multiLevelType w:val="multilevel"/>
     <w:tmpl w:val="34E0D16C"/>
@@ -3554,7 +6593,156 @@
       </w:rPr>
     </w:lvl>
   </w:abstractNum>
-  <w:abstractNum w:abstractNumId="7" w15:restartNumberingAfterBreak="0">
+  <w:abstractNum w:abstractNumId="16" w15:restartNumberingAfterBreak="0">
+    <w:nsid w:val="26B36A8A"/>
+    <w:multiLevelType w:val="multilevel"/>
+    <w:tmpl w:val="D936A8A6"/>
+    <w:lvl w:ilvl="0">
+      <w:start w:val="1"/>
+      <w:numFmt w:val="bullet"/>
+      <w:lvlText w:val=""/>
+      <w:lvlJc w:val="left"/>
+      <w:pPr>
+        <w:tabs>
+          <w:tab w:val="num" w:pos="720"/>
+        </w:tabs>
+        <w:ind w:left="720" w:hanging="360"/>
+      </w:pPr>
+      <w:rPr>
+        <w:rFonts w:ascii="Symbol" w:hAnsi="Symbol" w:hint="default"/>
+        <w:sz w:val="20"/>
+      </w:rPr>
+    </w:lvl>
+    <w:lvl w:ilvl="1" w:tentative="1">
+      <w:start w:val="1"/>
+      <w:numFmt w:val="bullet"/>
+      <w:lvlText w:val="o"/>
+      <w:lvlJc w:val="left"/>
+      <w:pPr>
+        <w:tabs>
+          <w:tab w:val="num" w:pos="1440"/>
+        </w:tabs>
+        <w:ind w:left="1440" w:hanging="360"/>
+      </w:pPr>
+      <w:rPr>
+        <w:rFonts w:ascii="Courier New" w:hAnsi="Courier New" w:hint="default"/>
+        <w:sz w:val="20"/>
+      </w:rPr>
+    </w:lvl>
+    <w:lvl w:ilvl="2" w:tentative="1">
+      <w:start w:val="1"/>
+      <w:numFmt w:val="bullet"/>
+      <w:lvlText w:val=""/>
+      <w:lvlJc w:val="left"/>
+      <w:pPr>
+        <w:tabs>
+          <w:tab w:val="num" w:pos="2160"/>
+        </w:tabs>
+        <w:ind w:left="2160" w:hanging="360"/>
+      </w:pPr>
+      <w:rPr>
+        <w:rFonts w:ascii="Wingdings" w:hAnsi="Wingdings" w:hint="default"/>
+        <w:sz w:val="20"/>
+      </w:rPr>
+    </w:lvl>
+    <w:lvl w:ilvl="3" w:tentative="1">
+      <w:start w:val="1"/>
+      <w:numFmt w:val="bullet"/>
+      <w:lvlText w:val=""/>
+      <w:lvlJc w:val="left"/>
+      <w:pPr>
+        <w:tabs>
+          <w:tab w:val="num" w:pos="2880"/>
+        </w:tabs>
+        <w:ind w:left="2880" w:hanging="360"/>
+      </w:pPr>
+      <w:rPr>
+        <w:rFonts w:ascii="Wingdings" w:hAnsi="Wingdings" w:hint="default"/>
+        <w:sz w:val="20"/>
+      </w:rPr>
+    </w:lvl>
+    <w:lvl w:ilvl="4" w:tentative="1">
+      <w:start w:val="1"/>
+      <w:numFmt w:val="bullet"/>
+      <w:lvlText w:val=""/>
+      <w:lvlJc w:val="left"/>
+      <w:pPr>
+        <w:tabs>
+          <w:tab w:val="num" w:pos="3600"/>
+        </w:tabs>
+        <w:ind w:left="3600" w:hanging="360"/>
+      </w:pPr>
+      <w:rPr>
+        <w:rFonts w:ascii="Wingdings" w:hAnsi="Wingdings" w:hint="default"/>
+        <w:sz w:val="20"/>
+      </w:rPr>
+    </w:lvl>
+    <w:lvl w:ilvl="5" w:tentative="1">
+      <w:start w:val="1"/>
+      <w:numFmt w:val="bullet"/>
+      <w:lvlText w:val=""/>
+      <w:lvlJc w:val="left"/>
+      <w:pPr>
+        <w:tabs>
+          <w:tab w:val="num" w:pos="4320"/>
+        </w:tabs>
+        <w:ind w:left="4320" w:hanging="360"/>
+      </w:pPr>
+      <w:rPr>
+        <w:rFonts w:ascii="Wingdings" w:hAnsi="Wingdings" w:hint="default"/>
+        <w:sz w:val="20"/>
+      </w:rPr>
+    </w:lvl>
+    <w:lvl w:ilvl="6" w:tentative="1">
+      <w:start w:val="1"/>
+      <w:numFmt w:val="bullet"/>
+      <w:lvlText w:val=""/>
+      <w:lvlJc w:val="left"/>
+      <w:pPr>
+        <w:tabs>
+          <w:tab w:val="num" w:pos="5040"/>
+        </w:tabs>
+        <w:ind w:left="5040" w:hanging="360"/>
+      </w:pPr>
+      <w:rPr>
+        <w:rFonts w:ascii="Wingdings" w:hAnsi="Wingdings" w:hint="default"/>
+        <w:sz w:val="20"/>
+      </w:rPr>
+    </w:lvl>
+    <w:lvl w:ilvl="7" w:tentative="1">
+      <w:start w:val="1"/>
+      <w:numFmt w:val="bullet"/>
+      <w:lvlText w:val=""/>
+      <w:lvlJc w:val="left"/>
+      <w:pPr>
+        <w:tabs>
+          <w:tab w:val="num" w:pos="5760"/>
+        </w:tabs>
+        <w:ind w:left="5760" w:hanging="360"/>
+      </w:pPr>
+      <w:rPr>
+        <w:rFonts w:ascii="Wingdings" w:hAnsi="Wingdings" w:hint="default"/>
+        <w:sz w:val="20"/>
+      </w:rPr>
+    </w:lvl>
+    <w:lvl w:ilvl="8" w:tentative="1">
+      <w:start w:val="1"/>
+      <w:numFmt w:val="bullet"/>
+      <w:lvlText w:val=""/>
+      <w:lvlJc w:val="left"/>
+      <w:pPr>
+        <w:tabs>
+          <w:tab w:val="num" w:pos="6480"/>
+        </w:tabs>
+        <w:ind w:left="6480" w:hanging="360"/>
+      </w:pPr>
+      <w:rPr>
+        <w:rFonts w:ascii="Wingdings" w:hAnsi="Wingdings" w:hint="default"/>
+        <w:sz w:val="20"/>
+      </w:rPr>
+    </w:lvl>
+  </w:abstractNum>
+  <w:abstractNum w:abstractNumId="17" w15:restartNumberingAfterBreak="0">
     <w:nsid w:val="272D2BE3"/>
     <w:multiLevelType w:val="multilevel"/>
     <w:tmpl w:val="DFC895D8"/>
@@ -3703,7 +6891,7 @@
       </w:rPr>
     </w:lvl>
   </w:abstractNum>
-  <w:abstractNum w:abstractNumId="8" w15:restartNumberingAfterBreak="0">
+  <w:abstractNum w:abstractNumId="18" w15:restartNumberingAfterBreak="0">
     <w:nsid w:val="33D07977"/>
     <w:multiLevelType w:val="multilevel"/>
     <w:tmpl w:val="4852D8A2"/>
@@ -3852,7 +7040,156 @@
       </w:rPr>
     </w:lvl>
   </w:abstractNum>
-  <w:abstractNum w:abstractNumId="9" w15:restartNumberingAfterBreak="0">
+  <w:abstractNum w:abstractNumId="19" w15:restartNumberingAfterBreak="0">
+    <w:nsid w:val="36CE48D4"/>
+    <w:multiLevelType w:val="multilevel"/>
+    <w:tmpl w:val="4ECE8E0C"/>
+    <w:lvl w:ilvl="0">
+      <w:start w:val="1"/>
+      <w:numFmt w:val="bullet"/>
+      <w:lvlText w:val=""/>
+      <w:lvlJc w:val="left"/>
+      <w:pPr>
+        <w:tabs>
+          <w:tab w:val="num" w:pos="720"/>
+        </w:tabs>
+        <w:ind w:left="720" w:hanging="360"/>
+      </w:pPr>
+      <w:rPr>
+        <w:rFonts w:ascii="Symbol" w:hAnsi="Symbol" w:hint="default"/>
+        <w:sz w:val="20"/>
+      </w:rPr>
+    </w:lvl>
+    <w:lvl w:ilvl="1" w:tentative="1">
+      <w:start w:val="1"/>
+      <w:numFmt w:val="bullet"/>
+      <w:lvlText w:val="o"/>
+      <w:lvlJc w:val="left"/>
+      <w:pPr>
+        <w:tabs>
+          <w:tab w:val="num" w:pos="1440"/>
+        </w:tabs>
+        <w:ind w:left="1440" w:hanging="360"/>
+      </w:pPr>
+      <w:rPr>
+        <w:rFonts w:ascii="Courier New" w:hAnsi="Courier New" w:hint="default"/>
+        <w:sz w:val="20"/>
+      </w:rPr>
+    </w:lvl>
+    <w:lvl w:ilvl="2" w:tentative="1">
+      <w:start w:val="1"/>
+      <w:numFmt w:val="bullet"/>
+      <w:lvlText w:val=""/>
+      <w:lvlJc w:val="left"/>
+      <w:pPr>
+        <w:tabs>
+          <w:tab w:val="num" w:pos="2160"/>
+        </w:tabs>
+        <w:ind w:left="2160" w:hanging="360"/>
+      </w:pPr>
+      <w:rPr>
+        <w:rFonts w:ascii="Wingdings" w:hAnsi="Wingdings" w:hint="default"/>
+        <w:sz w:val="20"/>
+      </w:rPr>
+    </w:lvl>
+    <w:lvl w:ilvl="3" w:tentative="1">
+      <w:start w:val="1"/>
+      <w:numFmt w:val="bullet"/>
+      <w:lvlText w:val=""/>
+      <w:lvlJc w:val="left"/>
+      <w:pPr>
+        <w:tabs>
+          <w:tab w:val="num" w:pos="2880"/>
+        </w:tabs>
+        <w:ind w:left="2880" w:hanging="360"/>
+      </w:pPr>
+      <w:rPr>
+        <w:rFonts w:ascii="Wingdings" w:hAnsi="Wingdings" w:hint="default"/>
+        <w:sz w:val="20"/>
+      </w:rPr>
+    </w:lvl>
+    <w:lvl w:ilvl="4" w:tentative="1">
+      <w:start w:val="1"/>
+      <w:numFmt w:val="bullet"/>
+      <w:lvlText w:val=""/>
+      <w:lvlJc w:val="left"/>
+      <w:pPr>
+        <w:tabs>
+          <w:tab w:val="num" w:pos="3600"/>
+        </w:tabs>
+        <w:ind w:left="3600" w:hanging="360"/>
+      </w:pPr>
+      <w:rPr>
+        <w:rFonts w:ascii="Wingdings" w:hAnsi="Wingdings" w:hint="default"/>
+        <w:sz w:val="20"/>
+      </w:rPr>
+    </w:lvl>
+    <w:lvl w:ilvl="5" w:tentative="1">
+      <w:start w:val="1"/>
+      <w:numFmt w:val="bullet"/>
+      <w:lvlText w:val=""/>
+      <w:lvlJc w:val="left"/>
+      <w:pPr>
+        <w:tabs>
+          <w:tab w:val="num" w:pos="4320"/>
+        </w:tabs>
+        <w:ind w:left="4320" w:hanging="360"/>
+      </w:pPr>
+      <w:rPr>
+        <w:rFonts w:ascii="Wingdings" w:hAnsi="Wingdings" w:hint="default"/>
+        <w:sz w:val="20"/>
+      </w:rPr>
+    </w:lvl>
+    <w:lvl w:ilvl="6" w:tentative="1">
+      <w:start w:val="1"/>
+      <w:numFmt w:val="bullet"/>
+      <w:lvlText w:val=""/>
+      <w:lvlJc w:val="left"/>
+      <w:pPr>
+        <w:tabs>
+          <w:tab w:val="num" w:pos="5040"/>
+        </w:tabs>
+        <w:ind w:left="5040" w:hanging="360"/>
+      </w:pPr>
+      <w:rPr>
+        <w:rFonts w:ascii="Wingdings" w:hAnsi="Wingdings" w:hint="default"/>
+        <w:sz w:val="20"/>
+      </w:rPr>
+    </w:lvl>
+    <w:lvl w:ilvl="7" w:tentative="1">
+      <w:start w:val="1"/>
+      <w:numFmt w:val="bullet"/>
+      <w:lvlText w:val=""/>
+      <w:lvlJc w:val="left"/>
+      <w:pPr>
+        <w:tabs>
+          <w:tab w:val="num" w:pos="5760"/>
+        </w:tabs>
+        <w:ind w:left="5760" w:hanging="360"/>
+      </w:pPr>
+      <w:rPr>
+        <w:rFonts w:ascii="Wingdings" w:hAnsi="Wingdings" w:hint="default"/>
+        <w:sz w:val="20"/>
+      </w:rPr>
+    </w:lvl>
+    <w:lvl w:ilvl="8" w:tentative="1">
+      <w:start w:val="1"/>
+      <w:numFmt w:val="bullet"/>
+      <w:lvlText w:val=""/>
+      <w:lvlJc w:val="left"/>
+      <w:pPr>
+        <w:tabs>
+          <w:tab w:val="num" w:pos="6480"/>
+        </w:tabs>
+        <w:ind w:left="6480" w:hanging="360"/>
+      </w:pPr>
+      <w:rPr>
+        <w:rFonts w:ascii="Wingdings" w:hAnsi="Wingdings" w:hint="default"/>
+        <w:sz w:val="20"/>
+      </w:rPr>
+    </w:lvl>
+  </w:abstractNum>
+  <w:abstractNum w:abstractNumId="20" w15:restartNumberingAfterBreak="0">
     <w:nsid w:val="384C78CB"/>
     <w:multiLevelType w:val="multilevel"/>
     <w:tmpl w:val="9BE65B8E"/>
@@ -3943,7 +7280,156 @@
       </w:pPr>
     </w:lvl>
   </w:abstractNum>
-  <w:abstractNum w:abstractNumId="10" w15:restartNumberingAfterBreak="0">
+  <w:abstractNum w:abstractNumId="21" w15:restartNumberingAfterBreak="0">
+    <w:nsid w:val="3A505175"/>
+    <w:multiLevelType w:val="multilevel"/>
+    <w:tmpl w:val="6CC2D5FC"/>
+    <w:lvl w:ilvl="0">
+      <w:start w:val="1"/>
+      <w:numFmt w:val="bullet"/>
+      <w:lvlText w:val=""/>
+      <w:lvlJc w:val="left"/>
+      <w:pPr>
+        <w:tabs>
+          <w:tab w:val="num" w:pos="720"/>
+        </w:tabs>
+        <w:ind w:left="720" w:hanging="360"/>
+      </w:pPr>
+      <w:rPr>
+        <w:rFonts w:ascii="Symbol" w:hAnsi="Symbol" w:hint="default"/>
+        <w:sz w:val="20"/>
+      </w:rPr>
+    </w:lvl>
+    <w:lvl w:ilvl="1">
+      <w:start w:val="1"/>
+      <w:numFmt w:val="bullet"/>
+      <w:lvlText w:val="o"/>
+      <w:lvlJc w:val="left"/>
+      <w:pPr>
+        <w:tabs>
+          <w:tab w:val="num" w:pos="1440"/>
+        </w:tabs>
+        <w:ind w:left="1440" w:hanging="360"/>
+      </w:pPr>
+      <w:rPr>
+        <w:rFonts w:ascii="Courier New" w:hAnsi="Courier New" w:hint="default"/>
+        <w:sz w:val="20"/>
+      </w:rPr>
+    </w:lvl>
+    <w:lvl w:ilvl="2" w:tentative="1">
+      <w:start w:val="1"/>
+      <w:numFmt w:val="bullet"/>
+      <w:lvlText w:val=""/>
+      <w:lvlJc w:val="left"/>
+      <w:pPr>
+        <w:tabs>
+          <w:tab w:val="num" w:pos="2160"/>
+        </w:tabs>
+        <w:ind w:left="2160" w:hanging="360"/>
+      </w:pPr>
+      <w:rPr>
+        <w:rFonts w:ascii="Wingdings" w:hAnsi="Wingdings" w:hint="default"/>
+        <w:sz w:val="20"/>
+      </w:rPr>
+    </w:lvl>
+    <w:lvl w:ilvl="3" w:tentative="1">
+      <w:start w:val="1"/>
+      <w:numFmt w:val="bullet"/>
+      <w:lvlText w:val=""/>
+      <w:lvlJc w:val="left"/>
+      <w:pPr>
+        <w:tabs>
+          <w:tab w:val="num" w:pos="2880"/>
+        </w:tabs>
+        <w:ind w:left="2880" w:hanging="360"/>
+      </w:pPr>
+      <w:rPr>
+        <w:rFonts w:ascii="Wingdings" w:hAnsi="Wingdings" w:hint="default"/>
+        <w:sz w:val="20"/>
+      </w:rPr>
+    </w:lvl>
+    <w:lvl w:ilvl="4" w:tentative="1">
+      <w:start w:val="1"/>
+      <w:numFmt w:val="bullet"/>
+      <w:lvlText w:val=""/>
+      <w:lvlJc w:val="left"/>
+      <w:pPr>
+        <w:tabs>
+          <w:tab w:val="num" w:pos="3600"/>
+        </w:tabs>
+        <w:ind w:left="3600" w:hanging="360"/>
+      </w:pPr>
+      <w:rPr>
+        <w:rFonts w:ascii="Wingdings" w:hAnsi="Wingdings" w:hint="default"/>
+        <w:sz w:val="20"/>
+      </w:rPr>
+    </w:lvl>
+    <w:lvl w:ilvl="5" w:tentative="1">
+      <w:start w:val="1"/>
+      <w:numFmt w:val="bullet"/>
+      <w:lvlText w:val=""/>
+      <w:lvlJc w:val="left"/>
+      <w:pPr>
+        <w:tabs>
+          <w:tab w:val="num" w:pos="4320"/>
+        </w:tabs>
+        <w:ind w:left="4320" w:hanging="360"/>
+      </w:pPr>
+      <w:rPr>
+        <w:rFonts w:ascii="Wingdings" w:hAnsi="Wingdings" w:hint="default"/>
+        <w:sz w:val="20"/>
+      </w:rPr>
+    </w:lvl>
+    <w:lvl w:ilvl="6" w:tentative="1">
+      <w:start w:val="1"/>
+      <w:numFmt w:val="bullet"/>
+      <w:lvlText w:val=""/>
+      <w:lvlJc w:val="left"/>
+      <w:pPr>
+        <w:tabs>
+          <w:tab w:val="num" w:pos="5040"/>
+        </w:tabs>
+        <w:ind w:left="5040" w:hanging="360"/>
+      </w:pPr>
+      <w:rPr>
+        <w:rFonts w:ascii="Wingdings" w:hAnsi="Wingdings" w:hint="default"/>
+        <w:sz w:val="20"/>
+      </w:rPr>
+    </w:lvl>
+    <w:lvl w:ilvl="7" w:tentative="1">
+      <w:start w:val="1"/>
+      <w:numFmt w:val="bullet"/>
+      <w:lvlText w:val=""/>
+      <w:lvlJc w:val="left"/>
+      <w:pPr>
+        <w:tabs>
+          <w:tab w:val="num" w:pos="5760"/>
+        </w:tabs>
+        <w:ind w:left="5760" w:hanging="360"/>
+      </w:pPr>
+      <w:rPr>
+        <w:rFonts w:ascii="Wingdings" w:hAnsi="Wingdings" w:hint="default"/>
+        <w:sz w:val="20"/>
+      </w:rPr>
+    </w:lvl>
+    <w:lvl w:ilvl="8" w:tentative="1">
+      <w:start w:val="1"/>
+      <w:numFmt w:val="bullet"/>
+      <w:lvlText w:val=""/>
+      <w:lvlJc w:val="left"/>
+      <w:pPr>
+        <w:tabs>
+          <w:tab w:val="num" w:pos="6480"/>
+        </w:tabs>
+        <w:ind w:left="6480" w:hanging="360"/>
+      </w:pPr>
+      <w:rPr>
+        <w:rFonts w:ascii="Wingdings" w:hAnsi="Wingdings" w:hint="default"/>
+        <w:sz w:val="20"/>
+      </w:rPr>
+    </w:lvl>
+  </w:abstractNum>
+  <w:abstractNum w:abstractNumId="22" w15:restartNumberingAfterBreak="0">
     <w:nsid w:val="41BA488D"/>
     <w:multiLevelType w:val="multilevel"/>
     <w:tmpl w:val="4260AB64"/>
@@ -4029,7 +7515,305 @@
       </w:pPr>
     </w:lvl>
   </w:abstractNum>
-  <w:abstractNum w:abstractNumId="11" w15:restartNumberingAfterBreak="0">
+  <w:abstractNum w:abstractNumId="23" w15:restartNumberingAfterBreak="0">
+    <w:nsid w:val="47DC00F8"/>
+    <w:multiLevelType w:val="multilevel"/>
+    <w:tmpl w:val="93387234"/>
+    <w:lvl w:ilvl="0">
+      <w:start w:val="1"/>
+      <w:numFmt w:val="bullet"/>
+      <w:lvlText w:val=""/>
+      <w:lvlJc w:val="left"/>
+      <w:pPr>
+        <w:tabs>
+          <w:tab w:val="num" w:pos="720"/>
+        </w:tabs>
+        <w:ind w:left="720" w:hanging="360"/>
+      </w:pPr>
+      <w:rPr>
+        <w:rFonts w:ascii="Symbol" w:hAnsi="Symbol" w:hint="default"/>
+        <w:sz w:val="20"/>
+      </w:rPr>
+    </w:lvl>
+    <w:lvl w:ilvl="1" w:tentative="1">
+      <w:start w:val="1"/>
+      <w:numFmt w:val="bullet"/>
+      <w:lvlText w:val="o"/>
+      <w:lvlJc w:val="left"/>
+      <w:pPr>
+        <w:tabs>
+          <w:tab w:val="num" w:pos="1440"/>
+        </w:tabs>
+        <w:ind w:left="1440" w:hanging="360"/>
+      </w:pPr>
+      <w:rPr>
+        <w:rFonts w:ascii="Courier New" w:hAnsi="Courier New" w:hint="default"/>
+        <w:sz w:val="20"/>
+      </w:rPr>
+    </w:lvl>
+    <w:lvl w:ilvl="2" w:tentative="1">
+      <w:start w:val="1"/>
+      <w:numFmt w:val="bullet"/>
+      <w:lvlText w:val=""/>
+      <w:lvlJc w:val="left"/>
+      <w:pPr>
+        <w:tabs>
+          <w:tab w:val="num" w:pos="2160"/>
+        </w:tabs>
+        <w:ind w:left="2160" w:hanging="360"/>
+      </w:pPr>
+      <w:rPr>
+        <w:rFonts w:ascii="Wingdings" w:hAnsi="Wingdings" w:hint="default"/>
+        <w:sz w:val="20"/>
+      </w:rPr>
+    </w:lvl>
+    <w:lvl w:ilvl="3" w:tentative="1">
+      <w:start w:val="1"/>
+      <w:numFmt w:val="bullet"/>
+      <w:lvlText w:val=""/>
+      <w:lvlJc w:val="left"/>
+      <w:pPr>
+        <w:tabs>
+          <w:tab w:val="num" w:pos="2880"/>
+        </w:tabs>
+        <w:ind w:left="2880" w:hanging="360"/>
+      </w:pPr>
+      <w:rPr>
+        <w:rFonts w:ascii="Wingdings" w:hAnsi="Wingdings" w:hint="default"/>
+        <w:sz w:val="20"/>
+      </w:rPr>
+    </w:lvl>
+    <w:lvl w:ilvl="4" w:tentative="1">
+      <w:start w:val="1"/>
+      <w:numFmt w:val="bullet"/>
+      <w:lvlText w:val=""/>
+      <w:lvlJc w:val="left"/>
+      <w:pPr>
+        <w:tabs>
+          <w:tab w:val="num" w:pos="3600"/>
+        </w:tabs>
+        <w:ind w:left="3600" w:hanging="360"/>
+      </w:pPr>
+      <w:rPr>
+        <w:rFonts w:ascii="Wingdings" w:hAnsi="Wingdings" w:hint="default"/>
+        <w:sz w:val="20"/>
+      </w:rPr>
+    </w:lvl>
+    <w:lvl w:ilvl="5" w:tentative="1">
+      <w:start w:val="1"/>
+      <w:numFmt w:val="bullet"/>
+      <w:lvlText w:val=""/>
+      <w:lvlJc w:val="left"/>
+      <w:pPr>
+        <w:tabs>
+          <w:tab w:val="num" w:pos="4320"/>
+        </w:tabs>
+        <w:ind w:left="4320" w:hanging="360"/>
+      </w:pPr>
+      <w:rPr>
+        <w:rFonts w:ascii="Wingdings" w:hAnsi="Wingdings" w:hint="default"/>
+        <w:sz w:val="20"/>
+      </w:rPr>
+    </w:lvl>
+    <w:lvl w:ilvl="6" w:tentative="1">
+      <w:start w:val="1"/>
+      <w:numFmt w:val="bullet"/>
+      <w:lvlText w:val=""/>
+      <w:lvlJc w:val="left"/>
+      <w:pPr>
+        <w:tabs>
+          <w:tab w:val="num" w:pos="5040"/>
+        </w:tabs>
+        <w:ind w:left="5040" w:hanging="360"/>
+      </w:pPr>
+      <w:rPr>
+        <w:rFonts w:ascii="Wingdings" w:hAnsi="Wingdings" w:hint="default"/>
+        <w:sz w:val="20"/>
+      </w:rPr>
+    </w:lvl>
+    <w:lvl w:ilvl="7" w:tentative="1">
+      <w:start w:val="1"/>
+      <w:numFmt w:val="bullet"/>
+      <w:lvlText w:val=""/>
+      <w:lvlJc w:val="left"/>
+      <w:pPr>
+        <w:tabs>
+          <w:tab w:val="num" w:pos="5760"/>
+        </w:tabs>
+        <w:ind w:left="5760" w:hanging="360"/>
+      </w:pPr>
+      <w:rPr>
+        <w:rFonts w:ascii="Wingdings" w:hAnsi="Wingdings" w:hint="default"/>
+        <w:sz w:val="20"/>
+      </w:rPr>
+    </w:lvl>
+    <w:lvl w:ilvl="8" w:tentative="1">
+      <w:start w:val="1"/>
+      <w:numFmt w:val="bullet"/>
+      <w:lvlText w:val=""/>
+      <w:lvlJc w:val="left"/>
+      <w:pPr>
+        <w:tabs>
+          <w:tab w:val="num" w:pos="6480"/>
+        </w:tabs>
+        <w:ind w:left="6480" w:hanging="360"/>
+      </w:pPr>
+      <w:rPr>
+        <w:rFonts w:ascii="Wingdings" w:hAnsi="Wingdings" w:hint="default"/>
+        <w:sz w:val="20"/>
+      </w:rPr>
+    </w:lvl>
+  </w:abstractNum>
+  <w:abstractNum w:abstractNumId="24" w15:restartNumberingAfterBreak="0">
+    <w:nsid w:val="490B7D64"/>
+    <w:multiLevelType w:val="multilevel"/>
+    <w:tmpl w:val="7C7281FE"/>
+    <w:lvl w:ilvl="0">
+      <w:start w:val="1"/>
+      <w:numFmt w:val="bullet"/>
+      <w:lvlText w:val=""/>
+      <w:lvlJc w:val="left"/>
+      <w:pPr>
+        <w:tabs>
+          <w:tab w:val="num" w:pos="720"/>
+        </w:tabs>
+        <w:ind w:left="720" w:hanging="360"/>
+      </w:pPr>
+      <w:rPr>
+        <w:rFonts w:ascii="Symbol" w:hAnsi="Symbol" w:hint="default"/>
+        <w:sz w:val="20"/>
+      </w:rPr>
+    </w:lvl>
+    <w:lvl w:ilvl="1" w:tentative="1">
+      <w:start w:val="1"/>
+      <w:numFmt w:val="bullet"/>
+      <w:lvlText w:val="o"/>
+      <w:lvlJc w:val="left"/>
+      <w:pPr>
+        <w:tabs>
+          <w:tab w:val="num" w:pos="1440"/>
+        </w:tabs>
+        <w:ind w:left="1440" w:hanging="360"/>
+      </w:pPr>
+      <w:rPr>
+        <w:rFonts w:ascii="Courier New" w:hAnsi="Courier New" w:hint="default"/>
+        <w:sz w:val="20"/>
+      </w:rPr>
+    </w:lvl>
+    <w:lvl w:ilvl="2" w:tentative="1">
+      <w:start w:val="1"/>
+      <w:numFmt w:val="bullet"/>
+      <w:lvlText w:val=""/>
+      <w:lvlJc w:val="left"/>
+      <w:pPr>
+        <w:tabs>
+          <w:tab w:val="num" w:pos="2160"/>
+        </w:tabs>
+        <w:ind w:left="2160" w:hanging="360"/>
+      </w:pPr>
+      <w:rPr>
+        <w:rFonts w:ascii="Wingdings" w:hAnsi="Wingdings" w:hint="default"/>
+        <w:sz w:val="20"/>
+      </w:rPr>
+    </w:lvl>
+    <w:lvl w:ilvl="3" w:tentative="1">
+      <w:start w:val="1"/>
+      <w:numFmt w:val="bullet"/>
+      <w:lvlText w:val=""/>
+      <w:lvlJc w:val="left"/>
+      <w:pPr>
+        <w:tabs>
+          <w:tab w:val="num" w:pos="2880"/>
+        </w:tabs>
+        <w:ind w:left="2880" w:hanging="360"/>
+      </w:pPr>
+      <w:rPr>
+        <w:rFonts w:ascii="Wingdings" w:hAnsi="Wingdings" w:hint="default"/>
+        <w:sz w:val="20"/>
+      </w:rPr>
+    </w:lvl>
+    <w:lvl w:ilvl="4" w:tentative="1">
+      <w:start w:val="1"/>
+      <w:numFmt w:val="bullet"/>
+      <w:lvlText w:val=""/>
+      <w:lvlJc w:val="left"/>
+      <w:pPr>
+        <w:tabs>
+          <w:tab w:val="num" w:pos="3600"/>
+        </w:tabs>
+        <w:ind w:left="3600" w:hanging="360"/>
+      </w:pPr>
+      <w:rPr>
+        <w:rFonts w:ascii="Wingdings" w:hAnsi="Wingdings" w:hint="default"/>
+        <w:sz w:val="20"/>
+      </w:rPr>
+    </w:lvl>
+    <w:lvl w:ilvl="5" w:tentative="1">
+      <w:start w:val="1"/>
+      <w:numFmt w:val="bullet"/>
+      <w:lvlText w:val=""/>
+      <w:lvlJc w:val="left"/>
+      <w:pPr>
+        <w:tabs>
+          <w:tab w:val="num" w:pos="4320"/>
+        </w:tabs>
+        <w:ind w:left="4320" w:hanging="360"/>
+      </w:pPr>
+      <w:rPr>
+        <w:rFonts w:ascii="Wingdings" w:hAnsi="Wingdings" w:hint="default"/>
+        <w:sz w:val="20"/>
+      </w:rPr>
+    </w:lvl>
+    <w:lvl w:ilvl="6" w:tentative="1">
+      <w:start w:val="1"/>
+      <w:numFmt w:val="bullet"/>
+      <w:lvlText w:val=""/>
+      <w:lvlJc w:val="left"/>
+      <w:pPr>
+        <w:tabs>
+          <w:tab w:val="num" w:pos="5040"/>
+        </w:tabs>
+        <w:ind w:left="5040" w:hanging="360"/>
+      </w:pPr>
+      <w:rPr>
+        <w:rFonts w:ascii="Wingdings" w:hAnsi="Wingdings" w:hint="default"/>
+        <w:sz w:val="20"/>
+      </w:rPr>
+    </w:lvl>
+    <w:lvl w:ilvl="7" w:tentative="1">
+      <w:start w:val="1"/>
+      <w:numFmt w:val="bullet"/>
+      <w:lvlText w:val=""/>
+      <w:lvlJc w:val="left"/>
+      <w:pPr>
+        <w:tabs>
+          <w:tab w:val="num" w:pos="5760"/>
+        </w:tabs>
+        <w:ind w:left="5760" w:hanging="360"/>
+      </w:pPr>
+      <w:rPr>
+        <w:rFonts w:ascii="Wingdings" w:hAnsi="Wingdings" w:hint="default"/>
+        <w:sz w:val="20"/>
+      </w:rPr>
+    </w:lvl>
+    <w:lvl w:ilvl="8" w:tentative="1">
+      <w:start w:val="1"/>
+      <w:numFmt w:val="bullet"/>
+      <w:lvlText w:val=""/>
+      <w:lvlJc w:val="left"/>
+      <w:pPr>
+        <w:tabs>
+          <w:tab w:val="num" w:pos="6480"/>
+        </w:tabs>
+        <w:ind w:left="6480" w:hanging="360"/>
+      </w:pPr>
+      <w:rPr>
+        <w:rFonts w:ascii="Wingdings" w:hAnsi="Wingdings" w:hint="default"/>
+        <w:sz w:val="20"/>
+      </w:rPr>
+    </w:lvl>
+  </w:abstractNum>
+  <w:abstractNum w:abstractNumId="25" w15:restartNumberingAfterBreak="0">
     <w:nsid w:val="5F9352D7"/>
     <w:multiLevelType w:val="multilevel"/>
     <w:tmpl w:val="7D46874E"/>
@@ -4178,7 +7962,7 @@
       </w:rPr>
     </w:lvl>
   </w:abstractNum>
-  <w:abstractNum w:abstractNumId="12" w15:restartNumberingAfterBreak="0">
+  <w:abstractNum w:abstractNumId="26" w15:restartNumberingAfterBreak="0">
     <w:nsid w:val="5FB1635F"/>
     <w:multiLevelType w:val="hybridMultilevel"/>
     <w:tmpl w:val="F8EC2D82"/>
@@ -4267,7 +8051,156 @@
       </w:pPr>
     </w:lvl>
   </w:abstractNum>
-  <w:abstractNum w:abstractNumId="13" w15:restartNumberingAfterBreak="0">
+  <w:abstractNum w:abstractNumId="27" w15:restartNumberingAfterBreak="0">
+    <w:nsid w:val="68C945C7"/>
+    <w:multiLevelType w:val="multilevel"/>
+    <w:tmpl w:val="2CC862B0"/>
+    <w:lvl w:ilvl="0">
+      <w:start w:val="1"/>
+      <w:numFmt w:val="bullet"/>
+      <w:lvlText w:val=""/>
+      <w:lvlJc w:val="left"/>
+      <w:pPr>
+        <w:tabs>
+          <w:tab w:val="num" w:pos="720"/>
+        </w:tabs>
+        <w:ind w:left="720" w:hanging="360"/>
+      </w:pPr>
+      <w:rPr>
+        <w:rFonts w:ascii="Symbol" w:hAnsi="Symbol" w:hint="default"/>
+        <w:sz w:val="20"/>
+      </w:rPr>
+    </w:lvl>
+    <w:lvl w:ilvl="1" w:tentative="1">
+      <w:start w:val="1"/>
+      <w:numFmt w:val="bullet"/>
+      <w:lvlText w:val="o"/>
+      <w:lvlJc w:val="left"/>
+      <w:pPr>
+        <w:tabs>
+          <w:tab w:val="num" w:pos="1440"/>
+        </w:tabs>
+        <w:ind w:left="1440" w:hanging="360"/>
+      </w:pPr>
+      <w:rPr>
+        <w:rFonts w:ascii="Courier New" w:hAnsi="Courier New" w:hint="default"/>
+        <w:sz w:val="20"/>
+      </w:rPr>
+    </w:lvl>
+    <w:lvl w:ilvl="2" w:tentative="1">
+      <w:start w:val="1"/>
+      <w:numFmt w:val="bullet"/>
+      <w:lvlText w:val=""/>
+      <w:lvlJc w:val="left"/>
+      <w:pPr>
+        <w:tabs>
+          <w:tab w:val="num" w:pos="2160"/>
+        </w:tabs>
+        <w:ind w:left="2160" w:hanging="360"/>
+      </w:pPr>
+      <w:rPr>
+        <w:rFonts w:ascii="Wingdings" w:hAnsi="Wingdings" w:hint="default"/>
+        <w:sz w:val="20"/>
+      </w:rPr>
+    </w:lvl>
+    <w:lvl w:ilvl="3" w:tentative="1">
+      <w:start w:val="1"/>
+      <w:numFmt w:val="bullet"/>
+      <w:lvlText w:val=""/>
+      <w:lvlJc w:val="left"/>
+      <w:pPr>
+        <w:tabs>
+          <w:tab w:val="num" w:pos="2880"/>
+        </w:tabs>
+        <w:ind w:left="2880" w:hanging="360"/>
+      </w:pPr>
+      <w:rPr>
+        <w:rFonts w:ascii="Wingdings" w:hAnsi="Wingdings" w:hint="default"/>
+        <w:sz w:val="20"/>
+      </w:rPr>
+    </w:lvl>
+    <w:lvl w:ilvl="4" w:tentative="1">
+      <w:start w:val="1"/>
+      <w:numFmt w:val="bullet"/>
+      <w:lvlText w:val=""/>
+      <w:lvlJc w:val="left"/>
+      <w:pPr>
+        <w:tabs>
+          <w:tab w:val="num" w:pos="3600"/>
+        </w:tabs>
+        <w:ind w:left="3600" w:hanging="360"/>
+      </w:pPr>
+      <w:rPr>
+        <w:rFonts w:ascii="Wingdings" w:hAnsi="Wingdings" w:hint="default"/>
+        <w:sz w:val="20"/>
+      </w:rPr>
+    </w:lvl>
+    <w:lvl w:ilvl="5" w:tentative="1">
+      <w:start w:val="1"/>
+      <w:numFmt w:val="bullet"/>
+      <w:lvlText w:val=""/>
+      <w:lvlJc w:val="left"/>
+      <w:pPr>
+        <w:tabs>
+          <w:tab w:val="num" w:pos="4320"/>
+        </w:tabs>
+        <w:ind w:left="4320" w:hanging="360"/>
+      </w:pPr>
+      <w:rPr>
+        <w:rFonts w:ascii="Wingdings" w:hAnsi="Wingdings" w:hint="default"/>
+        <w:sz w:val="20"/>
+      </w:rPr>
+    </w:lvl>
+    <w:lvl w:ilvl="6" w:tentative="1">
+      <w:start w:val="1"/>
+      <w:numFmt w:val="bullet"/>
+      <w:lvlText w:val=""/>
+      <w:lvlJc w:val="left"/>
+      <w:pPr>
+        <w:tabs>
+          <w:tab w:val="num" w:pos="5040"/>
+        </w:tabs>
+        <w:ind w:left="5040" w:hanging="360"/>
+      </w:pPr>
+      <w:rPr>
+        <w:rFonts w:ascii="Wingdings" w:hAnsi="Wingdings" w:hint="default"/>
+        <w:sz w:val="20"/>
+      </w:rPr>
+    </w:lvl>
+    <w:lvl w:ilvl="7" w:tentative="1">
+      <w:start w:val="1"/>
+      <w:numFmt w:val="bullet"/>
+      <w:lvlText w:val=""/>
+      <w:lvlJc w:val="left"/>
+      <w:pPr>
+        <w:tabs>
+          <w:tab w:val="num" w:pos="5760"/>
+        </w:tabs>
+        <w:ind w:left="5760" w:hanging="360"/>
+      </w:pPr>
+      <w:rPr>
+        <w:rFonts w:ascii="Wingdings" w:hAnsi="Wingdings" w:hint="default"/>
+        <w:sz w:val="20"/>
+      </w:rPr>
+    </w:lvl>
+    <w:lvl w:ilvl="8" w:tentative="1">
+      <w:start w:val="1"/>
+      <w:numFmt w:val="bullet"/>
+      <w:lvlText w:val=""/>
+      <w:lvlJc w:val="left"/>
+      <w:pPr>
+        <w:tabs>
+          <w:tab w:val="num" w:pos="6480"/>
+        </w:tabs>
+        <w:ind w:left="6480" w:hanging="360"/>
+      </w:pPr>
+      <w:rPr>
+        <w:rFonts w:ascii="Wingdings" w:hAnsi="Wingdings" w:hint="default"/>
+        <w:sz w:val="20"/>
+      </w:rPr>
+    </w:lvl>
+  </w:abstractNum>
+  <w:abstractNum w:abstractNumId="28" w15:restartNumberingAfterBreak="0">
     <w:nsid w:val="6B463D0B"/>
     <w:multiLevelType w:val="multilevel"/>
     <w:tmpl w:val="44304708"/>
@@ -4416,7 +8349,7 @@
       </w:rPr>
     </w:lvl>
   </w:abstractNum>
-  <w:abstractNum w:abstractNumId="14" w15:restartNumberingAfterBreak="0">
+  <w:abstractNum w:abstractNumId="29" w15:restartNumberingAfterBreak="0">
     <w:nsid w:val="6CC2122E"/>
     <w:multiLevelType w:val="multilevel"/>
     <w:tmpl w:val="5C68914C"/>
@@ -4565,92 +8498,745 @@
       </w:rPr>
     </w:lvl>
   </w:abstractNum>
+  <w:abstractNum w:abstractNumId="30" w15:restartNumberingAfterBreak="0">
+    <w:nsid w:val="72F0337C"/>
+    <w:multiLevelType w:val="multilevel"/>
+    <w:tmpl w:val="D212AE80"/>
+    <w:lvl w:ilvl="0">
+      <w:start w:val="1"/>
+      <w:numFmt w:val="bullet"/>
+      <w:lvlText w:val=""/>
+      <w:lvlJc w:val="left"/>
+      <w:pPr>
+        <w:tabs>
+          <w:tab w:val="num" w:pos="720"/>
+        </w:tabs>
+        <w:ind w:left="720" w:hanging="360"/>
+      </w:pPr>
+      <w:rPr>
+        <w:rFonts w:ascii="Symbol" w:hAnsi="Symbol" w:hint="default"/>
+        <w:sz w:val="20"/>
+      </w:rPr>
+    </w:lvl>
+    <w:lvl w:ilvl="1" w:tentative="1">
+      <w:start w:val="1"/>
+      <w:numFmt w:val="bullet"/>
+      <w:lvlText w:val="o"/>
+      <w:lvlJc w:val="left"/>
+      <w:pPr>
+        <w:tabs>
+          <w:tab w:val="num" w:pos="1440"/>
+        </w:tabs>
+        <w:ind w:left="1440" w:hanging="360"/>
+      </w:pPr>
+      <w:rPr>
+        <w:rFonts w:ascii="Courier New" w:hAnsi="Courier New" w:hint="default"/>
+        <w:sz w:val="20"/>
+      </w:rPr>
+    </w:lvl>
+    <w:lvl w:ilvl="2" w:tentative="1">
+      <w:start w:val="1"/>
+      <w:numFmt w:val="bullet"/>
+      <w:lvlText w:val=""/>
+      <w:lvlJc w:val="left"/>
+      <w:pPr>
+        <w:tabs>
+          <w:tab w:val="num" w:pos="2160"/>
+        </w:tabs>
+        <w:ind w:left="2160" w:hanging="360"/>
+      </w:pPr>
+      <w:rPr>
+        <w:rFonts w:ascii="Wingdings" w:hAnsi="Wingdings" w:hint="default"/>
+        <w:sz w:val="20"/>
+      </w:rPr>
+    </w:lvl>
+    <w:lvl w:ilvl="3" w:tentative="1">
+      <w:start w:val="1"/>
+      <w:numFmt w:val="bullet"/>
+      <w:lvlText w:val=""/>
+      <w:lvlJc w:val="left"/>
+      <w:pPr>
+        <w:tabs>
+          <w:tab w:val="num" w:pos="2880"/>
+        </w:tabs>
+        <w:ind w:left="2880" w:hanging="360"/>
+      </w:pPr>
+      <w:rPr>
+        <w:rFonts w:ascii="Wingdings" w:hAnsi="Wingdings" w:hint="default"/>
+        <w:sz w:val="20"/>
+      </w:rPr>
+    </w:lvl>
+    <w:lvl w:ilvl="4" w:tentative="1">
+      <w:start w:val="1"/>
+      <w:numFmt w:val="bullet"/>
+      <w:lvlText w:val=""/>
+      <w:lvlJc w:val="left"/>
+      <w:pPr>
+        <w:tabs>
+          <w:tab w:val="num" w:pos="3600"/>
+        </w:tabs>
+        <w:ind w:left="3600" w:hanging="360"/>
+      </w:pPr>
+      <w:rPr>
+        <w:rFonts w:ascii="Wingdings" w:hAnsi="Wingdings" w:hint="default"/>
+        <w:sz w:val="20"/>
+      </w:rPr>
+    </w:lvl>
+    <w:lvl w:ilvl="5" w:tentative="1">
+      <w:start w:val="1"/>
+      <w:numFmt w:val="bullet"/>
+      <w:lvlText w:val=""/>
+      <w:lvlJc w:val="left"/>
+      <w:pPr>
+        <w:tabs>
+          <w:tab w:val="num" w:pos="4320"/>
+        </w:tabs>
+        <w:ind w:left="4320" w:hanging="360"/>
+      </w:pPr>
+      <w:rPr>
+        <w:rFonts w:ascii="Wingdings" w:hAnsi="Wingdings" w:hint="default"/>
+        <w:sz w:val="20"/>
+      </w:rPr>
+    </w:lvl>
+    <w:lvl w:ilvl="6" w:tentative="1">
+      <w:start w:val="1"/>
+      <w:numFmt w:val="bullet"/>
+      <w:lvlText w:val=""/>
+      <w:lvlJc w:val="left"/>
+      <w:pPr>
+        <w:tabs>
+          <w:tab w:val="num" w:pos="5040"/>
+        </w:tabs>
+        <w:ind w:left="5040" w:hanging="360"/>
+      </w:pPr>
+      <w:rPr>
+        <w:rFonts w:ascii="Wingdings" w:hAnsi="Wingdings" w:hint="default"/>
+        <w:sz w:val="20"/>
+      </w:rPr>
+    </w:lvl>
+    <w:lvl w:ilvl="7" w:tentative="1">
+      <w:start w:val="1"/>
+      <w:numFmt w:val="bullet"/>
+      <w:lvlText w:val=""/>
+      <w:lvlJc w:val="left"/>
+      <w:pPr>
+        <w:tabs>
+          <w:tab w:val="num" w:pos="5760"/>
+        </w:tabs>
+        <w:ind w:left="5760" w:hanging="360"/>
+      </w:pPr>
+      <w:rPr>
+        <w:rFonts w:ascii="Wingdings" w:hAnsi="Wingdings" w:hint="default"/>
+        <w:sz w:val="20"/>
+      </w:rPr>
+    </w:lvl>
+    <w:lvl w:ilvl="8" w:tentative="1">
+      <w:start w:val="1"/>
+      <w:numFmt w:val="bullet"/>
+      <w:lvlText w:val=""/>
+      <w:lvlJc w:val="left"/>
+      <w:pPr>
+        <w:tabs>
+          <w:tab w:val="num" w:pos="6480"/>
+        </w:tabs>
+        <w:ind w:left="6480" w:hanging="360"/>
+      </w:pPr>
+      <w:rPr>
+        <w:rFonts w:ascii="Wingdings" w:hAnsi="Wingdings" w:hint="default"/>
+        <w:sz w:val="20"/>
+      </w:rPr>
+    </w:lvl>
+  </w:abstractNum>
+  <w:abstractNum w:abstractNumId="31" w15:restartNumberingAfterBreak="0">
+    <w:nsid w:val="74B92D15"/>
+    <w:multiLevelType w:val="multilevel"/>
+    <w:tmpl w:val="52308A80"/>
+    <w:lvl w:ilvl="0">
+      <w:start w:val="1"/>
+      <w:numFmt w:val="bullet"/>
+      <w:lvlText w:val=""/>
+      <w:lvlJc w:val="left"/>
+      <w:pPr>
+        <w:tabs>
+          <w:tab w:val="num" w:pos="720"/>
+        </w:tabs>
+        <w:ind w:left="720" w:hanging="360"/>
+      </w:pPr>
+      <w:rPr>
+        <w:rFonts w:ascii="Symbol" w:hAnsi="Symbol" w:hint="default"/>
+        <w:sz w:val="20"/>
+      </w:rPr>
+    </w:lvl>
+    <w:lvl w:ilvl="1" w:tentative="1">
+      <w:start w:val="1"/>
+      <w:numFmt w:val="bullet"/>
+      <w:lvlText w:val="o"/>
+      <w:lvlJc w:val="left"/>
+      <w:pPr>
+        <w:tabs>
+          <w:tab w:val="num" w:pos="1440"/>
+        </w:tabs>
+        <w:ind w:left="1440" w:hanging="360"/>
+      </w:pPr>
+      <w:rPr>
+        <w:rFonts w:ascii="Courier New" w:hAnsi="Courier New" w:hint="default"/>
+        <w:sz w:val="20"/>
+      </w:rPr>
+    </w:lvl>
+    <w:lvl w:ilvl="2" w:tentative="1">
+      <w:start w:val="1"/>
+      <w:numFmt w:val="bullet"/>
+      <w:lvlText w:val=""/>
+      <w:lvlJc w:val="left"/>
+      <w:pPr>
+        <w:tabs>
+          <w:tab w:val="num" w:pos="2160"/>
+        </w:tabs>
+        <w:ind w:left="2160" w:hanging="360"/>
+      </w:pPr>
+      <w:rPr>
+        <w:rFonts w:ascii="Wingdings" w:hAnsi="Wingdings" w:hint="default"/>
+        <w:sz w:val="20"/>
+      </w:rPr>
+    </w:lvl>
+    <w:lvl w:ilvl="3" w:tentative="1">
+      <w:start w:val="1"/>
+      <w:numFmt w:val="bullet"/>
+      <w:lvlText w:val=""/>
+      <w:lvlJc w:val="left"/>
+      <w:pPr>
+        <w:tabs>
+          <w:tab w:val="num" w:pos="2880"/>
+        </w:tabs>
+        <w:ind w:left="2880" w:hanging="360"/>
+      </w:pPr>
+      <w:rPr>
+        <w:rFonts w:ascii="Wingdings" w:hAnsi="Wingdings" w:hint="default"/>
+        <w:sz w:val="20"/>
+      </w:rPr>
+    </w:lvl>
+    <w:lvl w:ilvl="4" w:tentative="1">
+      <w:start w:val="1"/>
+      <w:numFmt w:val="bullet"/>
+      <w:lvlText w:val=""/>
+      <w:lvlJc w:val="left"/>
+      <w:pPr>
+        <w:tabs>
+          <w:tab w:val="num" w:pos="3600"/>
+        </w:tabs>
+        <w:ind w:left="3600" w:hanging="360"/>
+      </w:pPr>
+      <w:rPr>
+        <w:rFonts w:ascii="Wingdings" w:hAnsi="Wingdings" w:hint="default"/>
+        <w:sz w:val="20"/>
+      </w:rPr>
+    </w:lvl>
+    <w:lvl w:ilvl="5" w:tentative="1">
+      <w:start w:val="1"/>
+      <w:numFmt w:val="bullet"/>
+      <w:lvlText w:val=""/>
+      <w:lvlJc w:val="left"/>
+      <w:pPr>
+        <w:tabs>
+          <w:tab w:val="num" w:pos="4320"/>
+        </w:tabs>
+        <w:ind w:left="4320" w:hanging="360"/>
+      </w:pPr>
+      <w:rPr>
+        <w:rFonts w:ascii="Wingdings" w:hAnsi="Wingdings" w:hint="default"/>
+        <w:sz w:val="20"/>
+      </w:rPr>
+    </w:lvl>
+    <w:lvl w:ilvl="6" w:tentative="1">
+      <w:start w:val="1"/>
+      <w:numFmt w:val="bullet"/>
+      <w:lvlText w:val=""/>
+      <w:lvlJc w:val="left"/>
+      <w:pPr>
+        <w:tabs>
+          <w:tab w:val="num" w:pos="5040"/>
+        </w:tabs>
+        <w:ind w:left="5040" w:hanging="360"/>
+      </w:pPr>
+      <w:rPr>
+        <w:rFonts w:ascii="Wingdings" w:hAnsi="Wingdings" w:hint="default"/>
+        <w:sz w:val="20"/>
+      </w:rPr>
+    </w:lvl>
+    <w:lvl w:ilvl="7" w:tentative="1">
+      <w:start w:val="1"/>
+      <w:numFmt w:val="bullet"/>
+      <w:lvlText w:val=""/>
+      <w:lvlJc w:val="left"/>
+      <w:pPr>
+        <w:tabs>
+          <w:tab w:val="num" w:pos="5760"/>
+        </w:tabs>
+        <w:ind w:left="5760" w:hanging="360"/>
+      </w:pPr>
+      <w:rPr>
+        <w:rFonts w:ascii="Wingdings" w:hAnsi="Wingdings" w:hint="default"/>
+        <w:sz w:val="20"/>
+      </w:rPr>
+    </w:lvl>
+    <w:lvl w:ilvl="8" w:tentative="1">
+      <w:start w:val="1"/>
+      <w:numFmt w:val="bullet"/>
+      <w:lvlText w:val=""/>
+      <w:lvlJc w:val="left"/>
+      <w:pPr>
+        <w:tabs>
+          <w:tab w:val="num" w:pos="6480"/>
+        </w:tabs>
+        <w:ind w:left="6480" w:hanging="360"/>
+      </w:pPr>
+      <w:rPr>
+        <w:rFonts w:ascii="Wingdings" w:hAnsi="Wingdings" w:hint="default"/>
+        <w:sz w:val="20"/>
+      </w:rPr>
+    </w:lvl>
+  </w:abstractNum>
+  <w:abstractNum w:abstractNumId="32" w15:restartNumberingAfterBreak="0">
+    <w:nsid w:val="76736977"/>
+    <w:multiLevelType w:val="multilevel"/>
+    <w:tmpl w:val="748CC144"/>
+    <w:lvl w:ilvl="0">
+      <w:start w:val="1"/>
+      <w:numFmt w:val="bullet"/>
+      <w:lvlText w:val=""/>
+      <w:lvlJc w:val="left"/>
+      <w:pPr>
+        <w:tabs>
+          <w:tab w:val="num" w:pos="720"/>
+        </w:tabs>
+        <w:ind w:left="720" w:hanging="360"/>
+      </w:pPr>
+      <w:rPr>
+        <w:rFonts w:ascii="Symbol" w:hAnsi="Symbol" w:hint="default"/>
+        <w:sz w:val="20"/>
+      </w:rPr>
+    </w:lvl>
+    <w:lvl w:ilvl="1" w:tentative="1">
+      <w:start w:val="1"/>
+      <w:numFmt w:val="bullet"/>
+      <w:lvlText w:val="o"/>
+      <w:lvlJc w:val="left"/>
+      <w:pPr>
+        <w:tabs>
+          <w:tab w:val="num" w:pos="1440"/>
+        </w:tabs>
+        <w:ind w:left="1440" w:hanging="360"/>
+      </w:pPr>
+      <w:rPr>
+        <w:rFonts w:ascii="Courier New" w:hAnsi="Courier New" w:hint="default"/>
+        <w:sz w:val="20"/>
+      </w:rPr>
+    </w:lvl>
+    <w:lvl w:ilvl="2" w:tentative="1">
+      <w:start w:val="1"/>
+      <w:numFmt w:val="bullet"/>
+      <w:lvlText w:val=""/>
+      <w:lvlJc w:val="left"/>
+      <w:pPr>
+        <w:tabs>
+          <w:tab w:val="num" w:pos="2160"/>
+        </w:tabs>
+        <w:ind w:left="2160" w:hanging="360"/>
+      </w:pPr>
+      <w:rPr>
+        <w:rFonts w:ascii="Wingdings" w:hAnsi="Wingdings" w:hint="default"/>
+        <w:sz w:val="20"/>
+      </w:rPr>
+    </w:lvl>
+    <w:lvl w:ilvl="3" w:tentative="1">
+      <w:start w:val="1"/>
+      <w:numFmt w:val="bullet"/>
+      <w:lvlText w:val=""/>
+      <w:lvlJc w:val="left"/>
+      <w:pPr>
+        <w:tabs>
+          <w:tab w:val="num" w:pos="2880"/>
+        </w:tabs>
+        <w:ind w:left="2880" w:hanging="360"/>
+      </w:pPr>
+      <w:rPr>
+        <w:rFonts w:ascii="Wingdings" w:hAnsi="Wingdings" w:hint="default"/>
+        <w:sz w:val="20"/>
+      </w:rPr>
+    </w:lvl>
+    <w:lvl w:ilvl="4" w:tentative="1">
+      <w:start w:val="1"/>
+      <w:numFmt w:val="bullet"/>
+      <w:lvlText w:val=""/>
+      <w:lvlJc w:val="left"/>
+      <w:pPr>
+        <w:tabs>
+          <w:tab w:val="num" w:pos="3600"/>
+        </w:tabs>
+        <w:ind w:left="3600" w:hanging="360"/>
+      </w:pPr>
+      <w:rPr>
+        <w:rFonts w:ascii="Wingdings" w:hAnsi="Wingdings" w:hint="default"/>
+        <w:sz w:val="20"/>
+      </w:rPr>
+    </w:lvl>
+    <w:lvl w:ilvl="5" w:tentative="1">
+      <w:start w:val="1"/>
+      <w:numFmt w:val="bullet"/>
+      <w:lvlText w:val=""/>
+      <w:lvlJc w:val="left"/>
+      <w:pPr>
+        <w:tabs>
+          <w:tab w:val="num" w:pos="4320"/>
+        </w:tabs>
+        <w:ind w:left="4320" w:hanging="360"/>
+      </w:pPr>
+      <w:rPr>
+        <w:rFonts w:ascii="Wingdings" w:hAnsi="Wingdings" w:hint="default"/>
+        <w:sz w:val="20"/>
+      </w:rPr>
+    </w:lvl>
+    <w:lvl w:ilvl="6" w:tentative="1">
+      <w:start w:val="1"/>
+      <w:numFmt w:val="bullet"/>
+      <w:lvlText w:val=""/>
+      <w:lvlJc w:val="left"/>
+      <w:pPr>
+        <w:tabs>
+          <w:tab w:val="num" w:pos="5040"/>
+        </w:tabs>
+        <w:ind w:left="5040" w:hanging="360"/>
+      </w:pPr>
+      <w:rPr>
+        <w:rFonts w:ascii="Wingdings" w:hAnsi="Wingdings" w:hint="default"/>
+        <w:sz w:val="20"/>
+      </w:rPr>
+    </w:lvl>
+    <w:lvl w:ilvl="7" w:tentative="1">
+      <w:start w:val="1"/>
+      <w:numFmt w:val="bullet"/>
+      <w:lvlText w:val=""/>
+      <w:lvlJc w:val="left"/>
+      <w:pPr>
+        <w:tabs>
+          <w:tab w:val="num" w:pos="5760"/>
+        </w:tabs>
+        <w:ind w:left="5760" w:hanging="360"/>
+      </w:pPr>
+      <w:rPr>
+        <w:rFonts w:ascii="Wingdings" w:hAnsi="Wingdings" w:hint="default"/>
+        <w:sz w:val="20"/>
+      </w:rPr>
+    </w:lvl>
+    <w:lvl w:ilvl="8" w:tentative="1">
+      <w:start w:val="1"/>
+      <w:numFmt w:val="bullet"/>
+      <w:lvlText w:val=""/>
+      <w:lvlJc w:val="left"/>
+      <w:pPr>
+        <w:tabs>
+          <w:tab w:val="num" w:pos="6480"/>
+        </w:tabs>
+        <w:ind w:left="6480" w:hanging="360"/>
+      </w:pPr>
+      <w:rPr>
+        <w:rFonts w:ascii="Wingdings" w:hAnsi="Wingdings" w:hint="default"/>
+        <w:sz w:val="20"/>
+      </w:rPr>
+    </w:lvl>
+  </w:abstractNum>
+  <w:abstractNum w:abstractNumId="33" w15:restartNumberingAfterBreak="0">
+    <w:nsid w:val="7E5F527E"/>
+    <w:multiLevelType w:val="multilevel"/>
+    <w:tmpl w:val="FC143F5C"/>
+    <w:lvl w:ilvl="0">
+      <w:start w:val="1"/>
+      <w:numFmt w:val="bullet"/>
+      <w:lvlText w:val=""/>
+      <w:lvlJc w:val="left"/>
+      <w:pPr>
+        <w:tabs>
+          <w:tab w:val="num" w:pos="720"/>
+        </w:tabs>
+        <w:ind w:left="720" w:hanging="360"/>
+      </w:pPr>
+      <w:rPr>
+        <w:rFonts w:ascii="Symbol" w:hAnsi="Symbol" w:hint="default"/>
+        <w:sz w:val="20"/>
+      </w:rPr>
+    </w:lvl>
+    <w:lvl w:ilvl="1" w:tentative="1">
+      <w:start w:val="1"/>
+      <w:numFmt w:val="bullet"/>
+      <w:lvlText w:val="o"/>
+      <w:lvlJc w:val="left"/>
+      <w:pPr>
+        <w:tabs>
+          <w:tab w:val="num" w:pos="1440"/>
+        </w:tabs>
+        <w:ind w:left="1440" w:hanging="360"/>
+      </w:pPr>
+      <w:rPr>
+        <w:rFonts w:ascii="Courier New" w:hAnsi="Courier New" w:hint="default"/>
+        <w:sz w:val="20"/>
+      </w:rPr>
+    </w:lvl>
+    <w:lvl w:ilvl="2" w:tentative="1">
+      <w:start w:val="1"/>
+      <w:numFmt w:val="bullet"/>
+      <w:lvlText w:val=""/>
+      <w:lvlJc w:val="left"/>
+      <w:pPr>
+        <w:tabs>
+          <w:tab w:val="num" w:pos="2160"/>
+        </w:tabs>
+        <w:ind w:left="2160" w:hanging="360"/>
+      </w:pPr>
+      <w:rPr>
+        <w:rFonts w:ascii="Wingdings" w:hAnsi="Wingdings" w:hint="default"/>
+        <w:sz w:val="20"/>
+      </w:rPr>
+    </w:lvl>
+    <w:lvl w:ilvl="3" w:tentative="1">
+      <w:start w:val="1"/>
+      <w:numFmt w:val="bullet"/>
+      <w:lvlText w:val=""/>
+      <w:lvlJc w:val="left"/>
+      <w:pPr>
+        <w:tabs>
+          <w:tab w:val="num" w:pos="2880"/>
+        </w:tabs>
+        <w:ind w:left="2880" w:hanging="360"/>
+      </w:pPr>
+      <w:rPr>
+        <w:rFonts w:ascii="Wingdings" w:hAnsi="Wingdings" w:hint="default"/>
+        <w:sz w:val="20"/>
+      </w:rPr>
+    </w:lvl>
+    <w:lvl w:ilvl="4" w:tentative="1">
+      <w:start w:val="1"/>
+      <w:numFmt w:val="bullet"/>
+      <w:lvlText w:val=""/>
+      <w:lvlJc w:val="left"/>
+      <w:pPr>
+        <w:tabs>
+          <w:tab w:val="num" w:pos="3600"/>
+        </w:tabs>
+        <w:ind w:left="3600" w:hanging="360"/>
+      </w:pPr>
+      <w:rPr>
+        <w:rFonts w:ascii="Wingdings" w:hAnsi="Wingdings" w:hint="default"/>
+        <w:sz w:val="20"/>
+      </w:rPr>
+    </w:lvl>
+    <w:lvl w:ilvl="5" w:tentative="1">
+      <w:start w:val="1"/>
+      <w:numFmt w:val="bullet"/>
+      <w:lvlText w:val=""/>
+      <w:lvlJc w:val="left"/>
+      <w:pPr>
+        <w:tabs>
+          <w:tab w:val="num" w:pos="4320"/>
+        </w:tabs>
+        <w:ind w:left="4320" w:hanging="360"/>
+      </w:pPr>
+      <w:rPr>
+        <w:rFonts w:ascii="Wingdings" w:hAnsi="Wingdings" w:hint="default"/>
+        <w:sz w:val="20"/>
+      </w:rPr>
+    </w:lvl>
+    <w:lvl w:ilvl="6" w:tentative="1">
+      <w:start w:val="1"/>
+      <w:numFmt w:val="bullet"/>
+      <w:lvlText w:val=""/>
+      <w:lvlJc w:val="left"/>
+      <w:pPr>
+        <w:tabs>
+          <w:tab w:val="num" w:pos="5040"/>
+        </w:tabs>
+        <w:ind w:left="5040" w:hanging="360"/>
+      </w:pPr>
+      <w:rPr>
+        <w:rFonts w:ascii="Wingdings" w:hAnsi="Wingdings" w:hint="default"/>
+        <w:sz w:val="20"/>
+      </w:rPr>
+    </w:lvl>
+    <w:lvl w:ilvl="7" w:tentative="1">
+      <w:start w:val="1"/>
+      <w:numFmt w:val="bullet"/>
+      <w:lvlText w:val=""/>
+      <w:lvlJc w:val="left"/>
+      <w:pPr>
+        <w:tabs>
+          <w:tab w:val="num" w:pos="5760"/>
+        </w:tabs>
+        <w:ind w:left="5760" w:hanging="360"/>
+      </w:pPr>
+      <w:rPr>
+        <w:rFonts w:ascii="Wingdings" w:hAnsi="Wingdings" w:hint="default"/>
+        <w:sz w:val="20"/>
+      </w:rPr>
+    </w:lvl>
+    <w:lvl w:ilvl="8" w:tentative="1">
+      <w:start w:val="1"/>
+      <w:numFmt w:val="bullet"/>
+      <w:lvlText w:val=""/>
+      <w:lvlJc w:val="left"/>
+      <w:pPr>
+        <w:tabs>
+          <w:tab w:val="num" w:pos="6480"/>
+        </w:tabs>
+        <w:ind w:left="6480" w:hanging="360"/>
+      </w:pPr>
+      <w:rPr>
+        <w:rFonts w:ascii="Wingdings" w:hAnsi="Wingdings" w:hint="default"/>
+        <w:sz w:val="20"/>
+      </w:rPr>
+    </w:lvl>
+  </w:abstractNum>
   <w:num w:numId="1" w16cid:durableId="2057659798">
+    <w:abstractNumId w:val="20"/>
+  </w:num>
+  <w:num w:numId="2" w16cid:durableId="99107261">
+    <w:abstractNumId w:val="20"/>
+  </w:num>
+  <w:num w:numId="3" w16cid:durableId="454829576">
+    <w:abstractNumId w:val="20"/>
+  </w:num>
+  <w:num w:numId="4" w16cid:durableId="919875635">
+    <w:abstractNumId w:val="20"/>
+  </w:num>
+  <w:num w:numId="5" w16cid:durableId="1989245865">
+    <w:abstractNumId w:val="20"/>
+  </w:num>
+  <w:num w:numId="6" w16cid:durableId="337856889">
+    <w:abstractNumId w:val="20"/>
+  </w:num>
+  <w:num w:numId="7" w16cid:durableId="486750497">
+    <w:abstractNumId w:val="14"/>
+  </w:num>
+  <w:num w:numId="8" w16cid:durableId="1295481688">
+    <w:abstractNumId w:val="20"/>
+  </w:num>
+  <w:num w:numId="9" w16cid:durableId="878207473">
+    <w:abstractNumId w:val="20"/>
+  </w:num>
+  <w:num w:numId="10" w16cid:durableId="390271873">
+    <w:abstractNumId w:val="14"/>
+  </w:num>
+  <w:num w:numId="11" w16cid:durableId="108548336">
+    <w:abstractNumId w:val="20"/>
+  </w:num>
+  <w:num w:numId="12" w16cid:durableId="289626826">
+    <w:abstractNumId w:val="22"/>
+  </w:num>
+  <w:num w:numId="13" w16cid:durableId="709189428">
+    <w:abstractNumId w:val="26"/>
+  </w:num>
+  <w:num w:numId="14" w16cid:durableId="1828012820">
+    <w:abstractNumId w:val="20"/>
+  </w:num>
+  <w:num w:numId="15" w16cid:durableId="1472016058">
+    <w:abstractNumId w:val="20"/>
+  </w:num>
+  <w:num w:numId="16" w16cid:durableId="2007130954">
+    <w:abstractNumId w:val="20"/>
+  </w:num>
+  <w:num w:numId="17" w16cid:durableId="2124959910">
+    <w:abstractNumId w:val="20"/>
+  </w:num>
+  <w:num w:numId="18" w16cid:durableId="1161965983">
+    <w:abstractNumId w:val="20"/>
+  </w:num>
+  <w:num w:numId="19" w16cid:durableId="325284905">
     <w:abstractNumId w:val="9"/>
   </w:num>
-  <w:num w:numId="2" w16cid:durableId="99107261">
-    <w:abstractNumId w:val="9"/>
+  <w:num w:numId="20" w16cid:durableId="1339774263">
+    <w:abstractNumId w:val="3"/>
   </w:num>
-  <w:num w:numId="3" w16cid:durableId="454829576">
-    <w:abstractNumId w:val="9"/>
+  <w:num w:numId="21" w16cid:durableId="792559348">
+    <w:abstractNumId w:val="28"/>
   </w:num>
-  <w:num w:numId="4" w16cid:durableId="919875635">
-    <w:abstractNumId w:val="9"/>
+  <w:num w:numId="22" w16cid:durableId="1417169888">
+    <w:abstractNumId w:val="12"/>
   </w:num>
-  <w:num w:numId="5" w16cid:durableId="1989245865">
-    <w:abstractNumId w:val="9"/>
-  </w:num>
-  <w:num w:numId="6" w16cid:durableId="337856889">
-    <w:abstractNumId w:val="9"/>
-  </w:num>
-  <w:num w:numId="7" w16cid:durableId="486750497">
+  <w:num w:numId="23" w16cid:durableId="721709991">
     <w:abstractNumId w:val="5"/>
   </w:num>
-  <w:num w:numId="8" w16cid:durableId="1295481688">
-    <w:abstractNumId w:val="9"/>
+  <w:num w:numId="24" w16cid:durableId="280184368">
+    <w:abstractNumId w:val="17"/>
   </w:num>
-  <w:num w:numId="9" w16cid:durableId="878207473">
-    <w:abstractNumId w:val="9"/>
+  <w:num w:numId="25" w16cid:durableId="1423993270">
+    <w:abstractNumId w:val="29"/>
   </w:num>
-  <w:num w:numId="10" w16cid:durableId="390271873">
-    <w:abstractNumId w:val="5"/>
+  <w:num w:numId="26" w16cid:durableId="1285116924">
+    <w:abstractNumId w:val="15"/>
   </w:num>
-  <w:num w:numId="11" w16cid:durableId="108548336">
-    <w:abstractNumId w:val="9"/>
+  <w:num w:numId="27" w16cid:durableId="660275319">
+    <w:abstractNumId w:val="18"/>
   </w:num>
-  <w:num w:numId="12" w16cid:durableId="289626826">
+  <w:num w:numId="28" w16cid:durableId="1619872681">
+    <w:abstractNumId w:val="4"/>
+  </w:num>
+  <w:num w:numId="29" w16cid:durableId="814184426">
+    <w:abstractNumId w:val="25"/>
+  </w:num>
+  <w:num w:numId="30" w16cid:durableId="313527619">
+    <w:abstractNumId w:val="0"/>
+  </w:num>
+  <w:num w:numId="31" w16cid:durableId="84885100">
+    <w:abstractNumId w:val="32"/>
+  </w:num>
+  <w:num w:numId="32" w16cid:durableId="1665888621">
+    <w:abstractNumId w:val="31"/>
+  </w:num>
+  <w:num w:numId="33" w16cid:durableId="1337491407">
+    <w:abstractNumId w:val="11"/>
+  </w:num>
+  <w:num w:numId="34" w16cid:durableId="2070615399">
+    <w:abstractNumId w:val="30"/>
+  </w:num>
+  <w:num w:numId="35" w16cid:durableId="1229654126">
+    <w:abstractNumId w:val="24"/>
+  </w:num>
+  <w:num w:numId="36" w16cid:durableId="897941362">
+    <w:abstractNumId w:val="13"/>
+  </w:num>
+  <w:num w:numId="37" w16cid:durableId="1641958596">
+    <w:abstractNumId w:val="1"/>
+  </w:num>
+  <w:num w:numId="38" w16cid:durableId="1770276902">
+    <w:abstractNumId w:val="19"/>
+  </w:num>
+  <w:num w:numId="39" w16cid:durableId="943540558">
+    <w:abstractNumId w:val="2"/>
+  </w:num>
+  <w:num w:numId="40" w16cid:durableId="450824917">
+    <w:abstractNumId w:val="33"/>
+  </w:num>
+  <w:num w:numId="41" w16cid:durableId="1705670884">
+    <w:abstractNumId w:val="21"/>
+  </w:num>
+  <w:num w:numId="42" w16cid:durableId="299843862">
+    <w:abstractNumId w:val="8"/>
+  </w:num>
+  <w:num w:numId="43" w16cid:durableId="811405250">
     <w:abstractNumId w:val="10"/>
   </w:num>
-  <w:num w:numId="13" w16cid:durableId="709189428">
-    <w:abstractNumId w:val="12"/>
+  <w:num w:numId="44" w16cid:durableId="1630240630">
+    <w:abstractNumId w:val="23"/>
   </w:num>
-  <w:num w:numId="14" w16cid:durableId="1828012820">
-    <w:abstractNumId w:val="9"/>
+  <w:num w:numId="45" w16cid:durableId="1672903792">
+    <w:abstractNumId w:val="6"/>
   </w:num>
-  <w:num w:numId="15" w16cid:durableId="1472016058">
-    <w:abstractNumId w:val="9"/>
-  </w:num>
-  <w:num w:numId="16" w16cid:durableId="2007130954">
-    <w:abstractNumId w:val="9"/>
-  </w:num>
-  <w:num w:numId="17" w16cid:durableId="2124959910">
-    <w:abstractNumId w:val="9"/>
-  </w:num>
-  <w:num w:numId="18" w16cid:durableId="1161965983">
-    <w:abstractNumId w:val="9"/>
-  </w:num>
-  <w:num w:numId="19" w16cid:durableId="325284905">
-    <w:abstractNumId w:val="3"/>
-  </w:num>
-  <w:num w:numId="20" w16cid:durableId="1339774263">
-    <w:abstractNumId w:val="0"/>
-  </w:num>
-  <w:num w:numId="21" w16cid:durableId="792559348">
-    <w:abstractNumId w:val="13"/>
-  </w:num>
-  <w:num w:numId="22" w16cid:durableId="1417169888">
-    <w:abstractNumId w:val="4"/>
-  </w:num>
-  <w:num w:numId="23" w16cid:durableId="721709991">
-    <w:abstractNumId w:val="2"/>
-  </w:num>
-  <w:num w:numId="24" w16cid:durableId="280184368">
+  <w:num w:numId="46" w16cid:durableId="2084061145">
     <w:abstractNumId w:val="7"/>
   </w:num>
-  <w:num w:numId="25" w16cid:durableId="1423993270">
-    <w:abstractNumId w:val="14"/>
+  <w:num w:numId="47" w16cid:durableId="727460145">
+    <w:abstractNumId w:val="16"/>
   </w:num>
-  <w:num w:numId="26" w16cid:durableId="1285116924">
-    <w:abstractNumId w:val="6"/>
-  </w:num>
-  <w:num w:numId="27" w16cid:durableId="660275319">
-    <w:abstractNumId w:val="8"/>
-  </w:num>
-  <w:num w:numId="28" w16cid:durableId="1619872681">
-    <w:abstractNumId w:val="1"/>
-  </w:num>
-  <w:num w:numId="29" w16cid:durableId="814184426">
-    <w:abstractNumId w:val="11"/>
+  <w:num w:numId="48" w16cid:durableId="1128547572">
+    <w:abstractNumId w:val="27"/>
   </w:num>
 </w:numbering>
 </file>

</xml_diff>

<commit_message>
Revising first module of Tennsorflow course
</commit_message>
<xml_diff>
--- a/10_Deep_Learning_with_Keras_and_Tensorflow/2_Notes/1_Deep_Learning_with_Keras_and_Tensorflow_Notes.docx
+++ b/10_Deep_Learning_with_Keras_and_Tensorflow/2_Notes/1_Deep_Learning_with_Keras_and_Tensorflow_Notes.docx
@@ -5901,6 +5901,1061 @@
         <w:t>Understanding these features and capabilities helps us build and deploy machine learning models more effectively, whether we are working on research, prototyping, or production applications.</w:t>
       </w:r>
     </w:p>
+    <w:p>
+      <w:pPr>
+        <w:pStyle w:val="Heading1"/>
+        <w:rPr>
+          <w:rFonts w:ascii="Times New Roman" w:hAnsi="Times New Roman"/>
+        </w:rPr>
+      </w:pPr>
+      <w:r>
+        <w:t>Summary and Highlights: Advanced Keras Functionalities</w:t>
+      </w:r>
+    </w:p>
+    <w:p>
+      <w:pPr>
+        <w:pStyle w:val="Heading2"/>
+      </w:pPr>
+      <w:r>
+        <w:t>Keras</w:t>
+      </w:r>
+    </w:p>
+    <w:p>
+      <w:pPr>
+        <w:pStyle w:val="NormalWeb"/>
+        <w:numPr>
+          <w:ilvl w:val="0"/>
+          <w:numId w:val="65"/>
+        </w:numPr>
+      </w:pPr>
+      <w:r>
+        <w:t>Keras is a high-level neural network API written in Python and capable of running on top of TensorFlow, Theano, and CNTK.</w:t>
+      </w:r>
+    </w:p>
+    <w:p>
+      <w:pPr>
+        <w:pStyle w:val="NormalWeb"/>
+        <w:numPr>
+          <w:ilvl w:val="0"/>
+          <w:numId w:val="65"/>
+        </w:numPr>
+      </w:pPr>
+      <w:r>
+        <w:t>Keras is widely used in industry and academia for various applications, from image and speech recognition to recommendation systems and natural language processing.</w:t>
+      </w:r>
+    </w:p>
+    <w:p>
+      <w:pPr>
+        <w:pStyle w:val="Heading2"/>
+      </w:pPr>
+      <w:r>
+        <w:t>Keras Functional API</w:t>
+      </w:r>
+    </w:p>
+    <w:p>
+      <w:pPr>
+        <w:pStyle w:val="NormalWeb"/>
+        <w:numPr>
+          <w:ilvl w:val="0"/>
+          <w:numId w:val="66"/>
+        </w:numPr>
+      </w:pPr>
+      <w:r>
+        <w:t>Keras Functional API offers advantages like flexibility, clarity, and reusability.</w:t>
+      </w:r>
+    </w:p>
+    <w:p>
+      <w:pPr>
+        <w:pStyle w:val="NormalWeb"/>
+        <w:numPr>
+          <w:ilvl w:val="0"/>
+          <w:numId w:val="66"/>
+        </w:numPr>
+      </w:pPr>
+      <w:r>
+        <w:t>We can use Keras Functional API to develop models in diverse fields such as healthcare, finance, and autonomous driving.</w:t>
+      </w:r>
+    </w:p>
+    <w:p>
+      <w:pPr>
+        <w:pStyle w:val="NormalWeb"/>
+        <w:numPr>
+          <w:ilvl w:val="0"/>
+          <w:numId w:val="66"/>
+        </w:numPr>
+      </w:pPr>
+      <w:r>
+        <w:t>Keras Functional API enables us to define layers and connect them in a graph of layers.</w:t>
+      </w:r>
+    </w:p>
+    <w:p>
+      <w:pPr>
+        <w:pStyle w:val="NormalWeb"/>
+        <w:numPr>
+          <w:ilvl w:val="0"/>
+          <w:numId w:val="66"/>
+        </w:numPr>
+      </w:pPr>
+      <w:r>
+        <w:t>The Functional API can handle models with multiple inputs and outputs.</w:t>
+      </w:r>
+    </w:p>
+    <w:p>
+      <w:pPr>
+        <w:pStyle w:val="NormalWeb"/>
+        <w:numPr>
+          <w:ilvl w:val="0"/>
+          <w:numId w:val="66"/>
+        </w:numPr>
+      </w:pPr>
+      <w:r>
+        <w:t>Another powerful feature of the Functional API is shared layers, which are helpful when we want to apply the same transformation to multiple inputs.</w:t>
+      </w:r>
+    </w:p>
+    <w:p>
+      <w:pPr>
+        <w:pStyle w:val="Heading2"/>
+      </w:pPr>
+      <w:r>
+        <w:t>Custom Layers in Keras</w:t>
+      </w:r>
+    </w:p>
+    <w:p>
+      <w:pPr>
+        <w:pStyle w:val="NormalWeb"/>
+        <w:numPr>
+          <w:ilvl w:val="0"/>
+          <w:numId w:val="67"/>
+        </w:numPr>
+      </w:pPr>
+      <w:r>
+        <w:t>Creating custom layers in Keras allows us to tailor our models to specific needs, implement novel research ideas, and optimize performance for unique tasks.</w:t>
+      </w:r>
+    </w:p>
+    <w:p>
+      <w:pPr>
+        <w:pStyle w:val="NormalWeb"/>
+        <w:numPr>
+          <w:ilvl w:val="0"/>
+          <w:numId w:val="67"/>
+        </w:numPr>
+      </w:pPr>
+      <w:r>
+        <w:t>By practicing and experimenting with custom layers, we’ll better understand how neural networks work and enhance our innovation ability.</w:t>
+      </w:r>
+    </w:p>
+    <w:p>
+      <w:pPr>
+        <w:pStyle w:val="Heading2"/>
+      </w:pPr>
+      <w:r>
+        <w:lastRenderedPageBreak/>
+        <w:t>TensorFlow 2.x</w:t>
+      </w:r>
+    </w:p>
+    <w:p>
+      <w:pPr>
+        <w:pStyle w:val="NormalWeb"/>
+      </w:pPr>
+      <w:r>
+        <w:t>TensorFlow 2.x is a powerful and flexible platform for machine learning with features such as:</w:t>
+      </w:r>
+    </w:p>
+    <w:p>
+      <w:pPr>
+        <w:pStyle w:val="NormalWeb"/>
+        <w:numPr>
+          <w:ilvl w:val="0"/>
+          <w:numId w:val="68"/>
+        </w:numPr>
+      </w:pPr>
+      <w:r>
+        <w:t>Eager execution</w:t>
+      </w:r>
+    </w:p>
+    <w:p>
+      <w:pPr>
+        <w:pStyle w:val="NormalWeb"/>
+        <w:numPr>
+          <w:ilvl w:val="0"/>
+          <w:numId w:val="68"/>
+        </w:numPr>
+      </w:pPr>
+      <w:r>
+        <w:t>High-level APIs</w:t>
+      </w:r>
+    </w:p>
+    <w:p>
+      <w:pPr>
+        <w:pStyle w:val="NormalWeb"/>
+        <w:numPr>
+          <w:ilvl w:val="0"/>
+          <w:numId w:val="68"/>
+        </w:numPr>
+      </w:pPr>
+      <w:r>
+        <w:t>A rich ecosystem of tools</w:t>
+      </w:r>
+    </w:p>
+    <w:p>
+      <w:pPr>
+        <w:pStyle w:val="NormalWeb"/>
+      </w:pPr>
+      <w:r>
+        <w:t>Understanding these features and capabilities will help us build and deploy machine learning models more effectively, whether we are working on research, prototyping, or production applications.</w:t>
+      </w:r>
+    </w:p>
+    <w:p>
+      <w:pPr>
+        <w:pStyle w:val="Heading1"/>
+        <w:rPr>
+          <w:rFonts w:ascii="Times New Roman" w:hAnsi="Times New Roman"/>
+        </w:rPr>
+      </w:pPr>
+      <w:r>
+        <w:t>Glossary: Advanced Keras Functional API</w:t>
+      </w:r>
+    </w:p>
+    <w:p>
+      <w:pPr>
+        <w:pStyle w:val="Heading2"/>
+      </w:pPr>
+      <w:r>
+        <w:t>Overview</w:t>
+      </w:r>
+    </w:p>
+    <w:p>
+      <w:pPr>
+        <w:pStyle w:val="NormalWeb"/>
+      </w:pPr>
+      <w:r>
+        <w:t>This comprehensive glossary also includes additional industry-recognized terms</w:t>
+      </w:r>
+      <w:r>
+        <w:t xml:space="preserve">. </w:t>
+      </w:r>
+      <w:r>
+        <w:t>These terms are important for you to recognize when working in the industry</w:t>
+      </w:r>
+      <w:r>
+        <w:t xml:space="preserve"> and </w:t>
+      </w:r>
+      <w:r>
+        <w:t>participating in user groups.</w:t>
+      </w:r>
+    </w:p>
+    <w:p>
+      <w:pPr>
+        <w:pStyle w:val="Heading2"/>
+      </w:pPr>
+      <w:r>
+        <w:t>Glossary</w:t>
+      </w:r>
+    </w:p>
+    <w:tbl>
+      <w:tblPr>
+        <w:tblStyle w:val="GridTable1Light"/>
+        <w:tblW w:w="9025" w:type="dxa"/>
+        <w:tblLook w:val="04A0" w:firstRow="1" w:lastRow="0" w:firstColumn="1" w:lastColumn="0" w:noHBand="0" w:noVBand="1"/>
+      </w:tblPr>
+      <w:tblGrid>
+        <w:gridCol w:w="2035"/>
+        <w:gridCol w:w="6990"/>
+      </w:tblGrid>
+      <w:tr>
+        <w:trPr>
+          <w:cnfStyle w:val="100000000000" w:firstRow="1" w:lastRow="0" w:firstColumn="0" w:lastColumn="0" w:oddVBand="0" w:evenVBand="0" w:oddHBand="0" w:evenHBand="0" w:firstRowFirstColumn="0" w:firstRowLastColumn="0" w:lastRowFirstColumn="0" w:lastRowLastColumn="0"/>
+          <w:trHeight w:val="344"/>
+        </w:trPr>
+        <w:tc>
+          <w:tcPr>
+            <w:cnfStyle w:val="001000000000" w:firstRow="0" w:lastRow="0" w:firstColumn="1" w:lastColumn="0" w:oddVBand="0" w:evenVBand="0" w:oddHBand="0" w:evenHBand="0" w:firstRowFirstColumn="0" w:firstRowLastColumn="0" w:lastRowFirstColumn="0" w:lastRowLastColumn="0"/>
+            <w:tcW w:w="0" w:type="auto"/>
+            <w:hideMark/>
+          </w:tcPr>
+          <w:p>
+            <w:pPr>
+              <w:jc w:val="center"/>
+            </w:pPr>
+            <w:r>
+              <w:t>Term</w:t>
+            </w:r>
+          </w:p>
+        </w:tc>
+        <w:tc>
+          <w:tcPr>
+            <w:tcW w:w="0" w:type="auto"/>
+            <w:hideMark/>
+          </w:tcPr>
+          <w:p>
+            <w:pPr>
+              <w:jc w:val="center"/>
+              <w:cnfStyle w:val="100000000000" w:firstRow="1" w:lastRow="0" w:firstColumn="0" w:lastColumn="0" w:oddVBand="0" w:evenVBand="0" w:oddHBand="0" w:evenHBand="0" w:firstRowFirstColumn="0" w:firstRowLastColumn="0" w:lastRowFirstColumn="0" w:lastRowLastColumn="0"/>
+            </w:pPr>
+            <w:r>
+              <w:t>Definition</w:t>
+            </w:r>
+          </w:p>
+        </w:tc>
+      </w:tr>
+      <w:tr>
+        <w:trPr>
+          <w:trHeight w:val="703"/>
+        </w:trPr>
+        <w:tc>
+          <w:tcPr>
+            <w:cnfStyle w:val="001000000000" w:firstRow="0" w:lastRow="0" w:firstColumn="1" w:lastColumn="0" w:oddVBand="0" w:evenVBand="0" w:oddHBand="0" w:evenHBand="0" w:firstRowFirstColumn="0" w:firstRowLastColumn="0" w:lastRowFirstColumn="0" w:lastRowLastColumn="0"/>
+            <w:tcW w:w="0" w:type="auto"/>
+            <w:hideMark/>
+          </w:tcPr>
+          <w:p>
+            <w:pPr>
+              <w:rPr>
+                <w:b w:val="0"/>
+                <w:bCs w:val="0"/>
+              </w:rPr>
+            </w:pPr>
+            <w:r>
+              <w:rPr>
+                <w:rStyle w:val="Strong"/>
+                <w:b/>
+                <w:bCs/>
+              </w:rPr>
+              <w:t>Build</w:t>
+            </w:r>
+          </w:p>
+        </w:tc>
+        <w:tc>
+          <w:tcPr>
+            <w:tcW w:w="0" w:type="auto"/>
+            <w:hideMark/>
+          </w:tcPr>
+          <w:p>
+            <w:pPr>
+              <w:cnfStyle w:val="000000000000" w:firstRow="0" w:lastRow="0" w:firstColumn="0" w:lastColumn="0" w:oddVBand="0" w:evenVBand="0" w:oddHBand="0" w:evenHBand="0" w:firstRowFirstColumn="0" w:firstRowLastColumn="0" w:lastRowFirstColumn="0" w:lastRowLastColumn="0"/>
+            </w:pPr>
+            <w:r>
+              <w:t>A method that creates the layer's weights, called once during the first invocation of the layer.</w:t>
+            </w:r>
+          </w:p>
+        </w:tc>
+      </w:tr>
+      <w:tr>
+        <w:trPr>
+          <w:trHeight w:val="358"/>
+        </w:trPr>
+        <w:tc>
+          <w:tcPr>
+            <w:cnfStyle w:val="001000000000" w:firstRow="0" w:lastRow="0" w:firstColumn="1" w:lastColumn="0" w:oddVBand="0" w:evenVBand="0" w:oddHBand="0" w:evenHBand="0" w:firstRowFirstColumn="0" w:firstRowLastColumn="0" w:lastRowFirstColumn="0" w:lastRowLastColumn="0"/>
+            <w:tcW w:w="0" w:type="auto"/>
+            <w:hideMark/>
+          </w:tcPr>
+          <w:p>
+            <w:pPr>
+              <w:rPr>
+                <w:b w:val="0"/>
+                <w:bCs w:val="0"/>
+              </w:rPr>
+            </w:pPr>
+            <w:r>
+              <w:rPr>
+                <w:rStyle w:val="Strong"/>
+                <w:b/>
+                <w:bCs/>
+              </w:rPr>
+              <w:t>Call</w:t>
+            </w:r>
+          </w:p>
+        </w:tc>
+        <w:tc>
+          <w:tcPr>
+            <w:tcW w:w="0" w:type="auto"/>
+            <w:hideMark/>
+          </w:tcPr>
+          <w:p>
+            <w:pPr>
+              <w:cnfStyle w:val="000000000000" w:firstRow="0" w:lastRow="0" w:firstColumn="0" w:lastColumn="0" w:oddVBand="0" w:evenVBand="0" w:oddHBand="0" w:evenHBand="0" w:firstRowFirstColumn="0" w:firstRowLastColumn="0" w:lastRowFirstColumn="0" w:lastRowLastColumn="0"/>
+            </w:pPr>
+            <w:r>
+              <w:t>A method that defines the forward pass logic of the layer.</w:t>
+            </w:r>
+          </w:p>
+        </w:tc>
+      </w:tr>
+      <w:tr>
+        <w:trPr>
+          <w:trHeight w:val="1048"/>
+        </w:trPr>
+        <w:tc>
+          <w:tcPr>
+            <w:cnfStyle w:val="001000000000" w:firstRow="0" w:lastRow="0" w:firstColumn="1" w:lastColumn="0" w:oddVBand="0" w:evenVBand="0" w:oddHBand="0" w:evenHBand="0" w:firstRowFirstColumn="0" w:firstRowLastColumn="0" w:lastRowFirstColumn="0" w:lastRowLastColumn="0"/>
+            <w:tcW w:w="0" w:type="auto"/>
+            <w:hideMark/>
+          </w:tcPr>
+          <w:p>
+            <w:pPr>
+              <w:rPr>
+                <w:b w:val="0"/>
+                <w:bCs w:val="0"/>
+              </w:rPr>
+            </w:pPr>
+            <w:r>
+              <w:rPr>
+                <w:rStyle w:val="Strong"/>
+                <w:b/>
+                <w:bCs/>
+              </w:rPr>
+              <w:t>Custom layer</w:t>
+            </w:r>
+          </w:p>
+        </w:tc>
+        <w:tc>
+          <w:tcPr>
+            <w:tcW w:w="0" w:type="auto"/>
+            <w:hideMark/>
+          </w:tcPr>
+          <w:p>
+            <w:pPr>
+              <w:cnfStyle w:val="000000000000" w:firstRow="0" w:lastRow="0" w:firstColumn="0" w:lastColumn="0" w:oddVBand="0" w:evenVBand="0" w:oddHBand="0" w:evenHBand="0" w:firstRowFirstColumn="0" w:firstRowLastColumn="0" w:lastRowFirstColumn="0" w:lastRowLastColumn="0"/>
+            </w:pPr>
+            <w:r>
+              <w:t>A user-defined layer that allows customization of operations in a neural network, providing flexibility for specific tasks and experimentation.</w:t>
+            </w:r>
+          </w:p>
+        </w:tc>
+      </w:tr>
+      <w:tr>
+        <w:trPr>
+          <w:trHeight w:val="703"/>
+        </w:trPr>
+        <w:tc>
+          <w:tcPr>
+            <w:cnfStyle w:val="001000000000" w:firstRow="0" w:lastRow="0" w:firstColumn="1" w:lastColumn="0" w:oddVBand="0" w:evenVBand="0" w:oddHBand="0" w:evenHBand="0" w:firstRowFirstColumn="0" w:firstRowLastColumn="0" w:lastRowFirstColumn="0" w:lastRowLastColumn="0"/>
+            <w:tcW w:w="0" w:type="auto"/>
+            <w:hideMark/>
+          </w:tcPr>
+          <w:p>
+            <w:pPr>
+              <w:rPr>
+                <w:b w:val="0"/>
+                <w:bCs w:val="0"/>
+              </w:rPr>
+            </w:pPr>
+            <w:r>
+              <w:rPr>
+                <w:rStyle w:val="Strong"/>
+                <w:b/>
+                <w:bCs/>
+              </w:rPr>
+              <w:t>Eager execution</w:t>
+            </w:r>
+          </w:p>
+        </w:tc>
+        <w:tc>
+          <w:tcPr>
+            <w:tcW w:w="0" w:type="auto"/>
+            <w:hideMark/>
+          </w:tcPr>
+          <w:p>
+            <w:pPr>
+              <w:cnfStyle w:val="000000000000" w:firstRow="0" w:lastRow="0" w:firstColumn="0" w:lastColumn="0" w:oddVBand="0" w:evenVBand="0" w:oddHBand="0" w:evenHBand="0" w:firstRowFirstColumn="0" w:firstRowLastColumn="0" w:lastRowFirstColumn="0" w:lastRowLastColumn="0"/>
+            </w:pPr>
+            <w:r>
+              <w:t>A TensorFlow feature that executes operations immediately, making it more intuitive and useful for debugging and interactive programming.</w:t>
+            </w:r>
+          </w:p>
+        </w:tc>
+      </w:tr>
+      <w:tr>
+        <w:trPr>
+          <w:trHeight w:val="344"/>
+        </w:trPr>
+        <w:tc>
+          <w:tcPr>
+            <w:cnfStyle w:val="001000000000" w:firstRow="0" w:lastRow="0" w:firstColumn="1" w:lastColumn="0" w:oddVBand="0" w:evenVBand="0" w:oddHBand="0" w:evenHBand="0" w:firstRowFirstColumn="0" w:firstRowLastColumn="0" w:lastRowFirstColumn="0" w:lastRowLastColumn="0"/>
+            <w:tcW w:w="0" w:type="auto"/>
+            <w:hideMark/>
+          </w:tcPr>
+          <w:p>
+            <w:pPr>
+              <w:rPr>
+                <w:b w:val="0"/>
+                <w:bCs w:val="0"/>
+              </w:rPr>
+            </w:pPr>
+            <w:r>
+              <w:rPr>
+                <w:rStyle w:val="Strong"/>
+                <w:b/>
+                <w:bCs/>
+              </w:rPr>
+              <w:t>Init</w:t>
+            </w:r>
+          </w:p>
+        </w:tc>
+        <w:tc>
+          <w:tcPr>
+            <w:tcW w:w="0" w:type="auto"/>
+            <w:hideMark/>
+          </w:tcPr>
+          <w:p>
+            <w:pPr>
+              <w:cnfStyle w:val="000000000000" w:firstRow="0" w:lastRow="0" w:firstColumn="0" w:lastColumn="0" w:oddVBand="0" w:evenVBand="0" w:oddHBand="0" w:evenHBand="0" w:firstRowFirstColumn="0" w:firstRowLastColumn="0" w:lastRowFirstColumn="0" w:lastRowLastColumn="0"/>
+            </w:pPr>
+            <w:r>
+              <w:t>A method that initializes the layer's attributes.</w:t>
+            </w:r>
+          </w:p>
+        </w:tc>
+      </w:tr>
+      <w:tr>
+        <w:trPr>
+          <w:trHeight w:val="358"/>
+        </w:trPr>
+        <w:tc>
+          <w:tcPr>
+            <w:cnfStyle w:val="001000000000" w:firstRow="0" w:lastRow="0" w:firstColumn="1" w:lastColumn="0" w:oddVBand="0" w:evenVBand="0" w:oddHBand="0" w:evenHBand="0" w:firstRowFirstColumn="0" w:firstRowLastColumn="0" w:lastRowFirstColumn="0" w:lastRowLastColumn="0"/>
+            <w:tcW w:w="0" w:type="auto"/>
+            <w:hideMark/>
+          </w:tcPr>
+          <w:p>
+            <w:pPr>
+              <w:rPr>
+                <w:b w:val="0"/>
+                <w:bCs w:val="0"/>
+              </w:rPr>
+            </w:pPr>
+            <w:r>
+              <w:rPr>
+                <w:rStyle w:val="Strong"/>
+                <w:b/>
+                <w:bCs/>
+              </w:rPr>
+              <w:t>Input layer</w:t>
+            </w:r>
+          </w:p>
+        </w:tc>
+        <w:tc>
+          <w:tcPr>
+            <w:tcW w:w="0" w:type="auto"/>
+            <w:hideMark/>
+          </w:tcPr>
+          <w:p>
+            <w:pPr>
+              <w:cnfStyle w:val="000000000000" w:firstRow="0" w:lastRow="0" w:firstColumn="0" w:lastColumn="0" w:oddVBand="0" w:evenVBand="0" w:oddHBand="0" w:evenHBand="0" w:firstRowFirstColumn="0" w:firstRowLastColumn="0" w:lastRowFirstColumn="0" w:lastRowLastColumn="0"/>
+            </w:pPr>
+            <w:r>
+              <w:t>The first layer in a model that defines the input shape.</w:t>
+            </w:r>
+          </w:p>
+        </w:tc>
+      </w:tr>
+      <w:tr>
+        <w:trPr>
+          <w:trHeight w:val="691"/>
+        </w:trPr>
+        <w:tc>
+          <w:tcPr>
+            <w:cnfStyle w:val="001000000000" w:firstRow="0" w:lastRow="0" w:firstColumn="1" w:lastColumn="0" w:oddVBand="0" w:evenVBand="0" w:oddHBand="0" w:evenHBand="0" w:firstRowFirstColumn="0" w:firstRowLastColumn="0" w:lastRowFirstColumn="0" w:lastRowLastColumn="0"/>
+            <w:tcW w:w="0" w:type="auto"/>
+            <w:hideMark/>
+          </w:tcPr>
+          <w:p>
+            <w:pPr>
+              <w:rPr>
+                <w:b w:val="0"/>
+                <w:bCs w:val="0"/>
+              </w:rPr>
+            </w:pPr>
+            <w:r>
+              <w:rPr>
+                <w:rStyle w:val="Strong"/>
+                <w:b/>
+                <w:bCs/>
+              </w:rPr>
+              <w:t>Keras</w:t>
+            </w:r>
+          </w:p>
+        </w:tc>
+        <w:tc>
+          <w:tcPr>
+            <w:tcW w:w="0" w:type="auto"/>
+            <w:hideMark/>
+          </w:tcPr>
+          <w:p>
+            <w:pPr>
+              <w:cnfStyle w:val="000000000000" w:firstRow="0" w:lastRow="0" w:firstColumn="0" w:lastColumn="0" w:oddVBand="0" w:evenVBand="0" w:oddHBand="0" w:evenHBand="0" w:firstRowFirstColumn="0" w:firstRowLastColumn="0" w:lastRowFirstColumn="0" w:lastRowLastColumn="0"/>
+            </w:pPr>
+            <w:r>
+              <w:t>A high-level neural network API written in Python that can run on top of TensorFlow, Theano, and CNTK.</w:t>
+            </w:r>
+          </w:p>
+        </w:tc>
+      </w:tr>
+      <w:tr>
+        <w:trPr>
+          <w:trHeight w:val="703"/>
+        </w:trPr>
+        <w:tc>
+          <w:tcPr>
+            <w:cnfStyle w:val="001000000000" w:firstRow="0" w:lastRow="0" w:firstColumn="1" w:lastColumn="0" w:oddVBand="0" w:evenVBand="0" w:oddHBand="0" w:evenHBand="0" w:firstRowFirstColumn="0" w:firstRowLastColumn="0" w:lastRowFirstColumn="0" w:lastRowLastColumn="0"/>
+            <w:tcW w:w="0" w:type="auto"/>
+            <w:hideMark/>
+          </w:tcPr>
+          <w:p>
+            <w:pPr>
+              <w:rPr>
+                <w:b w:val="0"/>
+                <w:bCs w:val="0"/>
+              </w:rPr>
+            </w:pPr>
+            <w:r>
+              <w:rPr>
+                <w:rStyle w:val="Strong"/>
+                <w:b/>
+                <w:bCs/>
+              </w:rPr>
+              <w:t>Keras Functional API</w:t>
+            </w:r>
+          </w:p>
+        </w:tc>
+        <w:tc>
+          <w:tcPr>
+            <w:tcW w:w="0" w:type="auto"/>
+            <w:hideMark/>
+          </w:tcPr>
+          <w:p>
+            <w:pPr>
+              <w:cnfStyle w:val="000000000000" w:firstRow="0" w:lastRow="0" w:firstColumn="0" w:lastColumn="0" w:oddVBand="0" w:evenVBand="0" w:oddHBand="0" w:evenHBand="0" w:firstRowFirstColumn="0" w:firstRowLastColumn="0" w:lastRowFirstColumn="0" w:lastRowLastColumn="0"/>
+            </w:pPr>
+            <w:r>
+              <w:t>A powerful API for creating complex models with multiple inputs and outputs, shared layers, and non-sequential data flows.</w:t>
+            </w:r>
+          </w:p>
+        </w:tc>
+      </w:tr>
+      <w:tr>
+        <w:trPr>
+          <w:trHeight w:val="703"/>
+        </w:trPr>
+        <w:tc>
+          <w:tcPr>
+            <w:cnfStyle w:val="001000000000" w:firstRow="0" w:lastRow="0" w:firstColumn="1" w:lastColumn="0" w:oddVBand="0" w:evenVBand="0" w:oddHBand="0" w:evenHBand="0" w:firstRowFirstColumn="0" w:firstRowLastColumn="0" w:lastRowFirstColumn="0" w:lastRowLastColumn="0"/>
+            <w:tcW w:w="0" w:type="auto"/>
+            <w:hideMark/>
+          </w:tcPr>
+          <w:p>
+            <w:pPr>
+              <w:rPr>
+                <w:b w:val="0"/>
+                <w:bCs w:val="0"/>
+              </w:rPr>
+            </w:pPr>
+            <w:r>
+              <w:rPr>
+                <w:rStyle w:val="Strong"/>
+                <w:b/>
+                <w:bCs/>
+              </w:rPr>
+              <w:t>Keras Sequential API</w:t>
+            </w:r>
+          </w:p>
+        </w:tc>
+        <w:tc>
+          <w:tcPr>
+            <w:tcW w:w="0" w:type="auto"/>
+            <w:hideMark/>
+          </w:tcPr>
+          <w:p>
+            <w:pPr>
+              <w:cnfStyle w:val="000000000000" w:firstRow="0" w:lastRow="0" w:firstColumn="0" w:lastColumn="0" w:oddVBand="0" w:evenVBand="0" w:oddHBand="0" w:evenHBand="0" w:firstRowFirstColumn="0" w:firstRowLastColumn="0" w:lastRowFirstColumn="0" w:lastRowLastColumn="0"/>
+            </w:pPr>
+            <w:r>
+              <w:t>Creates models with layers in a linear stack.</w:t>
+            </w:r>
+          </w:p>
+        </w:tc>
+      </w:tr>
+      <w:tr>
+        <w:trPr>
+          <w:trHeight w:val="703"/>
+        </w:trPr>
+        <w:tc>
+          <w:tcPr>
+            <w:cnfStyle w:val="001000000000" w:firstRow="0" w:lastRow="0" w:firstColumn="1" w:lastColumn="0" w:oddVBand="0" w:evenVBand="0" w:oddHBand="0" w:evenHBand="0" w:firstRowFirstColumn="0" w:firstRowLastColumn="0" w:lastRowFirstColumn="0" w:lastRowLastColumn="0"/>
+            <w:tcW w:w="0" w:type="auto"/>
+            <w:hideMark/>
+          </w:tcPr>
+          <w:p>
+            <w:pPr>
+              <w:rPr>
+                <w:b w:val="0"/>
+                <w:bCs w:val="0"/>
+              </w:rPr>
+            </w:pPr>
+            <w:r>
+              <w:rPr>
+                <w:rStyle w:val="Strong"/>
+                <w:b/>
+                <w:bCs/>
+              </w:rPr>
+              <w:t>ReLU</w:t>
+            </w:r>
+          </w:p>
+        </w:tc>
+        <w:tc>
+          <w:tcPr>
+            <w:tcW w:w="0" w:type="auto"/>
+            <w:hideMark/>
+          </w:tcPr>
+          <w:p>
+            <w:pPr>
+              <w:cnfStyle w:val="000000000000" w:firstRow="0" w:lastRow="0" w:firstColumn="0" w:lastColumn="0" w:oddVBand="0" w:evenVBand="0" w:oddHBand="0" w:evenHBand="0" w:firstRowFirstColumn="0" w:firstRowLastColumn="0" w:lastRowFirstColumn="0" w:lastRowLastColumn="0"/>
+            </w:pPr>
+            <w:r>
+              <w:t>An activation function that outputs the input directly if positive; otherwise, it outputs zero. Commonly used in hidden layers.</w:t>
+            </w:r>
+          </w:p>
+        </w:tc>
+      </w:tr>
+      <w:tr>
+        <w:trPr>
+          <w:trHeight w:val="344"/>
+        </w:trPr>
+        <w:tc>
+          <w:tcPr>
+            <w:cnfStyle w:val="001000000000" w:firstRow="0" w:lastRow="0" w:firstColumn="1" w:lastColumn="0" w:oddVBand="0" w:evenVBand="0" w:oddHBand="0" w:evenHBand="0" w:firstRowFirstColumn="0" w:firstRowLastColumn="0" w:lastRowFirstColumn="0" w:lastRowLastColumn="0"/>
+            <w:tcW w:w="0" w:type="auto"/>
+            <w:hideMark/>
+          </w:tcPr>
+          <w:p>
+            <w:pPr>
+              <w:rPr>
+                <w:b w:val="0"/>
+                <w:bCs w:val="0"/>
+              </w:rPr>
+            </w:pPr>
+            <w:r>
+              <w:rPr>
+                <w:rStyle w:val="Strong"/>
+                <w:b/>
+                <w:bCs/>
+              </w:rPr>
+              <w:t>Shared layer</w:t>
+            </w:r>
+          </w:p>
+        </w:tc>
+        <w:tc>
+          <w:tcPr>
+            <w:tcW w:w="0" w:type="auto"/>
+            <w:hideMark/>
+          </w:tcPr>
+          <w:p>
+            <w:pPr>
+              <w:cnfStyle w:val="000000000000" w:firstRow="0" w:lastRow="0" w:firstColumn="0" w:lastColumn="0" w:oddVBand="0" w:evenVBand="0" w:oddHBand="0" w:evenHBand="0" w:firstRowFirstColumn="0" w:firstRowLastColumn="0" w:lastRowFirstColumn="0" w:lastRowLastColumn="0"/>
+            </w:pPr>
+            <w:r>
+              <w:t>Helpful when applying the same transformation to multiple inputs.</w:t>
+            </w:r>
+          </w:p>
+        </w:tc>
+      </w:tr>
+      <w:tr>
+        <w:trPr>
+          <w:trHeight w:val="358"/>
+        </w:trPr>
+        <w:tc>
+          <w:tcPr>
+            <w:cnfStyle w:val="001000000000" w:firstRow="0" w:lastRow="0" w:firstColumn="1" w:lastColumn="0" w:oddVBand="0" w:evenVBand="0" w:oddHBand="0" w:evenHBand="0" w:firstRowFirstColumn="0" w:firstRowLastColumn="0" w:lastRowFirstColumn="0" w:lastRowLastColumn="0"/>
+            <w:tcW w:w="0" w:type="auto"/>
+            <w:hideMark/>
+          </w:tcPr>
+          <w:p>
+            <w:pPr>
+              <w:rPr>
+                <w:b w:val="0"/>
+                <w:bCs w:val="0"/>
+              </w:rPr>
+            </w:pPr>
+            <w:r>
+              <w:rPr>
+                <w:rStyle w:val="Strong"/>
+                <w:b/>
+                <w:bCs/>
+              </w:rPr>
+              <w:t>Softmax</w:t>
+            </w:r>
+          </w:p>
+        </w:tc>
+        <w:tc>
+          <w:tcPr>
+            <w:tcW w:w="0" w:type="auto"/>
+            <w:hideMark/>
+          </w:tcPr>
+          <w:p>
+            <w:pPr>
+              <w:cnfStyle w:val="000000000000" w:firstRow="0" w:lastRow="0" w:firstColumn="0" w:lastColumn="0" w:oddVBand="0" w:evenVBand="0" w:oddHBand="0" w:evenHBand="0" w:firstRowFirstColumn="0" w:firstRowLastColumn="0" w:lastRowFirstColumn="0" w:lastRowLastColumn="0"/>
+            </w:pPr>
+            <w:r>
+              <w:t>An activation function suitable for classification tasks.</w:t>
+            </w:r>
+          </w:p>
+        </w:tc>
+      </w:tr>
+      <w:tr>
+        <w:trPr>
+          <w:trHeight w:val="1048"/>
+        </w:trPr>
+        <w:tc>
+          <w:tcPr>
+            <w:cnfStyle w:val="001000000000" w:firstRow="0" w:lastRow="0" w:firstColumn="1" w:lastColumn="0" w:oddVBand="0" w:evenVBand="0" w:oddHBand="0" w:evenHBand="0" w:firstRowFirstColumn="0" w:firstRowLastColumn="0" w:lastRowFirstColumn="0" w:lastRowLastColumn="0"/>
+            <w:tcW w:w="0" w:type="auto"/>
+            <w:hideMark/>
+          </w:tcPr>
+          <w:p>
+            <w:pPr>
+              <w:rPr>
+                <w:b w:val="0"/>
+                <w:bCs w:val="0"/>
+              </w:rPr>
+            </w:pPr>
+            <w:r>
+              <w:rPr>
+                <w:rStyle w:val="Strong"/>
+                <w:b/>
+                <w:bCs/>
+              </w:rPr>
+              <w:lastRenderedPageBreak/>
+              <w:t>TensorFlow 2.x</w:t>
+            </w:r>
+          </w:p>
+        </w:tc>
+        <w:tc>
+          <w:tcPr>
+            <w:tcW w:w="0" w:type="auto"/>
+            <w:hideMark/>
+          </w:tcPr>
+          <w:p>
+            <w:pPr>
+              <w:cnfStyle w:val="000000000000" w:firstRow="0" w:lastRow="0" w:firstColumn="0" w:lastColumn="0" w:oddVBand="0" w:evenVBand="0" w:oddHBand="0" w:evenHBand="0" w:firstRowFirstColumn="0" w:firstRowLastColumn="0" w:lastRowFirstColumn="0" w:lastRowLastColumn="0"/>
+            </w:pPr>
+            <w:r>
+              <w:t>An open-source platform for machine learning developed by Google, providing comprehensive tools to build and deploy machine learning models across various environments, from servers to edge devices.</w:t>
+            </w:r>
+          </w:p>
+        </w:tc>
+      </w:tr>
+      <w:tr>
+        <w:trPr>
+          <w:trHeight w:val="1048"/>
+        </w:trPr>
+        <w:tc>
+          <w:tcPr>
+            <w:cnfStyle w:val="001000000000" w:firstRow="0" w:lastRow="0" w:firstColumn="1" w:lastColumn="0" w:oddVBand="0" w:evenVBand="0" w:oddHBand="0" w:evenHBand="0" w:firstRowFirstColumn="0" w:firstRowLastColumn="0" w:lastRowFirstColumn="0" w:lastRowLastColumn="0"/>
+            <w:tcW w:w="0" w:type="auto"/>
+            <w:hideMark/>
+          </w:tcPr>
+          <w:p>
+            <w:pPr>
+              <w:rPr>
+                <w:b w:val="0"/>
+                <w:bCs w:val="0"/>
+              </w:rPr>
+            </w:pPr>
+            <w:r>
+              <w:rPr>
+                <w:rStyle w:val="Strong"/>
+                <w:b/>
+                <w:bCs/>
+              </w:rPr>
+              <w:t>TensorBoard</w:t>
+            </w:r>
+          </w:p>
+        </w:tc>
+        <w:tc>
+          <w:tcPr>
+            <w:tcW w:w="0" w:type="auto"/>
+            <w:hideMark/>
+          </w:tcPr>
+          <w:p>
+            <w:pPr>
+              <w:cnfStyle w:val="000000000000" w:firstRow="0" w:lastRow="0" w:firstColumn="0" w:lastColumn="0" w:oddVBand="0" w:evenVBand="0" w:oddHBand="0" w:evenHBand="0" w:firstRowFirstColumn="0" w:firstRowLastColumn="0" w:lastRowFirstColumn="0" w:lastRowLastColumn="0"/>
+            </w:pPr>
+            <w:r>
+              <w:t>A visualization toolkit for TensorFlow that provides insights into the model training process, including metrics, graphs, and other useful data.</w:t>
+            </w:r>
+          </w:p>
+        </w:tc>
+      </w:tr>
+      <w:tr>
+        <w:trPr>
+          <w:trHeight w:val="1407"/>
+        </w:trPr>
+        <w:tc>
+          <w:tcPr>
+            <w:cnfStyle w:val="001000000000" w:firstRow="0" w:lastRow="0" w:firstColumn="1" w:lastColumn="0" w:oddVBand="0" w:evenVBand="0" w:oddHBand="0" w:evenHBand="0" w:firstRowFirstColumn="0" w:firstRowLastColumn="0" w:lastRowFirstColumn="0" w:lastRowLastColumn="0"/>
+            <w:tcW w:w="0" w:type="auto"/>
+            <w:hideMark/>
+          </w:tcPr>
+          <w:p>
+            <w:pPr>
+              <w:rPr>
+                <w:b w:val="0"/>
+                <w:bCs w:val="0"/>
+              </w:rPr>
+            </w:pPr>
+            <w:r>
+              <w:rPr>
+                <w:rStyle w:val="Strong"/>
+                <w:b/>
+                <w:bCs/>
+              </w:rPr>
+              <w:t>TensorFlow Extended (TFX)</w:t>
+            </w:r>
+          </w:p>
+        </w:tc>
+        <w:tc>
+          <w:tcPr>
+            <w:tcW w:w="0" w:type="auto"/>
+            <w:hideMark/>
+          </w:tcPr>
+          <w:p>
+            <w:pPr>
+              <w:cnfStyle w:val="000000000000" w:firstRow="0" w:lastRow="0" w:firstColumn="0" w:lastColumn="0" w:oddVBand="0" w:evenVBand="0" w:oddHBand="0" w:evenHBand="0" w:firstRowFirstColumn="0" w:firstRowLastColumn="0" w:lastRowFirstColumn="0" w:lastRowLastColumn="0"/>
+            </w:pPr>
+            <w:r>
+              <w:t>An end-to-end platform for deploying production ML pipelines. TFX provides tools for model deployment, monitoring, and management, ensuring that machine learning models perform reliably in production environments.</w:t>
+            </w:r>
+          </w:p>
+        </w:tc>
+      </w:tr>
+      <w:tr>
+        <w:trPr>
+          <w:trHeight w:val="1048"/>
+        </w:trPr>
+        <w:tc>
+          <w:tcPr>
+            <w:cnfStyle w:val="001000000000" w:firstRow="0" w:lastRow="0" w:firstColumn="1" w:lastColumn="0" w:oddVBand="0" w:evenVBand="0" w:oddHBand="0" w:evenHBand="0" w:firstRowFirstColumn="0" w:firstRowLastColumn="0" w:lastRowFirstColumn="0" w:lastRowLastColumn="0"/>
+            <w:tcW w:w="0" w:type="auto"/>
+            <w:hideMark/>
+          </w:tcPr>
+          <w:p>
+            <w:pPr>
+              <w:rPr>
+                <w:b w:val="0"/>
+                <w:bCs w:val="0"/>
+              </w:rPr>
+            </w:pPr>
+            <w:r>
+              <w:rPr>
+                <w:rStyle w:val="Strong"/>
+                <w:b/>
+                <w:bCs/>
+              </w:rPr>
+              <w:t>TensorFlow Hub</w:t>
+            </w:r>
+          </w:p>
+        </w:tc>
+        <w:tc>
+          <w:tcPr>
+            <w:tcW w:w="0" w:type="auto"/>
+            <w:hideMark/>
+          </w:tcPr>
+          <w:p>
+            <w:pPr>
+              <w:cnfStyle w:val="000000000000" w:firstRow="0" w:lastRow="0" w:firstColumn="0" w:lastColumn="0" w:oddVBand="0" w:evenVBand="0" w:oddHBand="0" w:evenHBand="0" w:firstRowFirstColumn="0" w:firstRowLastColumn="0" w:lastRowFirstColumn="0" w:lastRowLastColumn="0"/>
+            </w:pPr>
+            <w:r>
+              <w:t>A repository of reusable machine learning modules, which can be easily integrated into TensorFlow applications to accelerate development.</w:t>
+            </w:r>
+          </w:p>
+        </w:tc>
+      </w:tr>
+      <w:tr>
+        <w:trPr>
+          <w:trHeight w:val="703"/>
+        </w:trPr>
+        <w:tc>
+          <w:tcPr>
+            <w:cnfStyle w:val="001000000000" w:firstRow="0" w:lastRow="0" w:firstColumn="1" w:lastColumn="0" w:oddVBand="0" w:evenVBand="0" w:oddHBand="0" w:evenHBand="0" w:firstRowFirstColumn="0" w:firstRowLastColumn="0" w:lastRowFirstColumn="0" w:lastRowLastColumn="0"/>
+            <w:tcW w:w="0" w:type="auto"/>
+            <w:hideMark/>
+          </w:tcPr>
+          <w:p>
+            <w:pPr>
+              <w:rPr>
+                <w:b w:val="0"/>
+                <w:bCs w:val="0"/>
+              </w:rPr>
+            </w:pPr>
+            <w:r>
+              <w:rPr>
+                <w:rStyle w:val="Strong"/>
+                <w:b/>
+                <w:bCs/>
+              </w:rPr>
+              <w:t>TensorFlow.js</w:t>
+            </w:r>
+          </w:p>
+        </w:tc>
+        <w:tc>
+          <w:tcPr>
+            <w:tcW w:w="0" w:type="auto"/>
+            <w:hideMark/>
+          </w:tcPr>
+          <w:p>
+            <w:pPr>
+              <w:cnfStyle w:val="000000000000" w:firstRow="0" w:lastRow="0" w:firstColumn="0" w:lastColumn="0" w:oddVBand="0" w:evenVBand="0" w:oddHBand="0" w:evenHBand="0" w:firstRowFirstColumn="0" w:firstRowLastColumn="0" w:lastRowFirstColumn="0" w:lastRowLastColumn="0"/>
+            </w:pPr>
+            <w:r>
+              <w:t>A library for training and deploying machine learning models in JavaScript environments, such as web browsers and Node.js.</w:t>
+            </w:r>
+          </w:p>
+        </w:tc>
+      </w:tr>
+      <w:tr>
+        <w:trPr>
+          <w:trHeight w:val="703"/>
+        </w:trPr>
+        <w:tc>
+          <w:tcPr>
+            <w:cnfStyle w:val="001000000000" w:firstRow="0" w:lastRow="0" w:firstColumn="1" w:lastColumn="0" w:oddVBand="0" w:evenVBand="0" w:oddHBand="0" w:evenHBand="0" w:firstRowFirstColumn="0" w:firstRowLastColumn="0" w:lastRowFirstColumn="0" w:lastRowLastColumn="0"/>
+            <w:tcW w:w="0" w:type="auto"/>
+            <w:hideMark/>
+          </w:tcPr>
+          <w:p>
+            <w:pPr>
+              <w:rPr>
+                <w:b w:val="0"/>
+                <w:bCs w:val="0"/>
+              </w:rPr>
+            </w:pPr>
+            <w:r>
+              <w:rPr>
+                <w:rStyle w:val="Strong"/>
+                <w:b/>
+                <w:bCs/>
+              </w:rPr>
+              <w:t>TensorFlow Lite</w:t>
+            </w:r>
+          </w:p>
+        </w:tc>
+        <w:tc>
+          <w:tcPr>
+            <w:tcW w:w="0" w:type="auto"/>
+            <w:hideMark/>
+          </w:tcPr>
+          <w:p>
+            <w:pPr>
+              <w:cnfStyle w:val="000000000000" w:firstRow="0" w:lastRow="0" w:firstColumn="0" w:lastColumn="0" w:oddVBand="0" w:evenVBand="0" w:oddHBand="0" w:evenHBand="0" w:firstRowFirstColumn="0" w:firstRowLastColumn="0" w:lastRowFirstColumn="0" w:lastRowLastColumn="0"/>
+            </w:pPr>
+            <w:r>
+              <w:t>A lightweight framework for deploying machine learning models on mobile and embedded devices.</w:t>
+            </w:r>
+          </w:p>
+        </w:tc>
+      </w:tr>
+    </w:tbl>
     <w:p>
       <w:pPr>
         <w:rPr>
@@ -6666,6 +7721,155 @@
     </w:lvl>
   </w:abstractNum>
   <w:abstractNum w:abstractNumId="5" w15:restartNumberingAfterBreak="0">
+    <w:nsid w:val="0C0834D9"/>
+    <w:multiLevelType w:val="multilevel"/>
+    <w:tmpl w:val="3E76B280"/>
+    <w:lvl w:ilvl="0">
+      <w:start w:val="1"/>
+      <w:numFmt w:val="bullet"/>
+      <w:lvlText w:val=""/>
+      <w:lvlJc w:val="left"/>
+      <w:pPr>
+        <w:tabs>
+          <w:tab w:val="num" w:pos="720"/>
+        </w:tabs>
+        <w:ind w:left="720" w:hanging="360"/>
+      </w:pPr>
+      <w:rPr>
+        <w:rFonts w:ascii="Symbol" w:hAnsi="Symbol" w:hint="default"/>
+        <w:sz w:val="20"/>
+      </w:rPr>
+    </w:lvl>
+    <w:lvl w:ilvl="1" w:tentative="1">
+      <w:start w:val="1"/>
+      <w:numFmt w:val="bullet"/>
+      <w:lvlText w:val="o"/>
+      <w:lvlJc w:val="left"/>
+      <w:pPr>
+        <w:tabs>
+          <w:tab w:val="num" w:pos="1440"/>
+        </w:tabs>
+        <w:ind w:left="1440" w:hanging="360"/>
+      </w:pPr>
+      <w:rPr>
+        <w:rFonts w:ascii="Courier New" w:hAnsi="Courier New" w:hint="default"/>
+        <w:sz w:val="20"/>
+      </w:rPr>
+    </w:lvl>
+    <w:lvl w:ilvl="2" w:tentative="1">
+      <w:start w:val="1"/>
+      <w:numFmt w:val="bullet"/>
+      <w:lvlText w:val=""/>
+      <w:lvlJc w:val="left"/>
+      <w:pPr>
+        <w:tabs>
+          <w:tab w:val="num" w:pos="2160"/>
+        </w:tabs>
+        <w:ind w:left="2160" w:hanging="360"/>
+      </w:pPr>
+      <w:rPr>
+        <w:rFonts w:ascii="Wingdings" w:hAnsi="Wingdings" w:hint="default"/>
+        <w:sz w:val="20"/>
+      </w:rPr>
+    </w:lvl>
+    <w:lvl w:ilvl="3" w:tentative="1">
+      <w:start w:val="1"/>
+      <w:numFmt w:val="bullet"/>
+      <w:lvlText w:val=""/>
+      <w:lvlJc w:val="left"/>
+      <w:pPr>
+        <w:tabs>
+          <w:tab w:val="num" w:pos="2880"/>
+        </w:tabs>
+        <w:ind w:left="2880" w:hanging="360"/>
+      </w:pPr>
+      <w:rPr>
+        <w:rFonts w:ascii="Wingdings" w:hAnsi="Wingdings" w:hint="default"/>
+        <w:sz w:val="20"/>
+      </w:rPr>
+    </w:lvl>
+    <w:lvl w:ilvl="4" w:tentative="1">
+      <w:start w:val="1"/>
+      <w:numFmt w:val="bullet"/>
+      <w:lvlText w:val=""/>
+      <w:lvlJc w:val="left"/>
+      <w:pPr>
+        <w:tabs>
+          <w:tab w:val="num" w:pos="3600"/>
+        </w:tabs>
+        <w:ind w:left="3600" w:hanging="360"/>
+      </w:pPr>
+      <w:rPr>
+        <w:rFonts w:ascii="Wingdings" w:hAnsi="Wingdings" w:hint="default"/>
+        <w:sz w:val="20"/>
+      </w:rPr>
+    </w:lvl>
+    <w:lvl w:ilvl="5" w:tentative="1">
+      <w:start w:val="1"/>
+      <w:numFmt w:val="bullet"/>
+      <w:lvlText w:val=""/>
+      <w:lvlJc w:val="left"/>
+      <w:pPr>
+        <w:tabs>
+          <w:tab w:val="num" w:pos="4320"/>
+        </w:tabs>
+        <w:ind w:left="4320" w:hanging="360"/>
+      </w:pPr>
+      <w:rPr>
+        <w:rFonts w:ascii="Wingdings" w:hAnsi="Wingdings" w:hint="default"/>
+        <w:sz w:val="20"/>
+      </w:rPr>
+    </w:lvl>
+    <w:lvl w:ilvl="6" w:tentative="1">
+      <w:start w:val="1"/>
+      <w:numFmt w:val="bullet"/>
+      <w:lvlText w:val=""/>
+      <w:lvlJc w:val="left"/>
+      <w:pPr>
+        <w:tabs>
+          <w:tab w:val="num" w:pos="5040"/>
+        </w:tabs>
+        <w:ind w:left="5040" w:hanging="360"/>
+      </w:pPr>
+      <w:rPr>
+        <w:rFonts w:ascii="Wingdings" w:hAnsi="Wingdings" w:hint="default"/>
+        <w:sz w:val="20"/>
+      </w:rPr>
+    </w:lvl>
+    <w:lvl w:ilvl="7" w:tentative="1">
+      <w:start w:val="1"/>
+      <w:numFmt w:val="bullet"/>
+      <w:lvlText w:val=""/>
+      <w:lvlJc w:val="left"/>
+      <w:pPr>
+        <w:tabs>
+          <w:tab w:val="num" w:pos="5760"/>
+        </w:tabs>
+        <w:ind w:left="5760" w:hanging="360"/>
+      </w:pPr>
+      <w:rPr>
+        <w:rFonts w:ascii="Wingdings" w:hAnsi="Wingdings" w:hint="default"/>
+        <w:sz w:val="20"/>
+      </w:rPr>
+    </w:lvl>
+    <w:lvl w:ilvl="8" w:tentative="1">
+      <w:start w:val="1"/>
+      <w:numFmt w:val="bullet"/>
+      <w:lvlText w:val=""/>
+      <w:lvlJc w:val="left"/>
+      <w:pPr>
+        <w:tabs>
+          <w:tab w:val="num" w:pos="6480"/>
+        </w:tabs>
+        <w:ind w:left="6480" w:hanging="360"/>
+      </w:pPr>
+      <w:rPr>
+        <w:rFonts w:ascii="Wingdings" w:hAnsi="Wingdings" w:hint="default"/>
+        <w:sz w:val="20"/>
+      </w:rPr>
+    </w:lvl>
+  </w:abstractNum>
+  <w:abstractNum w:abstractNumId="6" w15:restartNumberingAfterBreak="0">
     <w:nsid w:val="0C2F1A59"/>
     <w:multiLevelType w:val="multilevel"/>
     <w:tmpl w:val="E2A47430"/>
@@ -6814,7 +8018,7 @@
       </w:rPr>
     </w:lvl>
   </w:abstractNum>
-  <w:abstractNum w:abstractNumId="6" w15:restartNumberingAfterBreak="0">
+  <w:abstractNum w:abstractNumId="7" w15:restartNumberingAfterBreak="0">
     <w:nsid w:val="0DD84976"/>
     <w:multiLevelType w:val="multilevel"/>
     <w:tmpl w:val="09C88058"/>
@@ -6963,7 +8167,7 @@
       </w:rPr>
     </w:lvl>
   </w:abstractNum>
-  <w:abstractNum w:abstractNumId="7" w15:restartNumberingAfterBreak="0">
+  <w:abstractNum w:abstractNumId="8" w15:restartNumberingAfterBreak="0">
     <w:nsid w:val="0E992A94"/>
     <w:multiLevelType w:val="multilevel"/>
     <w:tmpl w:val="55F63388"/>
@@ -7112,7 +8316,7 @@
       </w:rPr>
     </w:lvl>
   </w:abstractNum>
-  <w:abstractNum w:abstractNumId="8" w15:restartNumberingAfterBreak="0">
+  <w:abstractNum w:abstractNumId="9" w15:restartNumberingAfterBreak="0">
     <w:nsid w:val="15C60C32"/>
     <w:multiLevelType w:val="multilevel"/>
     <w:tmpl w:val="3AE26770"/>
@@ -7261,7 +8465,7 @@
       </w:rPr>
     </w:lvl>
   </w:abstractNum>
-  <w:abstractNum w:abstractNumId="9" w15:restartNumberingAfterBreak="0">
+  <w:abstractNum w:abstractNumId="10" w15:restartNumberingAfterBreak="0">
     <w:nsid w:val="1818190E"/>
     <w:multiLevelType w:val="multilevel"/>
     <w:tmpl w:val="EDC64EB6"/>
@@ -7410,7 +8614,7 @@
       </w:rPr>
     </w:lvl>
   </w:abstractNum>
-  <w:abstractNum w:abstractNumId="10" w15:restartNumberingAfterBreak="0">
+  <w:abstractNum w:abstractNumId="11" w15:restartNumberingAfterBreak="0">
     <w:nsid w:val="18BC20E0"/>
     <w:multiLevelType w:val="multilevel"/>
     <w:tmpl w:val="DE80707E"/>
@@ -7559,7 +8763,7 @@
       </w:rPr>
     </w:lvl>
   </w:abstractNum>
-  <w:abstractNum w:abstractNumId="11" w15:restartNumberingAfterBreak="0">
+  <w:abstractNum w:abstractNumId="12" w15:restartNumberingAfterBreak="0">
     <w:nsid w:val="207E4B4C"/>
     <w:multiLevelType w:val="multilevel"/>
     <w:tmpl w:val="CC8C993C"/>
@@ -7708,7 +8912,7 @@
       </w:rPr>
     </w:lvl>
   </w:abstractNum>
-  <w:abstractNum w:abstractNumId="12" w15:restartNumberingAfterBreak="0">
+  <w:abstractNum w:abstractNumId="13" w15:restartNumberingAfterBreak="0">
     <w:nsid w:val="20ED4D27"/>
     <w:multiLevelType w:val="multilevel"/>
     <w:tmpl w:val="4978DD32"/>
@@ -7857,7 +9061,7 @@
       </w:rPr>
     </w:lvl>
   </w:abstractNum>
-  <w:abstractNum w:abstractNumId="13" w15:restartNumberingAfterBreak="0">
+  <w:abstractNum w:abstractNumId="14" w15:restartNumberingAfterBreak="0">
     <w:nsid w:val="212824BE"/>
     <w:multiLevelType w:val="multilevel"/>
     <w:tmpl w:val="AA90CD4E"/>
@@ -8006,7 +9210,156 @@
       </w:rPr>
     </w:lvl>
   </w:abstractNum>
-  <w:abstractNum w:abstractNumId="14" w15:restartNumberingAfterBreak="0">
+  <w:abstractNum w:abstractNumId="15" w15:restartNumberingAfterBreak="0">
+    <w:nsid w:val="23B62BDD"/>
+    <w:multiLevelType w:val="multilevel"/>
+    <w:tmpl w:val="0398467E"/>
+    <w:lvl w:ilvl="0">
+      <w:start w:val="1"/>
+      <w:numFmt w:val="bullet"/>
+      <w:lvlText w:val=""/>
+      <w:lvlJc w:val="left"/>
+      <w:pPr>
+        <w:tabs>
+          <w:tab w:val="num" w:pos="720"/>
+        </w:tabs>
+        <w:ind w:left="720" w:hanging="360"/>
+      </w:pPr>
+      <w:rPr>
+        <w:rFonts w:ascii="Symbol" w:hAnsi="Symbol" w:hint="default"/>
+        <w:sz w:val="20"/>
+      </w:rPr>
+    </w:lvl>
+    <w:lvl w:ilvl="1" w:tentative="1">
+      <w:start w:val="1"/>
+      <w:numFmt w:val="bullet"/>
+      <w:lvlText w:val="o"/>
+      <w:lvlJc w:val="left"/>
+      <w:pPr>
+        <w:tabs>
+          <w:tab w:val="num" w:pos="1440"/>
+        </w:tabs>
+        <w:ind w:left="1440" w:hanging="360"/>
+      </w:pPr>
+      <w:rPr>
+        <w:rFonts w:ascii="Courier New" w:hAnsi="Courier New" w:hint="default"/>
+        <w:sz w:val="20"/>
+      </w:rPr>
+    </w:lvl>
+    <w:lvl w:ilvl="2" w:tentative="1">
+      <w:start w:val="1"/>
+      <w:numFmt w:val="bullet"/>
+      <w:lvlText w:val=""/>
+      <w:lvlJc w:val="left"/>
+      <w:pPr>
+        <w:tabs>
+          <w:tab w:val="num" w:pos="2160"/>
+        </w:tabs>
+        <w:ind w:left="2160" w:hanging="360"/>
+      </w:pPr>
+      <w:rPr>
+        <w:rFonts w:ascii="Wingdings" w:hAnsi="Wingdings" w:hint="default"/>
+        <w:sz w:val="20"/>
+      </w:rPr>
+    </w:lvl>
+    <w:lvl w:ilvl="3" w:tentative="1">
+      <w:start w:val="1"/>
+      <w:numFmt w:val="bullet"/>
+      <w:lvlText w:val=""/>
+      <w:lvlJc w:val="left"/>
+      <w:pPr>
+        <w:tabs>
+          <w:tab w:val="num" w:pos="2880"/>
+        </w:tabs>
+        <w:ind w:left="2880" w:hanging="360"/>
+      </w:pPr>
+      <w:rPr>
+        <w:rFonts w:ascii="Wingdings" w:hAnsi="Wingdings" w:hint="default"/>
+        <w:sz w:val="20"/>
+      </w:rPr>
+    </w:lvl>
+    <w:lvl w:ilvl="4" w:tentative="1">
+      <w:start w:val="1"/>
+      <w:numFmt w:val="bullet"/>
+      <w:lvlText w:val=""/>
+      <w:lvlJc w:val="left"/>
+      <w:pPr>
+        <w:tabs>
+          <w:tab w:val="num" w:pos="3600"/>
+        </w:tabs>
+        <w:ind w:left="3600" w:hanging="360"/>
+      </w:pPr>
+      <w:rPr>
+        <w:rFonts w:ascii="Wingdings" w:hAnsi="Wingdings" w:hint="default"/>
+        <w:sz w:val="20"/>
+      </w:rPr>
+    </w:lvl>
+    <w:lvl w:ilvl="5" w:tentative="1">
+      <w:start w:val="1"/>
+      <w:numFmt w:val="bullet"/>
+      <w:lvlText w:val=""/>
+      <w:lvlJc w:val="left"/>
+      <w:pPr>
+        <w:tabs>
+          <w:tab w:val="num" w:pos="4320"/>
+        </w:tabs>
+        <w:ind w:left="4320" w:hanging="360"/>
+      </w:pPr>
+      <w:rPr>
+        <w:rFonts w:ascii="Wingdings" w:hAnsi="Wingdings" w:hint="default"/>
+        <w:sz w:val="20"/>
+      </w:rPr>
+    </w:lvl>
+    <w:lvl w:ilvl="6" w:tentative="1">
+      <w:start w:val="1"/>
+      <w:numFmt w:val="bullet"/>
+      <w:lvlText w:val=""/>
+      <w:lvlJc w:val="left"/>
+      <w:pPr>
+        <w:tabs>
+          <w:tab w:val="num" w:pos="5040"/>
+        </w:tabs>
+        <w:ind w:left="5040" w:hanging="360"/>
+      </w:pPr>
+      <w:rPr>
+        <w:rFonts w:ascii="Wingdings" w:hAnsi="Wingdings" w:hint="default"/>
+        <w:sz w:val="20"/>
+      </w:rPr>
+    </w:lvl>
+    <w:lvl w:ilvl="7" w:tentative="1">
+      <w:start w:val="1"/>
+      <w:numFmt w:val="bullet"/>
+      <w:lvlText w:val=""/>
+      <w:lvlJc w:val="left"/>
+      <w:pPr>
+        <w:tabs>
+          <w:tab w:val="num" w:pos="5760"/>
+        </w:tabs>
+        <w:ind w:left="5760" w:hanging="360"/>
+      </w:pPr>
+      <w:rPr>
+        <w:rFonts w:ascii="Wingdings" w:hAnsi="Wingdings" w:hint="default"/>
+        <w:sz w:val="20"/>
+      </w:rPr>
+    </w:lvl>
+    <w:lvl w:ilvl="8" w:tentative="1">
+      <w:start w:val="1"/>
+      <w:numFmt w:val="bullet"/>
+      <w:lvlText w:val=""/>
+      <w:lvlJc w:val="left"/>
+      <w:pPr>
+        <w:tabs>
+          <w:tab w:val="num" w:pos="6480"/>
+        </w:tabs>
+        <w:ind w:left="6480" w:hanging="360"/>
+      </w:pPr>
+      <w:rPr>
+        <w:rFonts w:ascii="Wingdings" w:hAnsi="Wingdings" w:hint="default"/>
+        <w:sz w:val="20"/>
+      </w:rPr>
+    </w:lvl>
+  </w:abstractNum>
+  <w:abstractNum w:abstractNumId="16" w15:restartNumberingAfterBreak="0">
     <w:nsid w:val="242724B6"/>
     <w:multiLevelType w:val="multilevel"/>
     <w:tmpl w:val="20D03170"/>
@@ -8155,7 +9508,7 @@
       </w:rPr>
     </w:lvl>
   </w:abstractNum>
-  <w:abstractNum w:abstractNumId="15" w15:restartNumberingAfterBreak="0">
+  <w:abstractNum w:abstractNumId="17" w15:restartNumberingAfterBreak="0">
     <w:nsid w:val="251009E2"/>
     <w:multiLevelType w:val="multilevel"/>
     <w:tmpl w:val="C6901BEC"/>
@@ -8304,7 +9657,7 @@
       </w:rPr>
     </w:lvl>
   </w:abstractNum>
-  <w:abstractNum w:abstractNumId="16" w15:restartNumberingAfterBreak="0">
+  <w:abstractNum w:abstractNumId="18" w15:restartNumberingAfterBreak="0">
     <w:nsid w:val="25850B3F"/>
     <w:multiLevelType w:val="multilevel"/>
     <w:tmpl w:val="452E40C0"/>
@@ -8453,7 +9806,7 @@
       </w:rPr>
     </w:lvl>
   </w:abstractNum>
-  <w:abstractNum w:abstractNumId="17" w15:restartNumberingAfterBreak="0">
+  <w:abstractNum w:abstractNumId="19" w15:restartNumberingAfterBreak="0">
     <w:nsid w:val="26106C50"/>
     <w:multiLevelType w:val="multilevel"/>
     <w:tmpl w:val="D9869F06"/>
@@ -8566,7 +9919,7 @@
       </w:pPr>
     </w:lvl>
   </w:abstractNum>
-  <w:abstractNum w:abstractNumId="18" w15:restartNumberingAfterBreak="0">
+  <w:abstractNum w:abstractNumId="20" w15:restartNumberingAfterBreak="0">
     <w:nsid w:val="26802383"/>
     <w:multiLevelType w:val="multilevel"/>
     <w:tmpl w:val="34E0D16C"/>
@@ -8715,7 +10068,7 @@
       </w:rPr>
     </w:lvl>
   </w:abstractNum>
-  <w:abstractNum w:abstractNumId="19" w15:restartNumberingAfterBreak="0">
+  <w:abstractNum w:abstractNumId="21" w15:restartNumberingAfterBreak="0">
     <w:nsid w:val="26B36A8A"/>
     <w:multiLevelType w:val="multilevel"/>
     <w:tmpl w:val="D936A8A6"/>
@@ -8864,7 +10217,7 @@
       </w:rPr>
     </w:lvl>
   </w:abstractNum>
-  <w:abstractNum w:abstractNumId="20" w15:restartNumberingAfterBreak="0">
+  <w:abstractNum w:abstractNumId="22" w15:restartNumberingAfterBreak="0">
     <w:nsid w:val="272D2BE3"/>
     <w:multiLevelType w:val="multilevel"/>
     <w:tmpl w:val="DFC895D8"/>
@@ -9013,7 +10366,7 @@
       </w:rPr>
     </w:lvl>
   </w:abstractNum>
-  <w:abstractNum w:abstractNumId="21" w15:restartNumberingAfterBreak="0">
+  <w:abstractNum w:abstractNumId="23" w15:restartNumberingAfterBreak="0">
     <w:nsid w:val="2B255A60"/>
     <w:multiLevelType w:val="multilevel"/>
     <w:tmpl w:val="E0A266A4"/>
@@ -9162,7 +10515,7 @@
       </w:rPr>
     </w:lvl>
   </w:abstractNum>
-  <w:abstractNum w:abstractNumId="22" w15:restartNumberingAfterBreak="0">
+  <w:abstractNum w:abstractNumId="24" w15:restartNumberingAfterBreak="0">
     <w:nsid w:val="2BD66B24"/>
     <w:multiLevelType w:val="multilevel"/>
     <w:tmpl w:val="195C3720"/>
@@ -9311,7 +10664,7 @@
       </w:rPr>
     </w:lvl>
   </w:abstractNum>
-  <w:abstractNum w:abstractNumId="23" w15:restartNumberingAfterBreak="0">
+  <w:abstractNum w:abstractNumId="25" w15:restartNumberingAfterBreak="0">
     <w:nsid w:val="32A3446A"/>
     <w:multiLevelType w:val="multilevel"/>
     <w:tmpl w:val="C0E0E9A0"/>
@@ -9460,7 +10813,7 @@
       </w:rPr>
     </w:lvl>
   </w:abstractNum>
-  <w:abstractNum w:abstractNumId="24" w15:restartNumberingAfterBreak="0">
+  <w:abstractNum w:abstractNumId="26" w15:restartNumberingAfterBreak="0">
     <w:nsid w:val="33D07977"/>
     <w:multiLevelType w:val="multilevel"/>
     <w:tmpl w:val="4852D8A2"/>
@@ -9609,7 +10962,7 @@
       </w:rPr>
     </w:lvl>
   </w:abstractNum>
-  <w:abstractNum w:abstractNumId="25" w15:restartNumberingAfterBreak="0">
+  <w:abstractNum w:abstractNumId="27" w15:restartNumberingAfterBreak="0">
     <w:nsid w:val="353903B8"/>
     <w:multiLevelType w:val="multilevel"/>
     <w:tmpl w:val="C2E8B1A6"/>
@@ -9758,7 +11111,7 @@
       </w:rPr>
     </w:lvl>
   </w:abstractNum>
-  <w:abstractNum w:abstractNumId="26" w15:restartNumberingAfterBreak="0">
+  <w:abstractNum w:abstractNumId="28" w15:restartNumberingAfterBreak="0">
     <w:nsid w:val="36CE48D4"/>
     <w:multiLevelType w:val="multilevel"/>
     <w:tmpl w:val="4ECE8E0C"/>
@@ -9907,7 +11260,7 @@
       </w:rPr>
     </w:lvl>
   </w:abstractNum>
-  <w:abstractNum w:abstractNumId="27" w15:restartNumberingAfterBreak="0">
+  <w:abstractNum w:abstractNumId="29" w15:restartNumberingAfterBreak="0">
     <w:nsid w:val="384C78CB"/>
     <w:multiLevelType w:val="multilevel"/>
     <w:tmpl w:val="9BE65B8E"/>
@@ -9998,7 +11351,7 @@
       </w:pPr>
     </w:lvl>
   </w:abstractNum>
-  <w:abstractNum w:abstractNumId="28" w15:restartNumberingAfterBreak="0">
+  <w:abstractNum w:abstractNumId="30" w15:restartNumberingAfterBreak="0">
     <w:nsid w:val="3A505175"/>
     <w:multiLevelType w:val="multilevel"/>
     <w:tmpl w:val="6CC2D5FC"/>
@@ -10147,7 +11500,156 @@
       </w:rPr>
     </w:lvl>
   </w:abstractNum>
-  <w:abstractNum w:abstractNumId="29" w15:restartNumberingAfterBreak="0">
+  <w:abstractNum w:abstractNumId="31" w15:restartNumberingAfterBreak="0">
+    <w:nsid w:val="3C490950"/>
+    <w:multiLevelType w:val="multilevel"/>
+    <w:tmpl w:val="CEFC3E9E"/>
+    <w:lvl w:ilvl="0">
+      <w:start w:val="1"/>
+      <w:numFmt w:val="bullet"/>
+      <w:lvlText w:val=""/>
+      <w:lvlJc w:val="left"/>
+      <w:pPr>
+        <w:tabs>
+          <w:tab w:val="num" w:pos="720"/>
+        </w:tabs>
+        <w:ind w:left="720" w:hanging="360"/>
+      </w:pPr>
+      <w:rPr>
+        <w:rFonts w:ascii="Symbol" w:hAnsi="Symbol" w:hint="default"/>
+        <w:sz w:val="20"/>
+      </w:rPr>
+    </w:lvl>
+    <w:lvl w:ilvl="1" w:tentative="1">
+      <w:start w:val="1"/>
+      <w:numFmt w:val="bullet"/>
+      <w:lvlText w:val="o"/>
+      <w:lvlJc w:val="left"/>
+      <w:pPr>
+        <w:tabs>
+          <w:tab w:val="num" w:pos="1440"/>
+        </w:tabs>
+        <w:ind w:left="1440" w:hanging="360"/>
+      </w:pPr>
+      <w:rPr>
+        <w:rFonts w:ascii="Courier New" w:hAnsi="Courier New" w:hint="default"/>
+        <w:sz w:val="20"/>
+      </w:rPr>
+    </w:lvl>
+    <w:lvl w:ilvl="2" w:tentative="1">
+      <w:start w:val="1"/>
+      <w:numFmt w:val="bullet"/>
+      <w:lvlText w:val=""/>
+      <w:lvlJc w:val="left"/>
+      <w:pPr>
+        <w:tabs>
+          <w:tab w:val="num" w:pos="2160"/>
+        </w:tabs>
+        <w:ind w:left="2160" w:hanging="360"/>
+      </w:pPr>
+      <w:rPr>
+        <w:rFonts w:ascii="Wingdings" w:hAnsi="Wingdings" w:hint="default"/>
+        <w:sz w:val="20"/>
+      </w:rPr>
+    </w:lvl>
+    <w:lvl w:ilvl="3" w:tentative="1">
+      <w:start w:val="1"/>
+      <w:numFmt w:val="bullet"/>
+      <w:lvlText w:val=""/>
+      <w:lvlJc w:val="left"/>
+      <w:pPr>
+        <w:tabs>
+          <w:tab w:val="num" w:pos="2880"/>
+        </w:tabs>
+        <w:ind w:left="2880" w:hanging="360"/>
+      </w:pPr>
+      <w:rPr>
+        <w:rFonts w:ascii="Wingdings" w:hAnsi="Wingdings" w:hint="default"/>
+        <w:sz w:val="20"/>
+      </w:rPr>
+    </w:lvl>
+    <w:lvl w:ilvl="4" w:tentative="1">
+      <w:start w:val="1"/>
+      <w:numFmt w:val="bullet"/>
+      <w:lvlText w:val=""/>
+      <w:lvlJc w:val="left"/>
+      <w:pPr>
+        <w:tabs>
+          <w:tab w:val="num" w:pos="3600"/>
+        </w:tabs>
+        <w:ind w:left="3600" w:hanging="360"/>
+      </w:pPr>
+      <w:rPr>
+        <w:rFonts w:ascii="Wingdings" w:hAnsi="Wingdings" w:hint="default"/>
+        <w:sz w:val="20"/>
+      </w:rPr>
+    </w:lvl>
+    <w:lvl w:ilvl="5" w:tentative="1">
+      <w:start w:val="1"/>
+      <w:numFmt w:val="bullet"/>
+      <w:lvlText w:val=""/>
+      <w:lvlJc w:val="left"/>
+      <w:pPr>
+        <w:tabs>
+          <w:tab w:val="num" w:pos="4320"/>
+        </w:tabs>
+        <w:ind w:left="4320" w:hanging="360"/>
+      </w:pPr>
+      <w:rPr>
+        <w:rFonts w:ascii="Wingdings" w:hAnsi="Wingdings" w:hint="default"/>
+        <w:sz w:val="20"/>
+      </w:rPr>
+    </w:lvl>
+    <w:lvl w:ilvl="6" w:tentative="1">
+      <w:start w:val="1"/>
+      <w:numFmt w:val="bullet"/>
+      <w:lvlText w:val=""/>
+      <w:lvlJc w:val="left"/>
+      <w:pPr>
+        <w:tabs>
+          <w:tab w:val="num" w:pos="5040"/>
+        </w:tabs>
+        <w:ind w:left="5040" w:hanging="360"/>
+      </w:pPr>
+      <w:rPr>
+        <w:rFonts w:ascii="Wingdings" w:hAnsi="Wingdings" w:hint="default"/>
+        <w:sz w:val="20"/>
+      </w:rPr>
+    </w:lvl>
+    <w:lvl w:ilvl="7" w:tentative="1">
+      <w:start w:val="1"/>
+      <w:numFmt w:val="bullet"/>
+      <w:lvlText w:val=""/>
+      <w:lvlJc w:val="left"/>
+      <w:pPr>
+        <w:tabs>
+          <w:tab w:val="num" w:pos="5760"/>
+        </w:tabs>
+        <w:ind w:left="5760" w:hanging="360"/>
+      </w:pPr>
+      <w:rPr>
+        <w:rFonts w:ascii="Wingdings" w:hAnsi="Wingdings" w:hint="default"/>
+        <w:sz w:val="20"/>
+      </w:rPr>
+    </w:lvl>
+    <w:lvl w:ilvl="8" w:tentative="1">
+      <w:start w:val="1"/>
+      <w:numFmt w:val="bullet"/>
+      <w:lvlText w:val=""/>
+      <w:lvlJc w:val="left"/>
+      <w:pPr>
+        <w:tabs>
+          <w:tab w:val="num" w:pos="6480"/>
+        </w:tabs>
+        <w:ind w:left="6480" w:hanging="360"/>
+      </w:pPr>
+      <w:rPr>
+        <w:rFonts w:ascii="Wingdings" w:hAnsi="Wingdings" w:hint="default"/>
+        <w:sz w:val="20"/>
+      </w:rPr>
+    </w:lvl>
+  </w:abstractNum>
+  <w:abstractNum w:abstractNumId="32" w15:restartNumberingAfterBreak="0">
     <w:nsid w:val="41BA488D"/>
     <w:multiLevelType w:val="multilevel"/>
     <w:tmpl w:val="4260AB64"/>
@@ -10233,7 +11735,7 @@
       </w:pPr>
     </w:lvl>
   </w:abstractNum>
-  <w:abstractNum w:abstractNumId="30" w15:restartNumberingAfterBreak="0">
+  <w:abstractNum w:abstractNumId="33" w15:restartNumberingAfterBreak="0">
     <w:nsid w:val="429637AE"/>
     <w:multiLevelType w:val="multilevel"/>
     <w:tmpl w:val="829AAE92"/>
@@ -10382,7 +11884,7 @@
       </w:rPr>
     </w:lvl>
   </w:abstractNum>
-  <w:abstractNum w:abstractNumId="31" w15:restartNumberingAfterBreak="0">
+  <w:abstractNum w:abstractNumId="34" w15:restartNumberingAfterBreak="0">
     <w:nsid w:val="43960B67"/>
     <w:multiLevelType w:val="multilevel"/>
     <w:tmpl w:val="1F0EDD26"/>
@@ -10531,7 +12033,156 @@
       </w:rPr>
     </w:lvl>
   </w:abstractNum>
-  <w:abstractNum w:abstractNumId="32" w15:restartNumberingAfterBreak="0">
+  <w:abstractNum w:abstractNumId="35" w15:restartNumberingAfterBreak="0">
+    <w:nsid w:val="4674198F"/>
+    <w:multiLevelType w:val="multilevel"/>
+    <w:tmpl w:val="4B649DB4"/>
+    <w:lvl w:ilvl="0">
+      <w:start w:val="1"/>
+      <w:numFmt w:val="bullet"/>
+      <w:lvlText w:val=""/>
+      <w:lvlJc w:val="left"/>
+      <w:pPr>
+        <w:tabs>
+          <w:tab w:val="num" w:pos="720"/>
+        </w:tabs>
+        <w:ind w:left="720" w:hanging="360"/>
+      </w:pPr>
+      <w:rPr>
+        <w:rFonts w:ascii="Symbol" w:hAnsi="Symbol" w:hint="default"/>
+        <w:sz w:val="20"/>
+      </w:rPr>
+    </w:lvl>
+    <w:lvl w:ilvl="1" w:tentative="1">
+      <w:start w:val="1"/>
+      <w:numFmt w:val="bullet"/>
+      <w:lvlText w:val="o"/>
+      <w:lvlJc w:val="left"/>
+      <w:pPr>
+        <w:tabs>
+          <w:tab w:val="num" w:pos="1440"/>
+        </w:tabs>
+        <w:ind w:left="1440" w:hanging="360"/>
+      </w:pPr>
+      <w:rPr>
+        <w:rFonts w:ascii="Courier New" w:hAnsi="Courier New" w:hint="default"/>
+        <w:sz w:val="20"/>
+      </w:rPr>
+    </w:lvl>
+    <w:lvl w:ilvl="2" w:tentative="1">
+      <w:start w:val="1"/>
+      <w:numFmt w:val="bullet"/>
+      <w:lvlText w:val=""/>
+      <w:lvlJc w:val="left"/>
+      <w:pPr>
+        <w:tabs>
+          <w:tab w:val="num" w:pos="2160"/>
+        </w:tabs>
+        <w:ind w:left="2160" w:hanging="360"/>
+      </w:pPr>
+      <w:rPr>
+        <w:rFonts w:ascii="Wingdings" w:hAnsi="Wingdings" w:hint="default"/>
+        <w:sz w:val="20"/>
+      </w:rPr>
+    </w:lvl>
+    <w:lvl w:ilvl="3" w:tentative="1">
+      <w:start w:val="1"/>
+      <w:numFmt w:val="bullet"/>
+      <w:lvlText w:val=""/>
+      <w:lvlJc w:val="left"/>
+      <w:pPr>
+        <w:tabs>
+          <w:tab w:val="num" w:pos="2880"/>
+        </w:tabs>
+        <w:ind w:left="2880" w:hanging="360"/>
+      </w:pPr>
+      <w:rPr>
+        <w:rFonts w:ascii="Wingdings" w:hAnsi="Wingdings" w:hint="default"/>
+        <w:sz w:val="20"/>
+      </w:rPr>
+    </w:lvl>
+    <w:lvl w:ilvl="4" w:tentative="1">
+      <w:start w:val="1"/>
+      <w:numFmt w:val="bullet"/>
+      <w:lvlText w:val=""/>
+      <w:lvlJc w:val="left"/>
+      <w:pPr>
+        <w:tabs>
+          <w:tab w:val="num" w:pos="3600"/>
+        </w:tabs>
+        <w:ind w:left="3600" w:hanging="360"/>
+      </w:pPr>
+      <w:rPr>
+        <w:rFonts w:ascii="Wingdings" w:hAnsi="Wingdings" w:hint="default"/>
+        <w:sz w:val="20"/>
+      </w:rPr>
+    </w:lvl>
+    <w:lvl w:ilvl="5" w:tentative="1">
+      <w:start w:val="1"/>
+      <w:numFmt w:val="bullet"/>
+      <w:lvlText w:val=""/>
+      <w:lvlJc w:val="left"/>
+      <w:pPr>
+        <w:tabs>
+          <w:tab w:val="num" w:pos="4320"/>
+        </w:tabs>
+        <w:ind w:left="4320" w:hanging="360"/>
+      </w:pPr>
+      <w:rPr>
+        <w:rFonts w:ascii="Wingdings" w:hAnsi="Wingdings" w:hint="default"/>
+        <w:sz w:val="20"/>
+      </w:rPr>
+    </w:lvl>
+    <w:lvl w:ilvl="6" w:tentative="1">
+      <w:start w:val="1"/>
+      <w:numFmt w:val="bullet"/>
+      <w:lvlText w:val=""/>
+      <w:lvlJc w:val="left"/>
+      <w:pPr>
+        <w:tabs>
+          <w:tab w:val="num" w:pos="5040"/>
+        </w:tabs>
+        <w:ind w:left="5040" w:hanging="360"/>
+      </w:pPr>
+      <w:rPr>
+        <w:rFonts w:ascii="Wingdings" w:hAnsi="Wingdings" w:hint="default"/>
+        <w:sz w:val="20"/>
+      </w:rPr>
+    </w:lvl>
+    <w:lvl w:ilvl="7" w:tentative="1">
+      <w:start w:val="1"/>
+      <w:numFmt w:val="bullet"/>
+      <w:lvlText w:val=""/>
+      <w:lvlJc w:val="left"/>
+      <w:pPr>
+        <w:tabs>
+          <w:tab w:val="num" w:pos="5760"/>
+        </w:tabs>
+        <w:ind w:left="5760" w:hanging="360"/>
+      </w:pPr>
+      <w:rPr>
+        <w:rFonts w:ascii="Wingdings" w:hAnsi="Wingdings" w:hint="default"/>
+        <w:sz w:val="20"/>
+      </w:rPr>
+    </w:lvl>
+    <w:lvl w:ilvl="8" w:tentative="1">
+      <w:start w:val="1"/>
+      <w:numFmt w:val="bullet"/>
+      <w:lvlText w:val=""/>
+      <w:lvlJc w:val="left"/>
+      <w:pPr>
+        <w:tabs>
+          <w:tab w:val="num" w:pos="6480"/>
+        </w:tabs>
+        <w:ind w:left="6480" w:hanging="360"/>
+      </w:pPr>
+      <w:rPr>
+        <w:rFonts w:ascii="Wingdings" w:hAnsi="Wingdings" w:hint="default"/>
+        <w:sz w:val="20"/>
+      </w:rPr>
+    </w:lvl>
+  </w:abstractNum>
+  <w:abstractNum w:abstractNumId="36" w15:restartNumberingAfterBreak="0">
     <w:nsid w:val="47DC00F8"/>
     <w:multiLevelType w:val="multilevel"/>
     <w:tmpl w:val="93387234"/>
@@ -10680,7 +12331,7 @@
       </w:rPr>
     </w:lvl>
   </w:abstractNum>
-  <w:abstractNum w:abstractNumId="33" w15:restartNumberingAfterBreak="0">
+  <w:abstractNum w:abstractNumId="37" w15:restartNumberingAfterBreak="0">
     <w:nsid w:val="490B7D64"/>
     <w:multiLevelType w:val="multilevel"/>
     <w:tmpl w:val="7C7281FE"/>
@@ -10829,7 +12480,7 @@
       </w:rPr>
     </w:lvl>
   </w:abstractNum>
-  <w:abstractNum w:abstractNumId="34" w15:restartNumberingAfterBreak="0">
+  <w:abstractNum w:abstractNumId="38" w15:restartNumberingAfterBreak="0">
     <w:nsid w:val="49656389"/>
     <w:multiLevelType w:val="multilevel"/>
     <w:tmpl w:val="B76C6044"/>
@@ -10978,7 +12629,7 @@
       </w:rPr>
     </w:lvl>
   </w:abstractNum>
-  <w:abstractNum w:abstractNumId="35" w15:restartNumberingAfterBreak="0">
+  <w:abstractNum w:abstractNumId="39" w15:restartNumberingAfterBreak="0">
     <w:nsid w:val="4E515155"/>
     <w:multiLevelType w:val="multilevel"/>
     <w:tmpl w:val="E60E3DAE"/>
@@ -11127,7 +12778,7 @@
       </w:rPr>
     </w:lvl>
   </w:abstractNum>
-  <w:abstractNum w:abstractNumId="36" w15:restartNumberingAfterBreak="0">
+  <w:abstractNum w:abstractNumId="40" w15:restartNumberingAfterBreak="0">
     <w:nsid w:val="5C171D3B"/>
     <w:multiLevelType w:val="multilevel"/>
     <w:tmpl w:val="3AAC20C0"/>
@@ -11276,7 +12927,7 @@
       </w:rPr>
     </w:lvl>
   </w:abstractNum>
-  <w:abstractNum w:abstractNumId="37" w15:restartNumberingAfterBreak="0">
+  <w:abstractNum w:abstractNumId="41" w15:restartNumberingAfterBreak="0">
     <w:nsid w:val="5CAA3B8F"/>
     <w:multiLevelType w:val="multilevel"/>
     <w:tmpl w:val="40602C3A"/>
@@ -11425,7 +13076,7 @@
       </w:rPr>
     </w:lvl>
   </w:abstractNum>
-  <w:abstractNum w:abstractNumId="38" w15:restartNumberingAfterBreak="0">
+  <w:abstractNum w:abstractNumId="42" w15:restartNumberingAfterBreak="0">
     <w:nsid w:val="5F9352D7"/>
     <w:multiLevelType w:val="multilevel"/>
     <w:tmpl w:val="7D46874E"/>
@@ -11574,7 +13225,7 @@
       </w:rPr>
     </w:lvl>
   </w:abstractNum>
-  <w:abstractNum w:abstractNumId="39" w15:restartNumberingAfterBreak="0">
+  <w:abstractNum w:abstractNumId="43" w15:restartNumberingAfterBreak="0">
     <w:nsid w:val="5FB1635F"/>
     <w:multiLevelType w:val="hybridMultilevel"/>
     <w:tmpl w:val="F8EC2D82"/>
@@ -11663,7 +13314,7 @@
       </w:pPr>
     </w:lvl>
   </w:abstractNum>
-  <w:abstractNum w:abstractNumId="40" w15:restartNumberingAfterBreak="0">
+  <w:abstractNum w:abstractNumId="44" w15:restartNumberingAfterBreak="0">
     <w:nsid w:val="630C199C"/>
     <w:multiLevelType w:val="multilevel"/>
     <w:tmpl w:val="4042A3C6"/>
@@ -11812,7 +13463,7 @@
       </w:rPr>
     </w:lvl>
   </w:abstractNum>
-  <w:abstractNum w:abstractNumId="41" w15:restartNumberingAfterBreak="0">
+  <w:abstractNum w:abstractNumId="45" w15:restartNumberingAfterBreak="0">
     <w:nsid w:val="6739333C"/>
     <w:multiLevelType w:val="multilevel"/>
     <w:tmpl w:val="A3380A2A"/>
@@ -11961,7 +13612,7 @@
       </w:rPr>
     </w:lvl>
   </w:abstractNum>
-  <w:abstractNum w:abstractNumId="42" w15:restartNumberingAfterBreak="0">
+  <w:abstractNum w:abstractNumId="46" w15:restartNumberingAfterBreak="0">
     <w:nsid w:val="68C945C7"/>
     <w:multiLevelType w:val="multilevel"/>
     <w:tmpl w:val="2CC862B0"/>
@@ -12110,7 +13761,7 @@
       </w:rPr>
     </w:lvl>
   </w:abstractNum>
-  <w:abstractNum w:abstractNumId="43" w15:restartNumberingAfterBreak="0">
+  <w:abstractNum w:abstractNumId="47" w15:restartNumberingAfterBreak="0">
     <w:nsid w:val="69D7399E"/>
     <w:multiLevelType w:val="multilevel"/>
     <w:tmpl w:val="5E3EEB8C"/>
@@ -12259,7 +13910,7 @@
       </w:rPr>
     </w:lvl>
   </w:abstractNum>
-  <w:abstractNum w:abstractNumId="44" w15:restartNumberingAfterBreak="0">
+  <w:abstractNum w:abstractNumId="48" w15:restartNumberingAfterBreak="0">
     <w:nsid w:val="6B463D0B"/>
     <w:multiLevelType w:val="multilevel"/>
     <w:tmpl w:val="44304708"/>
@@ -12408,7 +14059,7 @@
       </w:rPr>
     </w:lvl>
   </w:abstractNum>
-  <w:abstractNum w:abstractNumId="45" w15:restartNumberingAfterBreak="0">
+  <w:abstractNum w:abstractNumId="49" w15:restartNumberingAfterBreak="0">
     <w:nsid w:val="6CC2122E"/>
     <w:multiLevelType w:val="multilevel"/>
     <w:tmpl w:val="5C68914C"/>
@@ -12557,7 +14208,7 @@
       </w:rPr>
     </w:lvl>
   </w:abstractNum>
-  <w:abstractNum w:abstractNumId="46" w15:restartNumberingAfterBreak="0">
+  <w:abstractNum w:abstractNumId="50" w15:restartNumberingAfterBreak="0">
     <w:nsid w:val="72F0337C"/>
     <w:multiLevelType w:val="multilevel"/>
     <w:tmpl w:val="D212AE80"/>
@@ -12706,7 +14357,7 @@
       </w:rPr>
     </w:lvl>
   </w:abstractNum>
-  <w:abstractNum w:abstractNumId="47" w15:restartNumberingAfterBreak="0">
+  <w:abstractNum w:abstractNumId="51" w15:restartNumberingAfterBreak="0">
     <w:nsid w:val="74B92D15"/>
     <w:multiLevelType w:val="multilevel"/>
     <w:tmpl w:val="52308A80"/>
@@ -12855,7 +14506,7 @@
       </w:rPr>
     </w:lvl>
   </w:abstractNum>
-  <w:abstractNum w:abstractNumId="48" w15:restartNumberingAfterBreak="0">
+  <w:abstractNum w:abstractNumId="52" w15:restartNumberingAfterBreak="0">
     <w:nsid w:val="76736977"/>
     <w:multiLevelType w:val="multilevel"/>
     <w:tmpl w:val="748CC144"/>
@@ -13004,7 +14655,7 @@
       </w:rPr>
     </w:lvl>
   </w:abstractNum>
-  <w:abstractNum w:abstractNumId="49" w15:restartNumberingAfterBreak="0">
+  <w:abstractNum w:abstractNumId="53" w15:restartNumberingAfterBreak="0">
     <w:nsid w:val="7E5F527E"/>
     <w:multiLevelType w:val="multilevel"/>
     <w:tmpl w:val="FC143F5C"/>
@@ -13154,196 +14805,208 @@
     </w:lvl>
   </w:abstractNum>
   <w:num w:numId="1" w16cid:durableId="2057659798">
-    <w:abstractNumId w:val="27"/>
+    <w:abstractNumId w:val="29"/>
   </w:num>
   <w:num w:numId="2" w16cid:durableId="99107261">
-    <w:abstractNumId w:val="27"/>
+    <w:abstractNumId w:val="29"/>
   </w:num>
   <w:num w:numId="3" w16cid:durableId="454829576">
-    <w:abstractNumId w:val="27"/>
+    <w:abstractNumId w:val="29"/>
   </w:num>
   <w:num w:numId="4" w16cid:durableId="919875635">
-    <w:abstractNumId w:val="27"/>
+    <w:abstractNumId w:val="29"/>
   </w:num>
   <w:num w:numId="5" w16cid:durableId="1989245865">
-    <w:abstractNumId w:val="27"/>
+    <w:abstractNumId w:val="29"/>
   </w:num>
   <w:num w:numId="6" w16cid:durableId="337856889">
-    <w:abstractNumId w:val="27"/>
+    <w:abstractNumId w:val="29"/>
   </w:num>
   <w:num w:numId="7" w16cid:durableId="486750497">
-    <w:abstractNumId w:val="17"/>
+    <w:abstractNumId w:val="19"/>
   </w:num>
   <w:num w:numId="8" w16cid:durableId="1295481688">
-    <w:abstractNumId w:val="27"/>
+    <w:abstractNumId w:val="29"/>
   </w:num>
   <w:num w:numId="9" w16cid:durableId="878207473">
-    <w:abstractNumId w:val="27"/>
+    <w:abstractNumId w:val="29"/>
   </w:num>
   <w:num w:numId="10" w16cid:durableId="390271873">
-    <w:abstractNumId w:val="17"/>
+    <w:abstractNumId w:val="19"/>
   </w:num>
   <w:num w:numId="11" w16cid:durableId="108548336">
-    <w:abstractNumId w:val="27"/>
+    <w:abstractNumId w:val="29"/>
   </w:num>
   <w:num w:numId="12" w16cid:durableId="289626826">
+    <w:abstractNumId w:val="32"/>
+  </w:num>
+  <w:num w:numId="13" w16cid:durableId="709189428">
+    <w:abstractNumId w:val="43"/>
+  </w:num>
+  <w:num w:numId="14" w16cid:durableId="1828012820">
     <w:abstractNumId w:val="29"/>
   </w:num>
-  <w:num w:numId="13" w16cid:durableId="709189428">
-    <w:abstractNumId w:val="39"/>
-  </w:num>
-  <w:num w:numId="14" w16cid:durableId="1828012820">
-    <w:abstractNumId w:val="27"/>
-  </w:num>
   <w:num w:numId="15" w16cid:durableId="1472016058">
-    <w:abstractNumId w:val="27"/>
+    <w:abstractNumId w:val="29"/>
   </w:num>
   <w:num w:numId="16" w16cid:durableId="2007130954">
-    <w:abstractNumId w:val="27"/>
+    <w:abstractNumId w:val="29"/>
   </w:num>
   <w:num w:numId="17" w16cid:durableId="2124959910">
-    <w:abstractNumId w:val="27"/>
+    <w:abstractNumId w:val="29"/>
   </w:num>
   <w:num w:numId="18" w16cid:durableId="1161965983">
-    <w:abstractNumId w:val="27"/>
+    <w:abstractNumId w:val="29"/>
   </w:num>
   <w:num w:numId="19" w16cid:durableId="325284905">
-    <w:abstractNumId w:val="11"/>
+    <w:abstractNumId w:val="12"/>
   </w:num>
   <w:num w:numId="20" w16cid:durableId="1339774263">
     <w:abstractNumId w:val="4"/>
   </w:num>
   <w:num w:numId="21" w16cid:durableId="792559348">
-    <w:abstractNumId w:val="44"/>
+    <w:abstractNumId w:val="48"/>
   </w:num>
   <w:num w:numId="22" w16cid:durableId="1417169888">
-    <w:abstractNumId w:val="15"/>
+    <w:abstractNumId w:val="17"/>
   </w:num>
   <w:num w:numId="23" w16cid:durableId="721709991">
-    <w:abstractNumId w:val="7"/>
+    <w:abstractNumId w:val="8"/>
   </w:num>
   <w:num w:numId="24" w16cid:durableId="280184368">
+    <w:abstractNumId w:val="22"/>
+  </w:num>
+  <w:num w:numId="25" w16cid:durableId="1423993270">
+    <w:abstractNumId w:val="49"/>
+  </w:num>
+  <w:num w:numId="26" w16cid:durableId="1285116924">
     <w:abstractNumId w:val="20"/>
   </w:num>
-  <w:num w:numId="25" w16cid:durableId="1423993270">
-    <w:abstractNumId w:val="45"/>
-  </w:num>
-  <w:num w:numId="26" w16cid:durableId="1285116924">
-    <w:abstractNumId w:val="18"/>
-  </w:num>
   <w:num w:numId="27" w16cid:durableId="660275319">
-    <w:abstractNumId w:val="24"/>
+    <w:abstractNumId w:val="26"/>
   </w:num>
   <w:num w:numId="28" w16cid:durableId="1619872681">
-    <w:abstractNumId w:val="5"/>
+    <w:abstractNumId w:val="6"/>
   </w:num>
   <w:num w:numId="29" w16cid:durableId="814184426">
-    <w:abstractNumId w:val="38"/>
+    <w:abstractNumId w:val="42"/>
   </w:num>
   <w:num w:numId="30" w16cid:durableId="313527619">
     <w:abstractNumId w:val="0"/>
   </w:num>
   <w:num w:numId="31" w16cid:durableId="84885100">
-    <w:abstractNumId w:val="48"/>
+    <w:abstractNumId w:val="52"/>
   </w:num>
   <w:num w:numId="32" w16cid:durableId="1665888621">
-    <w:abstractNumId w:val="47"/>
+    <w:abstractNumId w:val="51"/>
   </w:num>
   <w:num w:numId="33" w16cid:durableId="1337491407">
-    <w:abstractNumId w:val="13"/>
+    <w:abstractNumId w:val="14"/>
   </w:num>
   <w:num w:numId="34" w16cid:durableId="2070615399">
-    <w:abstractNumId w:val="46"/>
+    <w:abstractNumId w:val="50"/>
   </w:num>
   <w:num w:numId="35" w16cid:durableId="1229654126">
-    <w:abstractNumId w:val="33"/>
+    <w:abstractNumId w:val="37"/>
   </w:num>
   <w:num w:numId="36" w16cid:durableId="897941362">
-    <w:abstractNumId w:val="16"/>
+    <w:abstractNumId w:val="18"/>
   </w:num>
   <w:num w:numId="37" w16cid:durableId="1641958596">
     <w:abstractNumId w:val="1"/>
   </w:num>
   <w:num w:numId="38" w16cid:durableId="1770276902">
-    <w:abstractNumId w:val="26"/>
+    <w:abstractNumId w:val="28"/>
   </w:num>
   <w:num w:numId="39" w16cid:durableId="943540558">
     <w:abstractNumId w:val="3"/>
   </w:num>
   <w:num w:numId="40" w16cid:durableId="450824917">
-    <w:abstractNumId w:val="49"/>
+    <w:abstractNumId w:val="53"/>
   </w:num>
   <w:num w:numId="41" w16cid:durableId="1705670884">
-    <w:abstractNumId w:val="28"/>
+    <w:abstractNumId w:val="30"/>
   </w:num>
   <w:num w:numId="42" w16cid:durableId="299843862">
+    <w:abstractNumId w:val="11"/>
+  </w:num>
+  <w:num w:numId="43" w16cid:durableId="811405250">
+    <w:abstractNumId w:val="13"/>
+  </w:num>
+  <w:num w:numId="44" w16cid:durableId="1630240630">
+    <w:abstractNumId w:val="36"/>
+  </w:num>
+  <w:num w:numId="45" w16cid:durableId="1672903792">
+    <w:abstractNumId w:val="9"/>
+  </w:num>
+  <w:num w:numId="46" w16cid:durableId="2084061145">
     <w:abstractNumId w:val="10"/>
   </w:num>
-  <w:num w:numId="43" w16cid:durableId="811405250">
-    <w:abstractNumId w:val="12"/>
-  </w:num>
-  <w:num w:numId="44" w16cid:durableId="1630240630">
-    <w:abstractNumId w:val="32"/>
-  </w:num>
-  <w:num w:numId="45" w16cid:durableId="1672903792">
-    <w:abstractNumId w:val="8"/>
-  </w:num>
-  <w:num w:numId="46" w16cid:durableId="2084061145">
-    <w:abstractNumId w:val="9"/>
-  </w:num>
   <w:num w:numId="47" w16cid:durableId="727460145">
-    <w:abstractNumId w:val="19"/>
+    <w:abstractNumId w:val="21"/>
   </w:num>
   <w:num w:numId="48" w16cid:durableId="1128547572">
-    <w:abstractNumId w:val="42"/>
+    <w:abstractNumId w:val="46"/>
   </w:num>
   <w:num w:numId="49" w16cid:durableId="377124910">
-    <w:abstractNumId w:val="22"/>
+    <w:abstractNumId w:val="24"/>
   </w:num>
   <w:num w:numId="50" w16cid:durableId="1396658519">
-    <w:abstractNumId w:val="31"/>
+    <w:abstractNumId w:val="34"/>
   </w:num>
   <w:num w:numId="51" w16cid:durableId="359166099">
-    <w:abstractNumId w:val="21"/>
+    <w:abstractNumId w:val="23"/>
   </w:num>
   <w:num w:numId="52" w16cid:durableId="1166700979">
     <w:abstractNumId w:val="2"/>
   </w:num>
   <w:num w:numId="53" w16cid:durableId="1546793749">
+    <w:abstractNumId w:val="27"/>
+  </w:num>
+  <w:num w:numId="54" w16cid:durableId="128400536">
+    <w:abstractNumId w:val="41"/>
+  </w:num>
+  <w:num w:numId="55" w16cid:durableId="695472647">
+    <w:abstractNumId w:val="44"/>
+  </w:num>
+  <w:num w:numId="56" w16cid:durableId="141893124">
+    <w:abstractNumId w:val="47"/>
+  </w:num>
+  <w:num w:numId="57" w16cid:durableId="355618324">
     <w:abstractNumId w:val="25"/>
   </w:num>
-  <w:num w:numId="54" w16cid:durableId="128400536">
-    <w:abstractNumId w:val="37"/>
+  <w:num w:numId="58" w16cid:durableId="186257617">
+    <w:abstractNumId w:val="7"/>
   </w:num>
-  <w:num w:numId="55" w16cid:durableId="695472647">
+  <w:num w:numId="59" w16cid:durableId="623270666">
+    <w:abstractNumId w:val="45"/>
+  </w:num>
+  <w:num w:numId="60" w16cid:durableId="1695887430">
     <w:abstractNumId w:val="40"/>
   </w:num>
-  <w:num w:numId="56" w16cid:durableId="141893124">
-    <w:abstractNumId w:val="43"/>
-  </w:num>
-  <w:num w:numId="57" w16cid:durableId="355618324">
-    <w:abstractNumId w:val="23"/>
-  </w:num>
-  <w:num w:numId="58" w16cid:durableId="186257617">
-    <w:abstractNumId w:val="6"/>
-  </w:num>
-  <w:num w:numId="59" w16cid:durableId="623270666">
-    <w:abstractNumId w:val="41"/>
-  </w:num>
-  <w:num w:numId="60" w16cid:durableId="1695887430">
-    <w:abstractNumId w:val="36"/>
-  </w:num>
   <w:num w:numId="61" w16cid:durableId="1901161861">
-    <w:abstractNumId w:val="14"/>
+    <w:abstractNumId w:val="16"/>
   </w:num>
   <w:num w:numId="62" w16cid:durableId="1342708228">
+    <w:abstractNumId w:val="39"/>
+  </w:num>
+  <w:num w:numId="63" w16cid:durableId="1696692907">
+    <w:abstractNumId w:val="33"/>
+  </w:num>
+  <w:num w:numId="64" w16cid:durableId="1250967177">
+    <w:abstractNumId w:val="38"/>
+  </w:num>
+  <w:num w:numId="65" w16cid:durableId="1940212273">
+    <w:abstractNumId w:val="15"/>
+  </w:num>
+  <w:num w:numId="66" w16cid:durableId="804931867">
+    <w:abstractNumId w:val="5"/>
+  </w:num>
+  <w:num w:numId="67" w16cid:durableId="1378705565">
     <w:abstractNumId w:val="35"/>
   </w:num>
-  <w:num w:numId="63" w16cid:durableId="1696692907">
-    <w:abstractNumId w:val="30"/>
-  </w:num>
-  <w:num w:numId="64" w16cid:durableId="1250967177">
-    <w:abstractNumId w:val="34"/>
+  <w:num w:numId="68" w16cid:durableId="1140459066">
+    <w:abstractNumId w:val="31"/>
   </w:num>
 </w:numbering>
 </file>

</xml_diff>